<commit_message>
Add 8 figures: study design, sample flow, composition, feature plausibility, correlations heatmap, within-account share, confirmatory headline, robustness; correct DoF plausibility claim
Co-Authored-By: Claude Opus 5.5 <noreply@anthropic.com>
</commit_message>
<xml_diff>
--- a/paper/paper_v2_draft.docx
+++ b/paper/paper_v2_draft.docx
@@ -212,7 +212,7 @@
         </w:sectPr>
       </w:pPr>
     </w:p>
-    <w:bookmarkStart w:id="20" w:name="introduction"/>
+    <w:bookmarkStart w:id="23" w:name="introduction"/>
     <w:p>
       <w:pPr>
         <w:pStyle w:val="CSIRMainSection"/>
@@ -601,11 +601,72 @@
         <w:t xml:space="preserve"> </w:t>
       </w:r>
       <w:r>
-        <w:t xml:space="preserve">(as git tags), and aggregate outputs.</w:t>
-      </w:r>
-    </w:p>
-    <w:bookmarkEnd w:id="20"/>
-    <w:bookmarkStart w:id="24" w:name="related-work"/>
+        <w:t xml:space="preserve">(as git tags), and aggregate outputs. Figure 1 maps the CRISP-DM phases to the study’s</w:t>
+      </w:r>
+      <w:r>
+        <w:t xml:space="preserve"> </w:t>
+      </w:r>
+      <w:r>
+        <w:t xml:space="preserve">artefacts.</w:t>
+      </w:r>
+    </w:p>
+    <w:p>
+      <w:pPr>
+        <w:pStyle w:val="CaptionedFigure"/>
+      </w:pPr>
+      <w:r>
+        <w:drawing>
+          <wp:inline>
+            <wp:extent cx="3017520" cy="3983126"/>
+            <wp:effectExtent b="0" l="0" r="0" t="0"/>
+            <wp:docPr descr="Figure 1. Study design: CRISP-DM phases and the point at which the protocol was registered." title="" id="21" name="Picture"/>
+            <a:graphic>
+              <a:graphicData uri="http://schemas.openxmlformats.org/drawingml/2006/picture">
+                <pic:pic>
+                  <pic:nvPicPr>
+                    <pic:cNvPr descr="outputs/figures/figA_study_design.png" id="22" name="Picture"/>
+                    <pic:cNvPicPr>
+                      <a:picLocks noChangeArrowheads="1" noChangeAspect="1"/>
+                    </pic:cNvPicPr>
+                  </pic:nvPicPr>
+                  <pic:blipFill>
+                    <a:blip r:embed="rId20"/>
+                    <a:stretch>
+                      <a:fillRect/>
+                    </a:stretch>
+                  </pic:blipFill>
+                  <pic:spPr bwMode="auto">
+                    <a:xfrm>
+                      <a:off x="0" y="0"/>
+                      <a:ext cx="3017520" cy="3983126"/>
+                    </a:xfrm>
+                    <a:prstGeom prst="rect">
+                      <a:avLst/>
+                    </a:prstGeom>
+                    <a:noFill/>
+                    <a:ln w="9525">
+                      <a:noFill/>
+                      <a:headEnd/>
+                      <a:tailEnd/>
+                    </a:ln>
+                  </pic:spPr>
+                </pic:pic>
+              </a:graphicData>
+            </a:graphic>
+          </wp:inline>
+        </w:drawing>
+      </w:r>
+    </w:p>
+    <w:p>
+      <w:pPr>
+        <w:pStyle w:val="CSIRCaptionFigure"/>
+      </w:pPr>
+      <w:r>
+        <w:t xml:space="preserve">Figure 1. Study design: CRISP-DM phases and the point at which the protocol was registered.</w:t>
+      </w:r>
+    </w:p>
+    <w:bookmarkEnd w:id="23"/>
+    <w:bookmarkStart w:id="27" w:name="related-work"/>
     <w:p>
       <w:pPr>
         <w:pStyle w:val="CSIRMainSection"/>
@@ -614,7 +675,7 @@
         <w:t xml:space="preserve">Related Work</w:t>
       </w:r>
     </w:p>
-    <w:bookmarkStart w:id="21" w:name="image-features-and-engagement"/>
+    <w:bookmarkStart w:id="24" w:name="image-features-and-engagement"/>
     <w:p>
       <w:pPr>
         <w:pStyle w:val="CSIRSubSection"/>
@@ -721,8 +782,8 @@
         <w:t xml:space="preserve">influencers by topic [26] rather than to estimate visual associations with engagement.</w:t>
       </w:r>
     </w:p>
-    <w:bookmarkEnd w:id="21"/>
-    <w:bookmarkStart w:id="22" w:name="computational-aesthetics"/>
+    <w:bookmarkEnd w:id="24"/>
+    <w:bookmarkStart w:id="25" w:name="computational-aesthetics"/>
     <w:p>
       <w:pPr>
         <w:pStyle w:val="CSIRSubSection"/>
@@ -791,8 +852,8 @@
         <w:t xml:space="preserve">image. Their provenance is discussed in Section 3.2.</w:t>
       </w:r>
     </w:p>
-    <w:bookmarkEnd w:id="22"/>
-    <w:bookmarkStart w:id="23" w:name="methodological-gaps"/>
+    <w:bookmarkEnd w:id="25"/>
+    <w:bookmarkStart w:id="26" w:name="methodological-gaps"/>
     <w:p>
       <w:pPr>
         <w:pStyle w:val="CSIRSubSection"/>
@@ -917,9 +978,9 @@
         <w:t xml:space="preserve">a falsifiable, reportable outcome.</w:t>
       </w:r>
     </w:p>
-    <w:bookmarkEnd w:id="23"/>
-    <w:bookmarkEnd w:id="24"/>
-    <w:bookmarkStart w:id="31" w:name="data-crisp-dm-phases-1-3"/>
+    <w:bookmarkEnd w:id="26"/>
+    <w:bookmarkEnd w:id="27"/>
+    <w:bookmarkStart w:id="46" w:name="data-crisp-dm-phases-1-3"/>
     <w:p>
       <w:pPr>
         <w:pStyle w:val="CSIRMainSection"/>
@@ -928,7 +989,7 @@
         <w:t xml:space="preserve">Data (CRISP-DM Phases 1-3)</w:t>
       </w:r>
     </w:p>
-    <w:bookmarkStart w:id="25" w:name="business-understanding-and-the-outcome"/>
+    <w:bookmarkStart w:id="28" w:name="business-understanding-and-the-outcome"/>
     <w:p>
       <w:pPr>
         <w:pStyle w:val="CSIRSubSection"/>
@@ -1021,8 +1082,8 @@
         <w:t xml:space="preserve">between posting and the follower snapshot. R1 replaces the offset with an estimated elasticity.</w:t>
       </w:r>
     </w:p>
-    <w:bookmarkEnd w:id="25"/>
-    <w:bookmarkStart w:id="29" w:name="data-understanding"/>
+    <w:bookmarkEnd w:id="28"/>
+    <w:bookmarkStart w:id="41" w:name="data-understanding"/>
     <w:p>
       <w:pPr>
         <w:pStyle w:val="CSIRSubSection"/>
@@ -1106,13 +1167,25 @@
         <w:t xml:space="preserve"> </w:t>
       </w:r>
       <w:r>
-        <w:t xml:space="preserve">aesthetic scores. Figure 1 shows the heavy-tailed distributions of likes and followers and the</w:t>
-      </w:r>
-      <w:r>
-        <w:t xml:space="preserve"> </w:t>
-      </w:r>
-      <w:r>
-        <w:t xml:space="preserve">concentration of posts in 2019.</w:t>
+        <w:t xml:space="preserve">aesthetic scores. Figure 2 shows the heavy-tailed distributions of likes and followers and the</w:t>
+      </w:r>
+      <w:r>
+        <w:t xml:space="preserve"> </w:t>
+      </w:r>
+      <w:r>
+        <w:t xml:space="preserve">concentration of posts in 2019. Figure 3 shows the composition of the analysis sample by image</w:t>
+      </w:r>
+      <w:r>
+        <w:t xml:space="preserve"> </w:t>
+      </w:r>
+      <w:r>
+        <w:t xml:space="preserve">category and shot scale. Fashion, travel, food, and beauty images, and selfies and medium shots,</w:t>
+      </w:r>
+      <w:r>
+        <w:t xml:space="preserve"> </w:t>
+      </w:r>
+      <w:r>
+        <w:t xml:space="preserve">dominate.</w:t>
       </w:r>
     </w:p>
     <w:p>
@@ -1124,18 +1197,18 @@
           <wp:inline>
             <wp:extent cx="3017520" cy="4792531"/>
             <wp:effectExtent b="0" l="0" r="0" t="0"/>
-            <wp:docPr descr="Figure 1. Distributions of likes and recorded followers (log scale) and posts per month." title="" id="27" name="Picture"/>
+            <wp:docPr descr="Figure 2. Distributions of likes and recorded followers (log scale) and posts per month." title="" id="30" name="Picture"/>
             <a:graphic>
               <a:graphicData uri="http://schemas.openxmlformats.org/drawingml/2006/picture">
                 <pic:pic>
                   <pic:nvPicPr>
-                    <pic:cNvPr descr="outputs/figures/fig1_distributions.png" id="28" name="Picture"/>
+                    <pic:cNvPr descr="outputs/figures/fig1_distributions.png" id="31" name="Picture"/>
                     <pic:cNvPicPr>
                       <a:picLocks noChangeArrowheads="1" noChangeAspect="1"/>
                     </pic:cNvPicPr>
                   </pic:nvPicPr>
                   <pic:blipFill>
-                    <a:blip r:embed="rId26"/>
+                    <a:blip r:embed="rId29"/>
                     <a:stretch>
                       <a:fillRect/>
                     </a:stretch>
@@ -1167,7 +1240,62 @@
         <w:pStyle w:val="CSIRCaptionFigure"/>
       </w:pPr>
       <w:r>
-        <w:t xml:space="preserve">Figure 1. Distributions of likes and recorded followers (log scale) and posts per month.</w:t>
+        <w:t xml:space="preserve">Figure 2. Distributions of likes and recorded followers (log scale) and posts per month.</w:t>
+      </w:r>
+    </w:p>
+    <w:p>
+      <w:pPr>
+        <w:pStyle w:val="CaptionedFigure"/>
+      </w:pPr>
+      <w:r>
+        <w:drawing>
+          <wp:inline>
+            <wp:extent cx="3017520" cy="4103946"/>
+            <wp:effectExtent b="0" l="0" r="0" t="0"/>
+            <wp:docPr descr="Figure 3. Composition of the analysis sample by image category and shot scale." title="" id="33" name="Picture"/>
+            <a:graphic>
+              <a:graphicData uri="http://schemas.openxmlformats.org/drawingml/2006/picture">
+                <pic:pic>
+                  <pic:nvPicPr>
+                    <pic:cNvPr descr="outputs/figures/figC_composition.png" id="34" name="Picture"/>
+                    <pic:cNvPicPr>
+                      <a:picLocks noChangeArrowheads="1" noChangeAspect="1"/>
+                    </pic:cNvPicPr>
+                  </pic:nvPicPr>
+                  <pic:blipFill>
+                    <a:blip r:embed="rId32"/>
+                    <a:stretch>
+                      <a:fillRect/>
+                    </a:stretch>
+                  </pic:blipFill>
+                  <pic:spPr bwMode="auto">
+                    <a:xfrm>
+                      <a:off x="0" y="0"/>
+                      <a:ext cx="3017520" cy="4103946"/>
+                    </a:xfrm>
+                    <a:prstGeom prst="rect">
+                      <a:avLst/>
+                    </a:prstGeom>
+                    <a:noFill/>
+                    <a:ln w="9525">
+                      <a:noFill/>
+                      <a:headEnd/>
+                      <a:tailEnd/>
+                    </a:ln>
+                  </pic:spPr>
+                </pic:pic>
+              </a:graphicData>
+            </a:graphic>
+          </wp:inline>
+        </w:drawing>
+      </w:r>
+    </w:p>
+    <w:p>
+      <w:pPr>
+        <w:pStyle w:val="CSIRCaptionFigure"/>
+      </w:pPr>
+      <w:r>
+        <w:t xml:space="preserve">Figure 3. Composition of the analysis sample by image category and shot scale.</w:t>
       </w:r>
     </w:p>
     <w:p>
@@ -1249,7 +1377,7 @@
         <w:t xml:space="preserve"> </w:t>
       </w:r>
       <w:r>
-        <w:t xml:space="preserve">(i) Two independently produced labels agree: a person is detected in [pending: model results]% of images</w:t>
+        <w:t xml:space="preserve">(i) Two independently produced labels agree (Figure 4): a person is detected in [pending: model results]% of images</w:t>
       </w:r>
       <w:r>
         <w:t xml:space="preserve"> </w:t>
@@ -1261,13 +1389,84 @@
         <w:t xml:space="preserve"> </w:t>
       </w:r>
       <w:r>
-        <w:t xml:space="preserve">shots. (ii) Depth-of-field scores are higher for extreme close-ups (mean z = [pending: model results]) than</w:t>
-      </w:r>
-      <w:r>
-        <w:t xml:space="preserve"> </w:t>
-      </w:r>
-      <w:r>
-        <w:t xml:space="preserve">for extreme wide shots ([pending: model results]), as optics would predict. (iii) Three attributes were</w:t>
+        <w:t xml:space="preserve">shots. (ii) Depth-of-field scores agree only partly with shot scale. They are highest for portrait</w:t>
+      </w:r>
+      <w:r>
+        <w:t xml:space="preserve"> </w:t>
+      </w:r>
+      <w:r>
+        <w:t xml:space="preserve">and close-up shots, which typically have a shallow focus, but extreme close-ups score below</w:t>
+      </w:r>
+      <w:r>
+        <w:t xml:space="preserve"> </w:t>
+      </w:r>
+      <w:r>
+        <w:t xml:space="preserve">average (mean z = [pending: model results], against [pending: model results] for extreme wide shots), which optics</w:t>
+      </w:r>
+      <w:r>
+        <w:t xml:space="preserve"> </w:t>
+      </w:r>
+      <w:r>
+        <w:t xml:space="preserve">would not predict (Figure 4). We read this as evidence of substantial measurement noise in the</w:t>
+      </w:r>
+      <w:r>
+        <w:t xml:space="preserve"> </w:t>
+      </w:r>
+      <w:r>
+        <w:t xml:space="preserve">attribute scores.</w:t>
+      </w:r>
+    </w:p>
+    <w:p>
+      <w:pPr>
+        <w:pStyle w:val="CSIRText"/>
+      </w:pPr>
+      <w:r>
+        <w:drawing>
+          <wp:inline>
+            <wp:extent cx="3017520" cy="2586445"/>
+            <wp:effectExtent b="0" l="0" r="0" t="0"/>
+            <wp:docPr descr="Figure 4. Cross-classifier plausibility: share of images with a detected person and mean depth-of-field score, by shot-scale label." title="" id="36" name="Picture"/>
+            <a:graphic>
+              <a:graphicData uri="http://schemas.openxmlformats.org/drawingml/2006/picture">
+                <pic:pic>
+                  <pic:nvPicPr>
+                    <pic:cNvPr descr="outputs/figures/figD_feature_plausibility.png" id="37" name="Picture"/>
+                    <pic:cNvPicPr>
+                      <a:picLocks noChangeArrowheads="1" noChangeAspect="1"/>
+                    </pic:cNvPicPr>
+                  </pic:nvPicPr>
+                  <pic:blipFill>
+                    <a:blip r:embed="rId35"/>
+                    <a:stretch>
+                      <a:fillRect/>
+                    </a:stretch>
+                  </pic:blipFill>
+                  <pic:spPr bwMode="auto">
+                    <a:xfrm>
+                      <a:off x="0" y="0"/>
+                      <a:ext cx="3017520" cy="2586445"/>
+                    </a:xfrm>
+                    <a:prstGeom prst="rect">
+                      <a:avLst/>
+                    </a:prstGeom>
+                    <a:noFill/>
+                    <a:ln w="9525">
+                      <a:noFill/>
+                      <a:headEnd/>
+                      <a:tailEnd/>
+                    </a:ln>
+                  </pic:spPr>
+                </pic:pic>
+              </a:graphicData>
+            </a:graphic>
+          </wp:inline>
+        </w:drawing>
+      </w:r>
+      <w:r>
+        <w:t xml:space="preserve"> </w:t>
+      </w:r>
+      <w:r>
+        <w:t xml:space="preserve">(iii) Three attributes were</w:t>
       </w:r>
       <w:r>
         <w:t xml:space="preserve"> </w:t>
@@ -1317,7 +1516,7 @@
         <w:t xml:space="preserve"> </w:t>
       </w:r>
       <w:r>
-        <w:t xml:space="preserve">(Table 1). Coefficients in M2 are therefore</w:t>
+        <w:t xml:space="preserve">(Figure 5). Coefficients in M2 are therefore</w:t>
       </w:r>
       <w:r>
         <w:t xml:space="preserve"> </w:t>
@@ -1344,22 +1543,61 @@
     </w:p>
     <w:p>
       <w:pPr>
-        <w:pStyle w:val="DefinitionTerm"/>
-      </w:pPr>
-      <w:r>
-        <w:t xml:space="preserve">[pending: model results]</w:t>
-      </w:r>
-    </w:p>
-    <w:p>
-      <w:pPr>
-        <w:pStyle w:val="Definition"/>
-      </w:pPr>
-      <w:r>
-        <w:t xml:space="preserve">Table 1. Pairwise correlations of the eight retained aesthetic attributes (training accounts).</w:t>
-      </w:r>
-    </w:p>
-    <w:bookmarkEnd w:id="29"/>
-    <w:bookmarkStart w:id="30" w:name="data-preparation"/>
+        <w:pStyle w:val="CaptionedFigure"/>
+      </w:pPr>
+      <w:r>
+        <w:drawing>
+          <wp:inline>
+            <wp:extent cx="3017520" cy="2546660"/>
+            <wp:effectExtent b="0" l="0" r="0" t="0"/>
+            <wp:docPr descr="Figure 5. Pairwise correlations of the overall aesthetic score and the eight retained attributes (training accounts)." title="" id="39" name="Picture"/>
+            <a:graphic>
+              <a:graphicData uri="http://schemas.openxmlformats.org/drawingml/2006/picture">
+                <pic:pic>
+                  <pic:nvPicPr>
+                    <pic:cNvPr descr="outputs/figures/figE_attribute_correlations.png" id="40" name="Picture"/>
+                    <pic:cNvPicPr>
+                      <a:picLocks noChangeArrowheads="1" noChangeAspect="1"/>
+                    </pic:cNvPicPr>
+                  </pic:nvPicPr>
+                  <pic:blipFill>
+                    <a:blip r:embed="rId38"/>
+                    <a:stretch>
+                      <a:fillRect/>
+                    </a:stretch>
+                  </pic:blipFill>
+                  <pic:spPr bwMode="auto">
+                    <a:xfrm>
+                      <a:off x="0" y="0"/>
+                      <a:ext cx="3017520" cy="2546660"/>
+                    </a:xfrm>
+                    <a:prstGeom prst="rect">
+                      <a:avLst/>
+                    </a:prstGeom>
+                    <a:noFill/>
+                    <a:ln w="9525">
+                      <a:noFill/>
+                      <a:headEnd/>
+                      <a:tailEnd/>
+                    </a:ln>
+                  </pic:spPr>
+                </pic:pic>
+              </a:graphicData>
+            </a:graphic>
+          </wp:inline>
+        </w:drawing>
+      </w:r>
+    </w:p>
+    <w:p>
+      <w:pPr>
+        <w:pStyle w:val="CSIRCaptionFigure"/>
+      </w:pPr>
+      <w:r>
+        <w:t xml:space="preserve">Figure 5. Pairwise correlations of the overall aesthetic score and the eight retained attributes (training accounts).</w:t>
+      </w:r>
+    </w:p>
+    <w:bookmarkEnd w:id="41"/>
+    <w:bookmarkStart w:id="45" w:name="data-preparation"/>
     <w:p>
       <w:pPr>
         <w:pStyle w:val="CSIRSubSection"/>
@@ -1373,7 +1611,7 @@
         <w:pStyle w:val="CSIRText"/>
       </w:pPr>
       <w:r>
-        <w:t xml:space="preserve">The sample flow is sequential:</w:t>
+        <w:t xml:space="preserve">The sample flow is sequential (Figure 6):</w:t>
       </w:r>
     </w:p>
     <w:p>
@@ -1619,10 +1857,65 @@
     </w:p>
     <w:p>
       <w:pPr>
+        <w:pStyle w:val="CaptionedFigure"/>
+      </w:pPr>
+      <w:r>
+        <w:drawing>
+          <wp:inline>
+            <wp:extent cx="3017520" cy="3121572"/>
+            <wp:effectExtent b="0" l="0" r="0" t="0"/>
+            <wp:docPr descr="Figure 6. Sequential sample flow and account-level partitions." title="" id="43" name="Picture"/>
+            <a:graphic>
+              <a:graphicData uri="http://schemas.openxmlformats.org/drawingml/2006/picture">
+                <pic:pic>
+                  <pic:nvPicPr>
+                    <pic:cNvPr descr="outputs/figures/figB_sample_flow.png" id="44" name="Picture"/>
+                    <pic:cNvPicPr>
+                      <a:picLocks noChangeArrowheads="1" noChangeAspect="1"/>
+                    </pic:cNvPicPr>
+                  </pic:nvPicPr>
+                  <pic:blipFill>
+                    <a:blip r:embed="rId42"/>
+                    <a:stretch>
+                      <a:fillRect/>
+                    </a:stretch>
+                  </pic:blipFill>
+                  <pic:spPr bwMode="auto">
+                    <a:xfrm>
+                      <a:off x="0" y="0"/>
+                      <a:ext cx="3017520" cy="3121572"/>
+                    </a:xfrm>
+                    <a:prstGeom prst="rect">
+                      <a:avLst/>
+                    </a:prstGeom>
+                    <a:noFill/>
+                    <a:ln w="9525">
+                      <a:noFill/>
+                      <a:headEnd/>
+                      <a:tailEnd/>
+                    </a:ln>
+                  </pic:spPr>
+                </pic:pic>
+              </a:graphicData>
+            </a:graphic>
+          </wp:inline>
+        </w:drawing>
+      </w:r>
+    </w:p>
+    <w:p>
+      <w:pPr>
+        <w:pStyle w:val="CSIRCaptionFigure"/>
+      </w:pPr>
+      <w:r>
+        <w:t xml:space="preserve">Figure 6. Sequential sample flow and account-level partitions.</w:t>
+      </w:r>
+    </w:p>
+    <w:p>
+      <w:pPr>
         <w:pStyle w:val="CSIRText"/>
       </w:pPr>
       <w:r>
-        <w:t xml:space="preserve">Table 2 reports, for each partition, the number of multi-post accounts and the share of each</w:t>
+        <w:t xml:space="preserve">Table 1 reports, for each partition, the number of multi-post accounts and the share of each</w:t>
       </w:r>
       <w:r>
         <w:t xml:space="preserve"> </w:t>
@@ -1642,7 +1935,7 @@
         <w:pStyle w:val="CSIRTableCaption"/>
       </w:pPr>
       <w:r>
-        <w:t xml:space="preserve">Table 2. Partitions, multi-post accounts, and the within-account share of predictor variance (sum of squared deviations from account means divided by the total sum of squares).</w:t>
+        <w:t xml:space="preserve">Table 1. Partitions, multi-post accounts, and the within-account share of predictor variance (sum of squared deviations from account means divided by the total sum of squares).</w:t>
       </w:r>
     </w:p>
     <w:tbl>
@@ -1651,7 +1944,7 @@
         <w:tblW w:type="pct" w:w="5000"/>
         <w:tblLayout w:type="fixed"/>
         <w:tblLook w:firstRow="1" w:lastRow="0" w:firstColumn="0" w:lastColumn="0" w:noHBand="0" w:noVBand="0" w:val="0020"/>
-        <w:tblCaption w:val="Table 2. Partitions, multi-post accounts, and the within-account share of predictor variance (sum of squared deviations from account means divided by the total sum of squares)."/>
+        <w:tblCaption w:val="Table 1. Partitions, multi-post accounts, and the within-account share of predictor variance (sum of squared deviations from account means divided by the total sum of squares)."/>
       </w:tblPr>
       <w:tblGrid>
         <w:gridCol w:w="990"/>
@@ -2207,9 +2500,9 @@
         </w:tc>
       </w:tr>
     </w:tbl>
-    <w:bookmarkEnd w:id="30"/>
-    <w:bookmarkEnd w:id="31"/>
-    <w:bookmarkStart w:id="37" w:name="methods-crisp-dm-phase-4"/>
+    <w:bookmarkEnd w:id="45"/>
+    <w:bookmarkEnd w:id="46"/>
+    <w:bookmarkStart w:id="55" w:name="methods-crisp-dm-phase-4"/>
     <w:p>
       <w:pPr>
         <w:pStyle w:val="CSIRMainSection"/>
@@ -2218,7 +2511,7 @@
         <w:t xml:space="preserve">Methods (CRISP-DM Phase 4)</w:t>
       </w:r>
     </w:p>
-    <w:bookmarkStart w:id="32" w:name="model"/>
+    <w:bookmarkStart w:id="50" w:name="model"/>
     <w:p>
       <w:pPr>
         <w:pStyle w:val="CSIRSubSection"/>
@@ -3418,7 +3711,72 @@
         <w:t xml:space="preserve"> </w:t>
       </w:r>
       <w:r>
-        <w:t xml:space="preserve">identified only from accounts with two or more posts (Table 2). M1-W gives means only to the two</w:t>
+        <w:t xml:space="preserve">identified only from accounts with two or more posts (Table 1). Among those accounts,</w:t>
+      </w:r>
+      <w:r>
+        <w:t xml:space="preserve"> </w:t>
+      </w:r>
+      <w:r>
+        <w:t xml:space="preserve">42-62% of each predictor’s variance lies within accounts (Figure 7), so within-account</w:t>
+      </w:r>
+      <w:r>
+        <w:t xml:space="preserve"> </w:t>
+      </w:r>
+      <w:r>
+        <w:t xml:space="preserve">estimates rest on substantial variation.</w:t>
+      </w:r>
+    </w:p>
+    <w:p>
+      <w:pPr>
+        <w:pStyle w:val="CSIRText"/>
+      </w:pPr>
+      <w:r>
+        <w:drawing>
+          <wp:inline>
+            <wp:extent cx="3017520" cy="2330629"/>
+            <wp:effectExtent b="0" l="0" r="0" t="0"/>
+            <wp:docPr descr="Figure 7. Share of each predictor’s variance that lies within accounts, among accounts with two or more posts." title="" id="48" name="Picture"/>
+            <a:graphic>
+              <a:graphicData uri="http://schemas.openxmlformats.org/drawingml/2006/picture">
+                <pic:pic>
+                  <pic:nvPicPr>
+                    <pic:cNvPr descr="outputs/figures/figF_within_share.png" id="49" name="Picture"/>
+                    <pic:cNvPicPr>
+                      <a:picLocks noChangeArrowheads="1" noChangeAspect="1"/>
+                    </pic:cNvPicPr>
+                  </pic:nvPicPr>
+                  <pic:blipFill>
+                    <a:blip r:embed="rId47"/>
+                    <a:stretch>
+                      <a:fillRect/>
+                    </a:stretch>
+                  </pic:blipFill>
+                  <pic:spPr bwMode="auto">
+                    <a:xfrm>
+                      <a:off x="0" y="0"/>
+                      <a:ext cx="3017520" cy="2330629"/>
+                    </a:xfrm>
+                    <a:prstGeom prst="rect">
+                      <a:avLst/>
+                    </a:prstGeom>
+                    <a:noFill/>
+                    <a:ln w="9525">
+                      <a:noFill/>
+                      <a:headEnd/>
+                      <a:tailEnd/>
+                    </a:ln>
+                  </pic:spPr>
+                </pic:pic>
+              </a:graphicData>
+            </a:graphic>
+          </wp:inline>
+        </w:drawing>
+      </w:r>
+      <w:r>
+        <w:t xml:space="preserve"> </w:t>
+      </w:r>
+      <w:r>
+        <w:t xml:space="preserve">M1-W gives means only to the two</w:t>
       </w:r>
       <w:r>
         <w:t xml:space="preserve"> </w:t>
@@ -3491,8 +3849,8 @@
         <w:t xml:space="preserve">positive definite.</w:t>
       </w:r>
     </w:p>
-    <w:bookmarkEnd w:id="32"/>
-    <w:bookmarkStart w:id="33" w:name="X859c9d7ff97bfa6f38ef1fb11c59456635c1229"/>
+    <w:bookmarkEnd w:id="50"/>
+    <w:bookmarkStart w:id="51" w:name="X859c9d7ff97bfa6f38ef1fb11c59456635c1229"/>
     <w:p>
       <w:pPr>
         <w:pStyle w:val="CSIRSubSection"/>
@@ -3639,8 +3997,8 @@
         <w:t xml:space="preserve">is identified from repeated posts.</w:t>
       </w:r>
     </w:p>
-    <w:bookmarkEnd w:id="33"/>
-    <w:bookmarkStart w:id="34" w:name="prediction-and-calibration-h5"/>
+    <w:bookmarkEnd w:id="51"/>
+    <w:bookmarkStart w:id="52" w:name="prediction-and-calibration-h5"/>
     <w:p>
       <w:pPr>
         <w:pStyle w:val="CSIRSubSection"/>
@@ -4257,8 +4615,8 @@
         <w:t xml:space="preserve">post’s marginal predictive distribution.</w:t>
       </w:r>
     </w:p>
-    <w:bookmarkEnd w:id="34"/>
-    <w:bookmarkStart w:id="35" w:name="X46919dd601bda10f5bcbe2ea76850c6d5dd61a5"/>
+    <w:bookmarkEnd w:id="52"/>
+    <w:bookmarkStart w:id="53" w:name="X46919dd601bda10f5bcbe2ea76850c6d5dd61a5"/>
     <w:p>
       <w:pPr>
         <w:pStyle w:val="CSIRSubSection"/>
@@ -4272,7 +4630,7 @@
         <w:pStyle w:val="CSIRText"/>
       </w:pPr>
       <w:r>
-        <w:t xml:space="preserve">Table 3 lists the hypotheses. Each was registered with its direction, estimand, model, and test</w:t>
+        <w:t xml:space="preserve">Table 2 lists the hypotheses. Each was registered with its direction, estimand, model, and test</w:t>
       </w:r>
       <w:r>
         <w:t xml:space="preserve"> </w:t>
@@ -4286,7 +4644,7 @@
         <w:pStyle w:val="CSIRTableCaption"/>
       </w:pPr>
       <w:r>
-        <w:t xml:space="preserve">Table 3. Confirmatory hypotheses (registered as tag prereg-v1).</w:t>
+        <w:t xml:space="preserve">Table 2. Confirmatory hypotheses (registered as tag prereg-v1).</w:t>
       </w:r>
     </w:p>
     <w:tbl>
@@ -4295,7 +4653,7 @@
         <w:tblW w:type="pct" w:w="5000"/>
         <w:tblLayout w:type="fixed"/>
         <w:tblLook w:firstRow="1" w:lastRow="0" w:firstColumn="0" w:lastColumn="0" w:noHBand="0" w:noVBand="0" w:val="0020"/>
-        <w:tblCaption w:val="Table 3. Confirmatory hypotheses (registered as tag prereg-v1)."/>
+        <w:tblCaption w:val="Table 2. Confirmatory hypotheses (registered as tag prereg-v1)."/>
       </w:tblPr>
       <w:tblGrid>
         <w:gridCol w:w="1980"/>
@@ -4860,7 +5218,7 @@
         <w:t xml:space="preserve"> </w:t>
       </w:r>
       <w:r>
-        <w:t xml:space="preserve">likes). We report verdicts for ±1% and ±5% as a sensitivity analysis (Table 6), together with all</w:t>
+        <w:t xml:space="preserve">likes). We report verdicts for ±1% and ±5% as a sensitivity analysis (Table 4), together with all</w:t>
       </w:r>
       <w:r>
         <w:t xml:space="preserve"> </w:t>
@@ -5031,8 +5389,8 @@
         <w:t xml:space="preserve">All are exploratory.</w:t>
       </w:r>
     </w:p>
-    <w:bookmarkEnd w:id="35"/>
-    <w:bookmarkStart w:id="36" w:name="registration-and-chronology"/>
+    <w:bookmarkEnd w:id="53"/>
+    <w:bookmarkStart w:id="54" w:name="registration-and-chronology"/>
     <w:p>
       <w:pPr>
         <w:pStyle w:val="CSIRSubSection"/>
@@ -5133,7 +5491,7 @@
         <w:t xml:space="preserve"> </w:t>
       </w:r>
       <w:r>
-        <w:t xml:space="preserve">marginal distribution of likes (Figure 1) and the dispersion parameters of two control-only</w:t>
+        <w:t xml:space="preserve">marginal distribution of likes (Figure 2) and the dispersion parameters of two control-only</w:t>
       </w:r>
       <w:r>
         <w:t xml:space="preserve"> </w:t>
@@ -5188,9 +5546,9 @@
         <w:t xml:space="preserve">[pending: model results]</w:t>
       </w:r>
     </w:p>
-    <w:bookmarkEnd w:id="36"/>
-    <w:bookmarkEnd w:id="37"/>
-    <w:bookmarkStart w:id="38" w:name="conclusion"/>
+    <w:bookmarkEnd w:id="54"/>
+    <w:bookmarkEnd w:id="55"/>
+    <w:bookmarkStart w:id="56" w:name="conclusion"/>
     <w:p>
       <w:pPr>
         <w:pStyle w:val="CSIRMainSection"/>
@@ -5207,8 +5565,8 @@
         <w:t xml:space="preserve">[pending: model results]</w:t>
       </w:r>
     </w:p>
-    <w:bookmarkEnd w:id="38"/>
-    <w:bookmarkStart w:id="40" w:name="reproducibility-statement"/>
+    <w:bookmarkEnd w:id="56"/>
+    <w:bookmarkStart w:id="58" w:name="reproducibility-statement"/>
     <w:p>
       <w:pPr>
         <w:pStyle w:val="CSIRMainSection"/>
@@ -5260,7 +5618,7 @@
       <w:r>
         <w:t xml:space="preserve"> </w:t>
       </w:r>
-      <w:hyperlink r:id="rId39">
+      <w:hyperlink r:id="rId57">
         <w:r>
           <w:rPr>
             <w:rStyle w:val="Hyperlink"/>
@@ -5355,8 +5713,8 @@
         <w:t xml:space="preserve">objects are not redistributed because they contain account identifiers.</w:t>
       </w:r>
     </w:p>
-    <w:bookmarkEnd w:id="40"/>
-    <w:bookmarkStart w:id="41" w:name="ethical-considerations"/>
+    <w:bookmarkEnd w:id="58"/>
+    <w:bookmarkStart w:id="59" w:name="ethical-considerations"/>
     <w:p>
       <w:pPr>
         <w:pStyle w:val="CSIRMainSection"/>
@@ -5423,8 +5781,8 @@
         <w:t xml:space="preserve">participants, uses only data that were already public, and reports only aggregate results.</w:t>
       </w:r>
     </w:p>
-    <w:bookmarkEnd w:id="41"/>
-    <w:bookmarkStart w:id="42" w:name="data-availability-statement"/>
+    <w:bookmarkEnd w:id="59"/>
+    <w:bookmarkStart w:id="60" w:name="data-availability-statement"/>
     <w:p>
       <w:pPr>
         <w:pStyle w:val="CSIRMainSection"/>
@@ -5455,7 +5813,7 @@
       <w:r>
         <w:t xml:space="preserve"> </w:t>
       </w:r>
-      <w:hyperlink r:id="rId39">
+      <w:hyperlink r:id="rId57">
         <w:r>
           <w:rPr>
             <w:rStyle w:val="Hyperlink"/>
@@ -5512,8 +5870,8 @@
         <w:t xml:space="preserve">.</w:t>
       </w:r>
     </w:p>
-    <w:bookmarkEnd w:id="42"/>
-    <w:bookmarkStart w:id="43" w:name="author-contributions-credit"/>
+    <w:bookmarkEnd w:id="60"/>
+    <w:bookmarkStart w:id="61" w:name="author-contributions-credit"/>
     <w:p>
       <w:pPr>
         <w:pStyle w:val="CSIRMainSection"/>
@@ -5536,8 +5894,8 @@
         <w:t xml:space="preserve">Validation, Visualization, Writing – original draft, Writing – review &amp; editing.</w:t>
       </w:r>
     </w:p>
-    <w:bookmarkEnd w:id="43"/>
-    <w:bookmarkStart w:id="44" w:name="conflict-of-interest"/>
+    <w:bookmarkEnd w:id="61"/>
+    <w:bookmarkStart w:id="62" w:name="conflict-of-interest"/>
     <w:p>
       <w:pPr>
         <w:pStyle w:val="CSIRMainSection"/>
@@ -5554,8 +5912,8 @@
         <w:t xml:space="preserve">The author declares no conflict of interest.</w:t>
       </w:r>
     </w:p>
-    <w:bookmarkEnd w:id="44"/>
-    <w:bookmarkStart w:id="45" w:name="funding"/>
+    <w:bookmarkEnd w:id="62"/>
+    <w:bookmarkStart w:id="63" w:name="funding"/>
     <w:p>
       <w:pPr>
         <w:pStyle w:val="CSIRMainSection"/>
@@ -5572,8 +5930,8 @@
         <w:t xml:space="preserve">This research received no specific grant from any funding agency in the public, commercial, or not-for-profit sectors.</w:t>
       </w:r>
     </w:p>
-    <w:bookmarkEnd w:id="45"/>
-    <w:bookmarkStart w:id="46" w:name="X071796dd6bc546c91e96cca1cf5ff96599de61f"/>
+    <w:bookmarkEnd w:id="63"/>
+    <w:bookmarkStart w:id="64" w:name="X071796dd6bc546c91e96cca1cf5ff96599de61f"/>
     <w:p>
       <w:pPr>
         <w:pStyle w:val="CSIRMainSection"/>
@@ -5608,8 +5966,8 @@
         <w:t xml:space="preserve">for the content of the published paper.</w:t>
       </w:r>
     </w:p>
-    <w:bookmarkEnd w:id="46"/>
-    <w:bookmarkStart w:id="74" w:name="references"/>
+    <w:bookmarkEnd w:id="64"/>
+    <w:bookmarkStart w:id="92" w:name="references"/>
     <w:p>
       <w:pPr>
         <w:pStyle w:val="CSIRMainSection"/>
@@ -5628,7 +5986,7 @@
       <w:r>
         <w:t xml:space="preserve"> </w:t>
       </w:r>
-      <w:hyperlink r:id="rId47">
+      <w:hyperlink r:id="rId65">
         <w:r>
           <w:rPr>
             <w:rStyle w:val="Hyperlink"/>
@@ -5647,7 +6005,7 @@
       <w:r>
         <w:t xml:space="preserve"> </w:t>
       </w:r>
-      <w:hyperlink r:id="rId48">
+      <w:hyperlink r:id="rId66">
         <w:r>
           <w:rPr>
             <w:rStyle w:val="Hyperlink"/>
@@ -5666,7 +6024,7 @@
       <w:r>
         <w:t xml:space="preserve"> </w:t>
       </w:r>
-      <w:hyperlink r:id="rId49">
+      <w:hyperlink r:id="rId67">
         <w:r>
           <w:rPr>
             <w:rStyle w:val="Hyperlink"/>
@@ -5685,7 +6043,7 @@
       <w:r>
         <w:t xml:space="preserve"> </w:t>
       </w:r>
-      <w:hyperlink r:id="rId50">
+      <w:hyperlink r:id="rId68">
         <w:r>
           <w:rPr>
             <w:rStyle w:val="Hyperlink"/>
@@ -5704,7 +6062,7 @@
       <w:r>
         <w:t xml:space="preserve"> </w:t>
       </w:r>
-      <w:hyperlink r:id="rId51">
+      <w:hyperlink r:id="rId69">
         <w:r>
           <w:rPr>
             <w:rStyle w:val="Hyperlink"/>
@@ -5723,7 +6081,7 @@
       <w:r>
         <w:t xml:space="preserve"> </w:t>
       </w:r>
-      <w:hyperlink r:id="rId52">
+      <w:hyperlink r:id="rId70">
         <w:r>
           <w:rPr>
             <w:rStyle w:val="Hyperlink"/>
@@ -5742,7 +6100,7 @@
       <w:r>
         <w:t xml:space="preserve"> </w:t>
       </w:r>
-      <w:hyperlink r:id="rId53">
+      <w:hyperlink r:id="rId71">
         <w:r>
           <w:rPr>
             <w:rStyle w:val="Hyperlink"/>
@@ -5761,7 +6119,7 @@
       <w:r>
         <w:t xml:space="preserve"> </w:t>
       </w:r>
-      <w:hyperlink r:id="rId54">
+      <w:hyperlink r:id="rId72">
         <w:r>
           <w:rPr>
             <w:rStyle w:val="Hyperlink"/>
@@ -5780,7 +6138,7 @@
       <w:r>
         <w:t xml:space="preserve"> </w:t>
       </w:r>
-      <w:hyperlink r:id="rId55">
+      <w:hyperlink r:id="rId73">
         <w:r>
           <w:rPr>
             <w:rStyle w:val="Hyperlink"/>
@@ -5799,7 +6157,7 @@
       <w:r>
         <w:t xml:space="preserve"> </w:t>
       </w:r>
-      <w:hyperlink r:id="rId56">
+      <w:hyperlink r:id="rId74">
         <w:r>
           <w:rPr>
             <w:rStyle w:val="Hyperlink"/>
@@ -5818,7 +6176,7 @@
       <w:r>
         <w:t xml:space="preserve"> </w:t>
       </w:r>
-      <w:hyperlink r:id="rId57">
+      <w:hyperlink r:id="rId75">
         <w:r>
           <w:rPr>
             <w:rStyle w:val="Hyperlink"/>
@@ -5837,7 +6195,7 @@
       <w:r>
         <w:t xml:space="preserve"> </w:t>
       </w:r>
-      <w:hyperlink r:id="rId58">
+      <w:hyperlink r:id="rId76">
         <w:r>
           <w:rPr>
             <w:rStyle w:val="Hyperlink"/>
@@ -5864,7 +6222,7 @@
       <w:r>
         <w:t xml:space="preserve"> </w:t>
       </w:r>
-      <w:hyperlink r:id="rId59">
+      <w:hyperlink r:id="rId77">
         <w:r>
           <w:rPr>
             <w:rStyle w:val="Hyperlink"/>
@@ -5883,7 +6241,7 @@
       <w:r>
         <w:t xml:space="preserve"> </w:t>
       </w:r>
-      <w:hyperlink r:id="rId60">
+      <w:hyperlink r:id="rId78">
         <w:r>
           <w:rPr>
             <w:rStyle w:val="Hyperlink"/>
@@ -5902,7 +6260,7 @@
       <w:r>
         <w:t xml:space="preserve"> </w:t>
       </w:r>
-      <w:hyperlink r:id="rId61">
+      <w:hyperlink r:id="rId79">
         <w:r>
           <w:rPr>
             <w:rStyle w:val="Hyperlink"/>
@@ -5921,7 +6279,7 @@
       <w:r>
         <w:t xml:space="preserve"> </w:t>
       </w:r>
-      <w:hyperlink r:id="rId62">
+      <w:hyperlink r:id="rId80">
         <w:r>
           <w:rPr>
             <w:rStyle w:val="Hyperlink"/>
@@ -5940,7 +6298,7 @@
       <w:r>
         <w:t xml:space="preserve"> </w:t>
       </w:r>
-      <w:hyperlink r:id="rId63">
+      <w:hyperlink r:id="rId81">
         <w:r>
           <w:rPr>
             <w:rStyle w:val="Hyperlink"/>
@@ -5959,7 +6317,7 @@
       <w:r>
         <w:t xml:space="preserve"> </w:t>
       </w:r>
-      <w:hyperlink r:id="rId64">
+      <w:hyperlink r:id="rId82">
         <w:r>
           <w:rPr>
             <w:rStyle w:val="Hyperlink"/>
@@ -5978,7 +6336,7 @@
       <w:r>
         <w:t xml:space="preserve"> </w:t>
       </w:r>
-      <w:hyperlink r:id="rId65">
+      <w:hyperlink r:id="rId83">
         <w:r>
           <w:rPr>
             <w:rStyle w:val="Hyperlink"/>
@@ -5997,7 +6355,7 @@
       <w:r>
         <w:t xml:space="preserve"> </w:t>
       </w:r>
-      <w:hyperlink r:id="rId66">
+      <w:hyperlink r:id="rId84">
         <w:r>
           <w:rPr>
             <w:rStyle w:val="Hyperlink"/>
@@ -6016,7 +6374,7 @@
       <w:r>
         <w:t xml:space="preserve"> </w:t>
       </w:r>
-      <w:hyperlink r:id="rId67">
+      <w:hyperlink r:id="rId85">
         <w:r>
           <w:rPr>
             <w:rStyle w:val="Hyperlink"/>
@@ -6035,7 +6393,7 @@
       <w:r>
         <w:t xml:space="preserve"> </w:t>
       </w:r>
-      <w:hyperlink r:id="rId68">
+      <w:hyperlink r:id="rId86">
         <w:r>
           <w:rPr>
             <w:rStyle w:val="Hyperlink"/>
@@ -6060,7 +6418,7 @@
       <w:r>
         <w:t xml:space="preserve"> </w:t>
       </w:r>
-      <w:hyperlink r:id="rId69">
+      <w:hyperlink r:id="rId87">
         <w:r>
           <w:rPr>
             <w:rStyle w:val="Hyperlink"/>
@@ -6079,7 +6437,7 @@
       <w:r>
         <w:t xml:space="preserve"> </w:t>
       </w:r>
-      <w:hyperlink r:id="rId70">
+      <w:hyperlink r:id="rId88">
         <w:r>
           <w:rPr>
             <w:rStyle w:val="Hyperlink"/>
@@ -6098,7 +6456,7 @@
       <w:r>
         <w:t xml:space="preserve"> </w:t>
       </w:r>
-      <w:hyperlink r:id="rId71">
+      <w:hyperlink r:id="rId89">
         <w:r>
           <w:rPr>
             <w:rStyle w:val="Hyperlink"/>
@@ -6117,7 +6475,7 @@
       <w:r>
         <w:t xml:space="preserve"> </w:t>
       </w:r>
-      <w:hyperlink r:id="rId72">
+      <w:hyperlink r:id="rId90">
         <w:r>
           <w:rPr>
             <w:rStyle w:val="Hyperlink"/>
@@ -6136,7 +6494,7 @@
       <w:r>
         <w:t xml:space="preserve"> </w:t>
       </w:r>
-      <w:hyperlink r:id="rId73">
+      <w:hyperlink r:id="rId91">
         <w:r>
           <w:rPr>
             <w:rStyle w:val="Hyperlink"/>
@@ -6145,7 +6503,7 @@
         </w:r>
       </w:hyperlink>
     </w:p>
-    <w:bookmarkEnd w:id="74"/>
+    <w:bookmarkEnd w:id="92"/>
     <w:sectPr>
       <w:type w:val="continuous"/>
       <w:pgSz w:w="11907" w:h="16839" w:code="9"/>

</xml_diff>

<commit_message>
Results, discussion, conclusion, abstract (token-filled); refit script for non-converged fits (D20); readable figure labels
Co-Authored-By: Claude Opus 5.5 <noreply@anthropic.com>
</commit_message>
<xml_diff>
--- a/paper/paper_v2_draft.docx
+++ b/paper/paper_v2_draft.docx
@@ -58,7 +58,7 @@
         <w:t xml:space="preserve"> </w:t>
       </w:r>
       <w:r>
-        <w:t xml:space="preserve">[pending: model results]</w:t>
+        <w:t xml:space="preserve">Do visual properties of a photograph predict how many likes it earns once audience size is taken into account? We analysed 583,830 Instagram photographs from 469,330 public accounts with a pre-registered negative binomial mixed model. The model has an account random intercept and uses the log of the recorded follower count as an offset. A finding counted only if it passed Holm-corrected significance, exceeded a ±3% smallest effect size of interest (with equivalence tests for null claims), and replicated in two disjoint halves of accounts. Higher overall aesthetic quality (+5.7% likes per follower per SD; IRR 1.057, 95% CI [1.055, 1.059]) and the presence of a detected person (IRR 1.239, [1.230, 1.249]) were supported. The aesthetic association held within accounts (IRR 1.042 [1.039, 1.045]), and its between-account component differed only negligibly. Colour vividness, often recommended to creators, had a practically negligible association (IRR 0.977, [0.974, 0.980]). On 94,172 held-out accounts, visual features improved the joint log predictive score by 0.0160 nats per post (95% CI [0.0148, 0.0170]). A freely estimated follower elasticity of 0.629 shows that likes grow sublinearly with audience size. The study demonstrates an auditable CRISP-DM workflow for large-sample social-media inference.</w:t>
       </w:r>
     </w:p>
     <w:p>
@@ -527,7 +527,25 @@
         <w:pStyle w:val="CSIRText"/>
       </w:pPr>
       <w:r>
-        <w:t xml:space="preserve">[pending: model results]</w:t>
+        <w:t xml:space="preserve">In brief, two visual properties pass all criteria: overall aesthetic quality (+5.7% likes</w:t>
+      </w:r>
+      <w:r>
+        <w:t xml:space="preserve"> </w:t>
+      </w:r>
+      <w:r>
+        <w:t xml:space="preserve">per recorded follower per SD) and the presence of a person (about +22%). The aesthetic</w:t>
+      </w:r>
+      <w:r>
+        <w:t xml:space="preserve"> </w:t>
+      </w:r>
+      <w:r>
+        <w:t xml:space="preserve">association holds within accounts. Colour vividness has a practically negligible association.</w:t>
+      </w:r>
+      <w:r>
+        <w:t xml:space="preserve"> </w:t>
+      </w:r>
+      <w:r>
+        <w:t xml:space="preserve">Visual features improve held-out prediction by a small but reliable margin.</w:t>
       </w:r>
     </w:p>
     <w:p>
@@ -1377,13 +1395,13 @@
         <w:t xml:space="preserve"> </w:t>
       </w:r>
       <w:r>
-        <w:t xml:space="preserve">(i) Two independently produced labels agree (Figure 4): a person is detected in [pending: model results]% of images</w:t>
-      </w:r>
-      <w:r>
-        <w:t xml:space="preserve"> </w:t>
-      </w:r>
-      <w:r>
-        <w:t xml:space="preserve">labelled selfie and [pending: model results]% labelled portrait, but in only [pending: model results]% of aerial</w:t>
+        <w:t xml:space="preserve">(i) Two independently produced labels agree (Figure 4): a person is detected in 93.8% of images</w:t>
+      </w:r>
+      <w:r>
+        <w:t xml:space="preserve"> </w:t>
+      </w:r>
+      <w:r>
+        <w:t xml:space="preserve">labelled selfie and 91.2% labelled portrait, but in only 17.4% of aerial</w:t>
       </w:r>
       <w:r>
         <w:t xml:space="preserve"> </w:t>
@@ -1401,7 +1419,7 @@
         <w:t xml:space="preserve"> </w:t>
       </w:r>
       <w:r>
-        <w:t xml:space="preserve">average (mean z = [pending: model results], against [pending: model results] for extreme wide shots), which optics</w:t>
+        <w:t xml:space="preserve">average (mean z = -0.06, against 0.02 for extreme wide shots), which optics</w:t>
       </w:r>
       <w:r>
         <w:t xml:space="preserve"> </w:t>
@@ -1510,7 +1528,7 @@
         <w:t xml:space="preserve"> </w:t>
       </w:r>
       <w:r>
-        <w:t xml:space="preserve">pairwise correlation in the training data is [pending: model results] and the maximum is [pending: model results]</w:t>
+        <w:t xml:space="preserve">pairwise correlation in the training data is 0.49 and the maximum is 0.77</w:t>
       </w:r>
       <w:r>
         <w:t xml:space="preserve"> </w:t>
@@ -4560,7 +4578,7 @@
         <w:t xml:space="preserve"> </w:t>
       </w:r>
       <w:r>
-        <w:t xml:space="preserve">scored on the [pending: model results] test accounts ([pending: model results] posts). The 95% CI of the score</w:t>
+        <w:t xml:space="preserve">scored on the 94,172 test accounts (117,275 posts). The 95% CI of the score</w:t>
       </w:r>
       <w:r>
         <w:t xml:space="preserve"> </w:t>
@@ -5530,30 +5548,4404 @@
         <w:t xml:space="preserve">Archiving the tagged release with a DOI service would give an independent timestamp.</w:t>
       </w:r>
     </w:p>
-    <w:p>
-      <w:pPr>
-        <w:pStyle w:val="CSIRText"/>
-      </w:pPr>
-      <w:r>
-        <w:t xml:space="preserve">[pending: model results]</w:t>
-      </w:r>
-    </w:p>
-    <w:p>
-      <w:pPr>
-        <w:pStyle w:val="CSIRText"/>
-      </w:pPr>
-      <w:r>
-        <w:t xml:space="preserve">[pending: model results]</w:t>
-      </w:r>
-    </w:p>
     <w:bookmarkEnd w:id="54"/>
     <w:bookmarkEnd w:id="55"/>
-    <w:bookmarkStart w:id="56" w:name="conclusion"/>
+    <w:bookmarkStart w:id="81" w:name="results-crisp-dm-phase-5"/>
     <w:p>
       <w:pPr>
         <w:pStyle w:val="CSIRMainSection"/>
       </w:pPr>
       <w:r>
+        <w:t xml:space="preserve">Results (CRISP-DM Phase 5)</w:t>
+      </w:r>
+    </w:p>
+    <w:bookmarkStart w:id="59" w:name="confirmatory-hypotheses"/>
+    <w:p>
+      <w:pPr>
+        <w:pStyle w:val="CSIRSubSection"/>
+      </w:pPr>
+      <w:r>
+        <w:t xml:space="preserve">Confirmatory hypotheses</w:t>
+      </w:r>
+    </w:p>
+    <w:p>
+      <w:pPr>
+        <w:pStyle w:val="CSIRText"/>
+      </w:pPr>
+      <w:r>
+        <w:t xml:space="preserve">Table 3 and Figure 8 summarise the five confirmatory tests. Three hypotheses are supported,</w:t>
+      </w:r>
+      <w:r>
+        <w:t xml:space="preserve"> </w:t>
+      </w:r>
+      <w:r>
+        <w:t xml:space="preserve">and two are classified as negligible. No hypothesis is inconclusive.</w:t>
+      </w:r>
+    </w:p>
+    <w:p>
+      <w:pPr>
+        <w:pStyle w:val="CSIRTableCaption"/>
+      </w:pPr>
+      <w:r>
+        <w:t xml:space="preserve">Table 3. Confirmatory results. IRRs are per training SD (H1, H3), for presence versus absence (H2), or</w:t>
+      </w:r>
+      <w:r>
+        <w:t xml:space="preserve"> </w:t>
+      </w:r>
+      <m:oMath>
+        <m:r>
+          <m:rPr>
+            <m:sty m:val="p"/>
+          </m:rPr>
+          <m:t>exp</m:t>
+        </m:r>
+        <m:r>
+          <m:rPr>
+            <m:sty m:val="p"/>
+          </m:rPr>
+          <m:t>(</m:t>
+        </m:r>
+        <m:r>
+          <m:t>δ</m:t>
+        </m:r>
+        <m:r>
+          <m:rPr>
+            <m:sty m:val="p"/>
+          </m:rPr>
+          <m:t>)</m:t>
+        </m:r>
+      </m:oMath>
+      <w:r>
+        <w:t xml:space="preserve"> </w:t>
+      </w:r>
+      <w:r>
+        <w:t xml:space="preserve">= between/within ratio (H4). H5 is the difference in joint log score per post on held-out accounts. p values are Holm-adjusted across H1-H5 (significance) and across H1-H4 (TOST).</w:t>
+      </w:r>
+    </w:p>
+    <w:tbl>
+      <w:tblPr>
+        <w:tblStyle w:val="Table"/>
+        <w:tblW w:type="pct" w:w="5000"/>
+        <w:tblLayout w:type="fixed"/>
+        <w:tblLook w:firstRow="1" w:lastRow="0" w:firstColumn="0" w:lastColumn="0" w:noHBand="0" w:noVBand="0" w:val="0020"/>
+        <w:tblCaption w:val="Table 3. Confirmatory results. IRRs are per training SD (H1, H3), for presence versus absence (H2), or \exp(\delta) = between/within ratio (H4). H5 is the difference in joint log score per post on held-out accounts. p values are Holm-adjusted across H1-H5 (significance) and across H1-H4 (TOST)."/>
+      </w:tblPr>
+      <w:tblGrid>
+        <w:gridCol w:w="990"/>
+        <w:gridCol w:w="990"/>
+        <w:gridCol w:w="990"/>
+        <w:gridCol w:w="990"/>
+        <w:gridCol w:w="990"/>
+        <w:gridCol w:w="990"/>
+        <w:gridCol w:w="990"/>
+        <w:gridCol w:w="990"/>
+      </w:tblGrid>
+      <w:tr>
+        <w:trPr>
+          <w:tblHeader w:val="on"/>
+        </w:trPr>
+        <w:tc>
+          <w:tcPr/>
+          <w:p>
+            <w:pPr>
+              <w:pStyle w:val="CSIRText"/>
+            </w:pPr>
+            <w:r>
+              <w:t xml:space="preserve">H</w:t>
+            </w:r>
+          </w:p>
+        </w:tc>
+        <w:tc>
+          <w:tcPr/>
+          <w:p>
+            <w:pPr>
+              <w:pStyle w:val="CSIRText"/>
+            </w:pPr>
+            <w:r>
+              <w:t xml:space="preserve">Estimate (IRR or Δ)</w:t>
+            </w:r>
+          </w:p>
+        </w:tc>
+        <w:tc>
+          <w:tcPr/>
+          <w:p>
+            <w:pPr>
+              <w:pStyle w:val="CSIRText"/>
+            </w:pPr>
+            <w:r>
+              <w:t xml:space="preserve">95% CI</w:t>
+            </w:r>
+          </w:p>
+        </w:tc>
+        <w:tc>
+          <w:tcPr/>
+          <w:p>
+            <w:pPr>
+              <w:pStyle w:val="CSIRText"/>
+            </w:pPr>
+            <w:r>
+              <w:t xml:space="preserve">p (Holm)</w:t>
+            </w:r>
+          </w:p>
+        </w:tc>
+        <w:tc>
+          <w:tcPr/>
+          <w:p>
+            <w:pPr>
+              <w:pStyle w:val="CSIRText"/>
+            </w:pPr>
+            <w:r>
+              <w:t xml:space="preserve">p TOST (Holm)</w:t>
+            </w:r>
+          </w:p>
+        </w:tc>
+        <w:tc>
+          <w:tcPr/>
+          <w:p>
+            <w:pPr>
+              <w:pStyle w:val="CSIRText"/>
+            </w:pPr>
+            <w:r>
+              <w:t xml:space="preserve">Half A / B</w:t>
+            </w:r>
+          </w:p>
+        </w:tc>
+        <w:tc>
+          <w:tcPr/>
+          <w:p>
+            <w:pPr>
+              <w:pStyle w:val="CSIRText"/>
+            </w:pPr>
+            <w:r>
+              <w:t xml:space="preserve">Replicated</w:t>
+            </w:r>
+          </w:p>
+        </w:tc>
+        <w:tc>
+          <w:tcPr/>
+          <w:p>
+            <w:pPr>
+              <w:pStyle w:val="CSIRText"/>
+            </w:pPr>
+            <w:r>
+              <w:t xml:space="preserve">Verdict</w:t>
+            </w:r>
+          </w:p>
+        </w:tc>
+      </w:tr>
+      <w:tr>
+        <w:tc>
+          <w:tcPr/>
+          <w:p>
+            <w:pPr>
+              <w:pStyle w:val="CSIRText"/>
+            </w:pPr>
+            <w:r>
+              <w:t xml:space="preserve">H1</w:t>
+            </w:r>
+          </w:p>
+        </w:tc>
+        <w:tc>
+          <w:tcPr/>
+          <w:p>
+            <w:pPr>
+              <w:pStyle w:val="CSIRText"/>
+            </w:pPr>
+            <w:r>
+              <w:t xml:space="preserve">1.057</w:t>
+            </w:r>
+          </w:p>
+        </w:tc>
+        <w:tc>
+          <w:tcPr/>
+          <w:p>
+            <w:pPr>
+              <w:pStyle w:val="CSIRText"/>
+            </w:pPr>
+            <w:r>
+              <w:t xml:space="preserve">[1.055, 1.059]</w:t>
+            </w:r>
+          </w:p>
+        </w:tc>
+        <w:tc>
+          <w:tcPr/>
+          <w:p>
+            <w:pPr>
+              <w:pStyle w:val="CSIRText"/>
+            </w:pPr>
+            <w:r>
+              <w:t xml:space="preserve">&lt; 0.001</w:t>
+            </w:r>
+          </w:p>
+        </w:tc>
+        <w:tc>
+          <w:tcPr/>
+          <w:p>
+            <w:pPr>
+              <w:pStyle w:val="CSIRText"/>
+            </w:pPr>
+            <w:r>
+              <w:t xml:space="preserve">1.000</w:t>
+            </w:r>
+          </w:p>
+        </w:tc>
+        <w:tc>
+          <w:tcPr/>
+          <w:p>
+            <w:pPr>
+              <w:pStyle w:val="CSIRText"/>
+            </w:pPr>
+            <w:r>
+              <w:t xml:space="preserve">1.056 / 1.057</w:t>
+            </w:r>
+          </w:p>
+        </w:tc>
+        <w:tc>
+          <w:tcPr/>
+          <w:p>
+            <w:pPr>
+              <w:pStyle w:val="CSIRText"/>
+            </w:pPr>
+            <w:r>
+              <w:t xml:space="preserve">yes</w:t>
+            </w:r>
+          </w:p>
+        </w:tc>
+        <w:tc>
+          <w:tcPr/>
+          <w:p>
+            <w:pPr>
+              <w:pStyle w:val="CSIRText"/>
+            </w:pPr>
+            <w:r>
+              <w:t xml:space="preserve">Supported</w:t>
+            </w:r>
+          </w:p>
+        </w:tc>
+      </w:tr>
+      <w:tr>
+        <w:tc>
+          <w:tcPr/>
+          <w:p>
+            <w:pPr>
+              <w:pStyle w:val="CSIRText"/>
+            </w:pPr>
+            <w:r>
+              <w:t xml:space="preserve">H2</w:t>
+            </w:r>
+          </w:p>
+        </w:tc>
+        <w:tc>
+          <w:tcPr/>
+          <w:p>
+            <w:pPr>
+              <w:pStyle w:val="CSIRText"/>
+            </w:pPr>
+            <w:r>
+              <w:t xml:space="preserve">1.239</w:t>
+            </w:r>
+          </w:p>
+        </w:tc>
+        <w:tc>
+          <w:tcPr/>
+          <w:p>
+            <w:pPr>
+              <w:pStyle w:val="CSIRText"/>
+            </w:pPr>
+            <w:r>
+              <w:t xml:space="preserve">[1.230, 1.249]</w:t>
+            </w:r>
+          </w:p>
+        </w:tc>
+        <w:tc>
+          <w:tcPr/>
+          <w:p>
+            <w:pPr>
+              <w:pStyle w:val="CSIRText"/>
+            </w:pPr>
+            <w:r>
+              <w:t xml:space="preserve">&lt; 0.001</w:t>
+            </w:r>
+          </w:p>
+        </w:tc>
+        <w:tc>
+          <w:tcPr/>
+          <w:p>
+            <w:pPr>
+              <w:pStyle w:val="CSIRText"/>
+            </w:pPr>
+            <w:r>
+              <w:t xml:space="preserve">1.000</w:t>
+            </w:r>
+          </w:p>
+        </w:tc>
+        <w:tc>
+          <w:tcPr/>
+          <w:p>
+            <w:pPr>
+              <w:pStyle w:val="CSIRText"/>
+            </w:pPr>
+            <w:r>
+              <w:t xml:space="preserve">1.241 / 1.238</w:t>
+            </w:r>
+          </w:p>
+        </w:tc>
+        <w:tc>
+          <w:tcPr/>
+          <w:p>
+            <w:pPr>
+              <w:pStyle w:val="CSIRText"/>
+            </w:pPr>
+            <w:r>
+              <w:t xml:space="preserve">yes</w:t>
+            </w:r>
+          </w:p>
+        </w:tc>
+        <w:tc>
+          <w:tcPr/>
+          <w:p>
+            <w:pPr>
+              <w:pStyle w:val="CSIRText"/>
+            </w:pPr>
+            <w:r>
+              <w:t xml:space="preserve">Supported</w:t>
+            </w:r>
+          </w:p>
+        </w:tc>
+      </w:tr>
+      <w:tr>
+        <w:tc>
+          <w:tcPr/>
+          <w:p>
+            <w:pPr>
+              <w:pStyle w:val="CSIRText"/>
+            </w:pPr>
+            <w:r>
+              <w:t xml:space="preserve">H3</w:t>
+            </w:r>
+          </w:p>
+        </w:tc>
+        <w:tc>
+          <w:tcPr/>
+          <w:p>
+            <w:pPr>
+              <w:pStyle w:val="CSIRText"/>
+            </w:pPr>
+            <w:r>
+              <w:t xml:space="preserve">0.977</w:t>
+            </w:r>
+          </w:p>
+        </w:tc>
+        <w:tc>
+          <w:tcPr/>
+          <w:p>
+            <w:pPr>
+              <w:pStyle w:val="CSIRText"/>
+            </w:pPr>
+            <w:r>
+              <w:t xml:space="preserve">[0.974, 0.980]</w:t>
+            </w:r>
+          </w:p>
+        </w:tc>
+        <w:tc>
+          <w:tcPr/>
+          <w:p>
+            <w:pPr>
+              <w:pStyle w:val="CSIRText"/>
+            </w:pPr>
+            <w:r>
+              <w:t xml:space="preserve">1.000</w:t>
+            </w:r>
+          </w:p>
+        </w:tc>
+        <w:tc>
+          <w:tcPr/>
+          <w:p>
+            <w:pPr>
+              <w:pStyle w:val="CSIRText"/>
+            </w:pPr>
+            <w:r>
+              <w:t xml:space="preserve">&lt; 0.001</w:t>
+            </w:r>
+          </w:p>
+        </w:tc>
+        <w:tc>
+          <w:tcPr/>
+          <w:p>
+            <w:pPr>
+              <w:pStyle w:val="CSIRText"/>
+            </w:pPr>
+            <w:r>
+              <w:t xml:space="preserve">0.977 / 0.977</w:t>
+            </w:r>
+          </w:p>
+        </w:tc>
+        <w:tc>
+          <w:tcPr/>
+          <w:p>
+            <w:pPr>
+              <w:pStyle w:val="CSIRText"/>
+            </w:pPr>
+            <w:r>
+              <w:t xml:space="preserve">no</w:t>
+            </w:r>
+          </w:p>
+        </w:tc>
+        <w:tc>
+          <w:tcPr/>
+          <w:p>
+            <w:pPr>
+              <w:pStyle w:val="CSIRText"/>
+            </w:pPr>
+            <w:r>
+              <w:t xml:space="preserve">Negligible</w:t>
+            </w:r>
+          </w:p>
+        </w:tc>
+      </w:tr>
+      <w:tr>
+        <w:tc>
+          <w:tcPr/>
+          <w:p>
+            <w:pPr>
+              <w:pStyle w:val="CSIRText"/>
+            </w:pPr>
+            <w:r>
+              <w:t xml:space="preserve">H4</w:t>
+            </w:r>
+          </w:p>
+        </w:tc>
+        <w:tc>
+          <w:tcPr/>
+          <w:p>
+            <w:pPr>
+              <w:pStyle w:val="CSIRText"/>
+            </w:pPr>
+            <w:r>
+              <w:t xml:space="preserve">1.017</w:t>
+            </w:r>
+          </w:p>
+        </w:tc>
+        <w:tc>
+          <w:tcPr/>
+          <w:p>
+            <w:pPr>
+              <w:pStyle w:val="CSIRText"/>
+            </w:pPr>
+            <w:r>
+              <w:t xml:space="preserve">[1.013, 1.022]</w:t>
+            </w:r>
+          </w:p>
+        </w:tc>
+        <w:tc>
+          <w:tcPr/>
+          <w:p>
+            <w:pPr>
+              <w:pStyle w:val="CSIRText"/>
+            </w:pPr>
+            <w:r>
+              <w:t xml:space="preserve">&lt; 0.001</w:t>
+            </w:r>
+          </w:p>
+        </w:tc>
+        <w:tc>
+          <w:tcPr/>
+          <w:p>
+            <w:pPr>
+              <w:pStyle w:val="CSIRText"/>
+            </w:pPr>
+            <w:r>
+              <w:t xml:space="preserve">&lt; 0.001</w:t>
+            </w:r>
+          </w:p>
+        </w:tc>
+        <w:tc>
+          <w:tcPr/>
+          <w:p>
+            <w:pPr>
+              <w:pStyle w:val="CSIRText"/>
+            </w:pPr>
+            <w:r>
+              <w:t xml:space="preserve">1.015 / 1.019</w:t>
+            </w:r>
+          </w:p>
+        </w:tc>
+        <w:tc>
+          <w:tcPr/>
+          <w:p>
+            <w:pPr>
+              <w:pStyle w:val="CSIRText"/>
+            </w:pPr>
+            <w:r>
+              <w:t xml:space="preserve">yes</w:t>
+            </w:r>
+          </w:p>
+        </w:tc>
+        <w:tc>
+          <w:tcPr/>
+          <w:p>
+            <w:pPr>
+              <w:pStyle w:val="CSIRText"/>
+            </w:pPr>
+            <w:r>
+              <w:t xml:space="preserve">Negligible</w:t>
+            </w:r>
+          </w:p>
+        </w:tc>
+      </w:tr>
+      <w:tr>
+        <w:tc>
+          <w:tcPr/>
+          <w:p>
+            <w:pPr>
+              <w:pStyle w:val="CSIRText"/>
+            </w:pPr>
+            <w:r>
+              <w:t xml:space="preserve">H5</w:t>
+            </w:r>
+          </w:p>
+        </w:tc>
+        <w:tc>
+          <w:tcPr/>
+          <w:p>
+            <w:pPr>
+              <w:pStyle w:val="CSIRText"/>
+            </w:pPr>
+            <w:r>
+              <w:t xml:space="preserve">0.0160 nats</w:t>
+            </w:r>
+          </w:p>
+        </w:tc>
+        <w:tc>
+          <w:tcPr/>
+          <w:p>
+            <w:pPr>
+              <w:pStyle w:val="CSIRText"/>
+            </w:pPr>
+            <w:r>
+              <w:t xml:space="preserve">[0.0148, 0.0170]</w:t>
+            </w:r>
+          </w:p>
+        </w:tc>
+        <w:tc>
+          <w:tcPr/>
+          <w:p>
+            <w:pPr>
+              <w:pStyle w:val="CSIRText"/>
+            </w:pPr>
+            <w:r>
+              <w:t xml:space="preserve">0.002</w:t>
+            </w:r>
+          </w:p>
+        </w:tc>
+        <w:tc>
+          <w:tcPr/>
+          <w:p>
+            <w:pPr>
+              <w:pStyle w:val="CSIRText"/>
+            </w:pPr>
+            <w:r>
+              <w:t xml:space="preserve">–</w:t>
+            </w:r>
+          </w:p>
+        </w:tc>
+        <w:tc>
+          <w:tcPr/>
+          <w:p>
+            <w:pPr>
+              <w:pStyle w:val="CSIRText"/>
+            </w:pPr>
+            <w:r>
+              <w:t xml:space="preserve">0.0161 / 0.0159</w:t>
+            </w:r>
+          </w:p>
+        </w:tc>
+        <w:tc>
+          <w:tcPr/>
+          <w:p>
+            <w:pPr>
+              <w:pStyle w:val="CSIRText"/>
+            </w:pPr>
+            <w:r>
+              <w:t xml:space="preserve">yes</w:t>
+            </w:r>
+          </w:p>
+        </w:tc>
+        <w:tc>
+          <w:tcPr/>
+          <w:p>
+            <w:pPr>
+              <w:pStyle w:val="CSIRText"/>
+            </w:pPr>
+            <w:r>
+              <w:t xml:space="preserve">Supported</w:t>
+            </w:r>
+          </w:p>
+        </w:tc>
+      </w:tr>
+    </w:tbl>
+    <w:p>
+      <w:pPr>
+        <w:pStyle w:val="CaptionedFigure"/>
+      </w:pPr>
+      <w:r>
+        <w:drawing>
+          <wp:inline>
+            <wp:extent cx="3017520" cy="2485016"/>
+            <wp:effectExtent b="0" l="0" r="0" t="0"/>
+            <wp:docPr descr="Figure 8. Confirmatory estimates for the full sample and the two replication halves. Grey band: SESOI [0.97, 1.03]." title="" id="57" name="Picture"/>
+            <a:graphic>
+              <a:graphicData uri="http://schemas.openxmlformats.org/drawingml/2006/picture">
+                <pic:pic>
+                  <pic:nvPicPr>
+                    <pic:cNvPr descr="outputs/figures/fig0_confirmatory.png" id="58" name="Picture"/>
+                    <pic:cNvPicPr>
+                      <a:picLocks noChangeArrowheads="1" noChangeAspect="1"/>
+                    </pic:cNvPicPr>
+                  </pic:nvPicPr>
+                  <pic:blipFill>
+                    <a:blip r:embed="rId56"/>
+                    <a:stretch>
+                      <a:fillRect/>
+                    </a:stretch>
+                  </pic:blipFill>
+                  <pic:spPr bwMode="auto">
+                    <a:xfrm>
+                      <a:off x="0" y="0"/>
+                      <a:ext cx="3017520" cy="2485016"/>
+                    </a:xfrm>
+                    <a:prstGeom prst="rect">
+                      <a:avLst/>
+                    </a:prstGeom>
+                    <a:noFill/>
+                    <a:ln w="9525">
+                      <a:noFill/>
+                      <a:headEnd/>
+                      <a:tailEnd/>
+                    </a:ln>
+                  </pic:spPr>
+                </pic:pic>
+              </a:graphicData>
+            </a:graphic>
+          </wp:inline>
+        </w:drawing>
+      </w:r>
+    </w:p>
+    <w:p>
+      <w:pPr>
+        <w:pStyle w:val="CSIRCaptionFigure"/>
+      </w:pPr>
+      <w:r>
+        <w:t xml:space="preserve">Figure 8. Confirmatory estimates for the full sample and the two replication halves. Grey band: SESOI [0.97, 1.03].</w:t>
+      </w:r>
+    </w:p>
+    <w:p>
+      <w:pPr>
+        <w:pStyle w:val="CSIRText"/>
+      </w:pPr>
+      <w:r>
+        <w:rPr>
+          <w:b/>
+          <w:bCs/>
+        </w:rPr>
+        <w:t xml:space="preserve">H1 (overall aesthetic score): supported.</w:t>
+      </w:r>
+      <w:r>
+        <w:t xml:space="preserve"> </w:t>
+      </w:r>
+      <w:r>
+        <w:t xml:space="preserve">One training SD higher aesthetic score is</w:t>
+      </w:r>
+      <w:r>
+        <w:t xml:space="preserve"> </w:t>
+      </w:r>
+      <w:r>
+        <w:t xml:space="preserve">associated with 5.7% more likes per recorded follower (IRR 1.057, 95% CI</w:t>
+      </w:r>
+      <w:r>
+        <w:t xml:space="preserve"> </w:t>
+      </w:r>
+      <w:r>
+        <w:t xml:space="preserve">[1.055, 1.059]). The interval lies entirely above the SESOI band, and the estimate is reproduced</w:t>
+      </w:r>
+      <w:r>
+        <w:t xml:space="preserve"> </w:t>
+      </w:r>
+      <w:r>
+        <w:t xml:space="preserve">almost exactly in half A (1.056) and half B (1.057).</w:t>
+      </w:r>
+    </w:p>
+    <w:p>
+      <w:pPr>
+        <w:pStyle w:val="CSIRText"/>
+      </w:pPr>
+      <w:r>
+        <w:rPr>
+          <w:b/>
+          <w:bCs/>
+        </w:rPr>
+        <w:t xml:space="preserve">H2 (person present): supported.</w:t>
+      </w:r>
+      <w:r>
+        <w:t xml:space="preserve"> </w:t>
+      </w:r>
+      <w:r>
+        <w:t xml:space="preserve">Holding the other visual terms fixed, photographs with a</w:t>
+      </w:r>
+      <w:r>
+        <w:t xml:space="preserve"> </w:t>
+      </w:r>
+      <w:r>
+        <w:t xml:space="preserve">detected person receive 23.9% more likes per recorded follower (IRR 1.239, 95% CI</w:t>
+      </w:r>
+      <w:r>
+        <w:t xml:space="preserve"> </w:t>
+      </w:r>
+      <w:r>
+        <w:t xml:space="preserve">[1.230, 1.249]; halves 1.241 and 1.238). Because person count enters the same model, the</w:t>
+      </w:r>
+      <w:r>
+        <w:t xml:space="preserve"> </w:t>
+      </w:r>
+      <w:r>
+        <w:t xml:space="preserve">overall contrast for exactly one person against none is IRR 1.216 [1.209, 1.224].</w:t>
+      </w:r>
+      <w:r>
+        <w:t xml:space="preserve"> </w:t>
+      </w:r>
+      <w:r>
+        <w:t xml:space="preserve">Each additional person is associated with slightly fewer likes (IRR for log(1 + persons)</w:t>
+      </w:r>
+      <w:r>
+        <w:t xml:space="preserve"> </w:t>
+      </w:r>
+      <w:r>
+        <w:t xml:space="preserve">0.973 [0.968, 0.979]).</w:t>
+      </w:r>
+    </w:p>
+    <w:p>
+      <w:pPr>
+        <w:pStyle w:val="CSIRText"/>
+      </w:pPr>
+      <w:r>
+        <w:rPr>
+          <w:b/>
+          <w:bCs/>
+        </w:rPr>
+        <w:t xml:space="preserve">H3 (vivid colour): negligible, and in the opposite direction.</w:t>
+      </w:r>
+      <w:r>
+        <w:t xml:space="preserve"> </w:t>
+      </w:r>
+      <w:r>
+        <w:t xml:space="preserve">Conditional on the other</w:t>
+      </w:r>
+      <w:r>
+        <w:t xml:space="preserve"> </w:t>
+      </w:r>
+      <w:r>
+        <w:t xml:space="preserve">attributes, vivid colour is associated with</w:t>
+      </w:r>
+      <w:r>
+        <w:t xml:space="preserve"> </w:t>
+      </w:r>
+      <w:r>
+        <w:rPr>
+          <w:i/>
+          <w:iCs/>
+        </w:rPr>
+        <w:t xml:space="preserve">fewer</w:t>
+      </w:r>
+      <w:r>
+        <w:t xml:space="preserve"> </w:t>
+      </w:r>
+      <w:r>
+        <w:t xml:space="preserve">likes (IRR 0.977, 95% CI [0.974, 0.980]). The</w:t>
+      </w:r>
+      <w:r>
+        <w:t xml:space="preserve"> </w:t>
+      </w:r>
+      <w:r>
+        <w:t xml:space="preserve">one-sided test for a positive association is not significant (Holm p = 1.000). The 90% CI</w:t>
+      </w:r>
+      <w:r>
+        <w:t xml:space="preserve"> </w:t>
+      </w:r>
+      <w:r>
+        <w:t xml:space="preserve">[0.974, 0.979] lies inside the SESOI band and the Holm-adjusted TOST rejects (p = &lt; 0.001), so</w:t>
+      </w:r>
+      <w:r>
+        <w:t xml:space="preserve"> </w:t>
+      </w:r>
+      <w:r>
+        <w:t xml:space="preserve">any association is smaller than ±3% per SD.</w:t>
+      </w:r>
+    </w:p>
+    <w:p>
+      <w:pPr>
+        <w:pStyle w:val="CSIRText"/>
+      </w:pPr>
+      <w:r>
+        <w:rPr>
+          <w:b/>
+          <w:bCs/>
+        </w:rPr>
+        <w:t xml:space="preserve">H4 (within versus between accounts): negligible difference.</w:t>
+      </w:r>
+      <w:r>
+        <w:t xml:space="preserve"> </w:t>
+      </w:r>
+      <w:r>
+        <w:t xml:space="preserve">Between-account and</w:t>
+      </w:r>
+      <w:r>
+        <w:t xml:space="preserve"> </w:t>
+      </w:r>
+      <w:r>
+        <w:t xml:space="preserve">within-account aesthetic associations differ significantly (ratio 1.017, 95% CI [1.013, 1.022],</w:t>
+      </w:r>
+      <w:r>
+        <w:t xml:space="preserve"> </w:t>
+      </w:r>
+      <w:r>
+        <w:t xml:space="preserve">Holm p = &lt; 0.001), but the difference is practically negligible (90% CI [1.013, 1.021]; TOST Holm</w:t>
+      </w:r>
+      <w:r>
+        <w:t xml:space="preserve"> </w:t>
+      </w:r>
+      <w:r>
+        <w:t xml:space="preserve">p = &lt; 0.001). The within-account association alone is IRR 1.042 [1.039, 1.045], and</w:t>
+      </w:r>
+      <w:r>
+        <w:t xml:space="preserve"> </w:t>
+      </w:r>
+      <w:r>
+        <w:t xml:space="preserve">the implied between-account association is 1.060. Most of the aesthetic association</w:t>
+      </w:r>
+      <w:r>
+        <w:t xml:space="preserve"> </w:t>
+      </w:r>
+      <w:r>
+        <w:t xml:space="preserve">therefore holds</w:t>
+      </w:r>
+      <w:r>
+        <w:t xml:space="preserve"> </w:t>
+      </w:r>
+      <w:r>
+        <w:rPr>
+          <w:i/>
+          <w:iCs/>
+        </w:rPr>
+        <w:t xml:space="preserve">within</w:t>
+      </w:r>
+      <w:r>
+        <w:t xml:space="preserve"> </w:t>
+      </w:r>
+      <w:r>
+        <w:t xml:space="preserve">the same account: an account’s better-scored photographs earn more</w:t>
+      </w:r>
+      <w:r>
+        <w:t xml:space="preserve"> </w:t>
+      </w:r>
+      <w:r>
+        <w:t xml:space="preserve">likes per follower than its own weaker ones.</w:t>
+      </w:r>
+    </w:p>
+    <w:p>
+      <w:pPr>
+        <w:pStyle w:val="CSIRText"/>
+      </w:pPr>
+      <w:r>
+        <w:rPr>
+          <w:b/>
+          <w:bCs/>
+        </w:rPr>
+        <w:t xml:space="preserve">H5 (prediction): supported.</w:t>
+      </w:r>
+      <w:r>
+        <w:t xml:space="preserve"> </w:t>
+      </w:r>
+      <w:r>
+        <w:t xml:space="preserve">On 94,172 held-out accounts, adding the visual</w:t>
+      </w:r>
+      <w:r>
+        <w:t xml:space="preserve"> </w:t>
+      </w:r>
+      <w:r>
+        <w:t xml:space="preserve">features improves the joint log predictive score by 0.0160 nats per post (95% paired</w:t>
+      </w:r>
+      <w:r>
+        <w:t xml:space="preserve"> </w:t>
+      </w:r>
+      <w:r>
+        <w:t xml:space="preserve">bootstrap CI [0.0148, 0.0170]). That is a 1.61% gain in geometric-mean predictive probability. The</w:t>
+      </w:r>
+      <w:r>
+        <w:t xml:space="preserve"> </w:t>
+      </w:r>
+      <w:r>
+        <w:t xml:space="preserve">lower bound exceeds the pre-specified 0.01 threshold. The gain is the same in the test accounts</w:t>
+      </w:r>
+      <w:r>
+        <w:t xml:space="preserve"> </w:t>
+      </w:r>
+      <w:r>
+        <w:t xml:space="preserve">of both halves (0.0161 and 0.0159), with account weighting (0.0159), and with 60</w:t>
+      </w:r>
+      <w:r>
+        <w:t xml:space="preserve"> </w:t>
+      </w:r>
+      <w:r>
+        <w:t xml:space="preserve">quadrature nodes (0.0159). The rank correlation between predicted and observed likes per</w:t>
+      </w:r>
+      <w:r>
+        <w:t xml:space="preserve"> </w:t>
+      </w:r>
+      <w:r>
+        <w:t xml:space="preserve">recorded follower rises from 0.172 (controls only) to 0.254.</w:t>
+      </w:r>
+    </w:p>
+    <w:p>
+      <w:pPr>
+        <w:pStyle w:val="CSIRText"/>
+      </w:pPr>
+      <w:r>
+        <w:t xml:space="preserve">Verdicts are stable across practical thresholds (Table 4). H1 and H2 exceed even a ±5% band.</w:t>
+      </w:r>
+      <w:r>
+        <w:t xml:space="preserve"> </w:t>
+      </w:r>
+      <w:r>
+        <w:t xml:space="preserve">H3 and H4 are inside the band at ±3% and ±5%, but outside it at ±1%, so they are small rather</w:t>
+      </w:r>
+      <w:r>
+        <w:t xml:space="preserve"> </w:t>
+      </w:r>
+      <w:r>
+        <w:t xml:space="preserve">than exactly zero.</w:t>
+      </w:r>
+    </w:p>
+    <w:p>
+      <w:pPr>
+        <w:pStyle w:val="CSIRTableCaption"/>
+      </w:pPr>
+      <w:r>
+        <w:t xml:space="preserve">Table 4. SESOI sensitivity: whether the 95% CI lies entirely outside the band / the 90% CI lies entirely inside it.</w:t>
+      </w:r>
+    </w:p>
+    <w:tbl>
+      <w:tblPr>
+        <w:tblStyle w:val="Table"/>
+        <w:tblW w:type="auto" w:w="0"/>
+        <w:tblLook w:firstRow="1" w:lastRow="0" w:firstColumn="0" w:lastColumn="0" w:noHBand="0" w:noVBand="0" w:val="0020"/>
+        <w:tblCaption w:val="Table 4. SESOI sensitivity: whether the 95% CI lies entirely outside the band / the 90% CI lies entirely inside it."/>
+      </w:tblPr>
+      <w:tblGrid>
+        <w:gridCol w:w="1980"/>
+        <w:gridCol w:w="1980"/>
+        <w:gridCol w:w="1980"/>
+        <w:gridCol w:w="1980"/>
+      </w:tblGrid>
+      <w:tr>
+        <w:trPr>
+          <w:tblHeader w:val="on"/>
+        </w:trPr>
+        <w:tc>
+          <w:tcPr/>
+          <w:p>
+            <w:pPr>
+              <w:pStyle w:val="CSIRText"/>
+            </w:pPr>
+            <w:r>
+              <w:t xml:space="preserve">H</w:t>
+            </w:r>
+          </w:p>
+        </w:tc>
+        <w:tc>
+          <w:tcPr/>
+          <w:p>
+            <w:pPr>
+              <w:pStyle w:val="CSIRText"/>
+            </w:pPr>
+            <w:r>
+              <w:t xml:space="preserve">±1%: outside / inside</w:t>
+            </w:r>
+          </w:p>
+        </w:tc>
+        <w:tc>
+          <w:tcPr/>
+          <w:p>
+            <w:pPr>
+              <w:pStyle w:val="CSIRText"/>
+            </w:pPr>
+            <w:r>
+              <w:t xml:space="preserve">±3%</w:t>
+            </w:r>
+          </w:p>
+        </w:tc>
+        <w:tc>
+          <w:tcPr/>
+          <w:p>
+            <w:pPr>
+              <w:pStyle w:val="CSIRText"/>
+            </w:pPr>
+            <w:r>
+              <w:t xml:space="preserve">±5%</w:t>
+            </w:r>
+          </w:p>
+        </w:tc>
+      </w:tr>
+      <w:tr>
+        <w:tc>
+          <w:tcPr/>
+          <w:p>
+            <w:pPr>
+              <w:pStyle w:val="CSIRText"/>
+            </w:pPr>
+            <w:r>
+              <w:t xml:space="preserve">H1</w:t>
+            </w:r>
+          </w:p>
+        </w:tc>
+        <w:tc>
+          <w:tcPr/>
+          <w:p>
+            <w:pPr>
+              <w:pStyle w:val="CSIRText"/>
+            </w:pPr>
+            <w:r>
+              <w:t xml:space="preserve">yes / no</w:t>
+            </w:r>
+          </w:p>
+        </w:tc>
+        <w:tc>
+          <w:tcPr/>
+          <w:p>
+            <w:pPr>
+              <w:pStyle w:val="CSIRText"/>
+            </w:pPr>
+            <w:r>
+              <w:t xml:space="preserve">yes / no</w:t>
+            </w:r>
+          </w:p>
+        </w:tc>
+        <w:tc>
+          <w:tcPr/>
+          <w:p>
+            <w:pPr>
+              <w:pStyle w:val="CSIRText"/>
+            </w:pPr>
+            <w:r>
+              <w:t xml:space="preserve">yes / no</w:t>
+            </w:r>
+          </w:p>
+        </w:tc>
+      </w:tr>
+      <w:tr>
+        <w:tc>
+          <w:tcPr/>
+          <w:p>
+            <w:pPr>
+              <w:pStyle w:val="CSIRText"/>
+            </w:pPr>
+            <w:r>
+              <w:t xml:space="preserve">H2</w:t>
+            </w:r>
+          </w:p>
+        </w:tc>
+        <w:tc>
+          <w:tcPr/>
+          <w:p>
+            <w:pPr>
+              <w:pStyle w:val="CSIRText"/>
+            </w:pPr>
+            <w:r>
+              <w:t xml:space="preserve">yes / no</w:t>
+            </w:r>
+          </w:p>
+        </w:tc>
+        <w:tc>
+          <w:tcPr/>
+          <w:p>
+            <w:pPr>
+              <w:pStyle w:val="CSIRText"/>
+            </w:pPr>
+            <w:r>
+              <w:t xml:space="preserve">yes / no</w:t>
+            </w:r>
+          </w:p>
+        </w:tc>
+        <w:tc>
+          <w:tcPr/>
+          <w:p>
+            <w:pPr>
+              <w:pStyle w:val="CSIRText"/>
+            </w:pPr>
+            <w:r>
+              <w:t xml:space="preserve">yes / no</w:t>
+            </w:r>
+          </w:p>
+        </w:tc>
+      </w:tr>
+      <w:tr>
+        <w:tc>
+          <w:tcPr/>
+          <w:p>
+            <w:pPr>
+              <w:pStyle w:val="CSIRText"/>
+            </w:pPr>
+            <w:r>
+              <w:t xml:space="preserve">H3</w:t>
+            </w:r>
+          </w:p>
+        </w:tc>
+        <w:tc>
+          <w:tcPr/>
+          <w:p>
+            <w:pPr>
+              <w:pStyle w:val="CSIRText"/>
+            </w:pPr>
+            <w:r>
+              <w:t xml:space="preserve">yes / no</w:t>
+            </w:r>
+          </w:p>
+        </w:tc>
+        <w:tc>
+          <w:tcPr/>
+          <w:p>
+            <w:pPr>
+              <w:pStyle w:val="CSIRText"/>
+            </w:pPr>
+            <w:r>
+              <w:t xml:space="preserve">no / yes</w:t>
+            </w:r>
+          </w:p>
+        </w:tc>
+        <w:tc>
+          <w:tcPr/>
+          <w:p>
+            <w:pPr>
+              <w:pStyle w:val="CSIRText"/>
+            </w:pPr>
+            <w:r>
+              <w:t xml:space="preserve">no / yes</w:t>
+            </w:r>
+          </w:p>
+        </w:tc>
+      </w:tr>
+      <w:tr>
+        <w:tc>
+          <w:tcPr/>
+          <w:p>
+            <w:pPr>
+              <w:pStyle w:val="CSIRText"/>
+            </w:pPr>
+            <w:r>
+              <w:t xml:space="preserve">H4</w:t>
+            </w:r>
+          </w:p>
+        </w:tc>
+        <w:tc>
+          <w:tcPr/>
+          <w:p>
+            <w:pPr>
+              <w:pStyle w:val="CSIRText"/>
+            </w:pPr>
+            <w:r>
+              <w:t xml:space="preserve">yes / no</w:t>
+            </w:r>
+          </w:p>
+        </w:tc>
+        <w:tc>
+          <w:tcPr/>
+          <w:p>
+            <w:pPr>
+              <w:pStyle w:val="CSIRText"/>
+            </w:pPr>
+            <w:r>
+              <w:t xml:space="preserve">no / yes</w:t>
+            </w:r>
+          </w:p>
+        </w:tc>
+        <w:tc>
+          <w:tcPr/>
+          <w:p>
+            <w:pPr>
+              <w:pStyle w:val="CSIRText"/>
+            </w:pPr>
+            <w:r>
+              <w:t xml:space="preserve">no / yes</w:t>
+            </w:r>
+          </w:p>
+        </w:tc>
+      </w:tr>
+    </w:tbl>
+    <w:bookmarkEnd w:id="59"/>
+    <w:bookmarkStart w:id="69" w:name="Xc42b6dbae5e5514f8dc4211996bc93961baee49"/>
+    <w:p>
+      <w:pPr>
+        <w:pStyle w:val="CSIRSubSection"/>
+      </w:pPr>
+      <w:r>
+        <w:t xml:space="preserve">Exploratory results: attributes, content, and framing</w:t>
+      </w:r>
+    </w:p>
+    <w:p>
+      <w:pPr>
+        <w:pStyle w:val="CSIRText"/>
+      </w:pPr>
+      <w:r>
+        <w:t xml:space="preserve">Figure 9 shows all visual terms of M2. Beyond the confirmatory terms, the content attribute</w:t>
+      </w:r>
+      <w:r>
+        <w:t xml:space="preserve"> </w:t>
+      </w:r>
+      <w:r>
+        <w:t xml:space="preserve">(1.036 [1.031, 1.040]) is the only aesthetic attribute whose interval lies above the</w:t>
+      </w:r>
+      <w:r>
+        <w:t xml:space="preserve"> </w:t>
+      </w:r>
+      <w:r>
+        <w:t xml:space="preserve">SESOI band. Lighting (1.021 [1.017, 1.025]) and rule of thirds (1.020 [1.017, 1.022]) are</w:t>
+      </w:r>
+      <w:r>
+        <w:t xml:space="preserve"> </w:t>
+      </w:r>
+      <w:r>
+        <w:t xml:space="preserve">positive but straddle the band. Object emphasis (0.987 [0.984, 0.991]) is slightly negative,</w:t>
+      </w:r>
+      <w:r>
+        <w:t xml:space="preserve"> </w:t>
+      </w:r>
+      <w:r>
+        <w:t xml:space="preserve">and depth of field (1.001 [0.998, 1.003]) is null. The attributes are correlated (Figure 5), so</w:t>
+      </w:r>
+      <w:r>
+        <w:t xml:space="preserve"> </w:t>
+      </w:r>
+      <w:r>
+        <w:t xml:space="preserve">these are conditional associations and should not be read as independent levers.</w:t>
+      </w:r>
+    </w:p>
+    <w:p>
+      <w:pPr>
+        <w:pStyle w:val="CaptionedFigure"/>
+      </w:pPr>
+      <w:r>
+        <w:drawing>
+          <wp:inline>
+            <wp:extent cx="3017520" cy="3195021"/>
+            <wp:effectExtent b="0" l="0" r="0" t="0"/>
+            <wp:docPr descr="Figure 9. Visual terms of M2 (IRR per training SD for attributes). Grey band: SESOI." title="" id="61" name="Picture"/>
+            <a:graphic>
+              <a:graphicData uri="http://schemas.openxmlformats.org/drawingml/2006/picture">
+                <pic:pic>
+                  <pic:nvPicPr>
+                    <pic:cNvPr descr="outputs/figures/fig2_m2_visual_irr.png" id="62" name="Picture"/>
+                    <pic:cNvPicPr>
+                      <a:picLocks noChangeArrowheads="1" noChangeAspect="1"/>
+                    </pic:cNvPicPr>
+                  </pic:nvPicPr>
+                  <pic:blipFill>
+                    <a:blip r:embed="rId60"/>
+                    <a:stretch>
+                      <a:fillRect/>
+                    </a:stretch>
+                  </pic:blipFill>
+                  <pic:spPr bwMode="auto">
+                    <a:xfrm>
+                      <a:off x="0" y="0"/>
+                      <a:ext cx="3017520" cy="3195021"/>
+                    </a:xfrm>
+                    <a:prstGeom prst="rect">
+                      <a:avLst/>
+                    </a:prstGeom>
+                    <a:noFill/>
+                    <a:ln w="9525">
+                      <a:noFill/>
+                      <a:headEnd/>
+                      <a:tailEnd/>
+                    </a:ln>
+                  </pic:spPr>
+                </pic:pic>
+              </a:graphicData>
+            </a:graphic>
+          </wp:inline>
+        </w:drawing>
+      </w:r>
+    </w:p>
+    <w:p>
+      <w:pPr>
+        <w:pStyle w:val="CSIRCaptionFigure"/>
+      </w:pPr>
+      <w:r>
+        <w:t xml:space="preserve">Figure 9. Visual terms of M2 (IRR per training SD for attributes). Grey band: SESOI.</w:t>
+      </w:r>
+    </w:p>
+    <w:p>
+      <w:pPr>
+        <w:pStyle w:val="CSIRText"/>
+      </w:pPr>
+      <w:r>
+        <w:t xml:space="preserve">Framing and genre matter more than any single aesthetic attribute (Figure 10). Relative to</w:t>
+      </w:r>
+      <w:r>
+        <w:t xml:space="preserve"> </w:t>
+      </w:r>
+      <w:r>
+        <w:t xml:space="preserve">medium shots, close-ups (0.862 [0.851, 0.872]), point-of-view shots</w:t>
+      </w:r>
+      <w:r>
+        <w:t xml:space="preserve"> </w:t>
+      </w:r>
+      <w:r>
+        <w:t xml:space="preserve">(0.871 [0.860, 0.882]), and aerial shots (0.887 [0.873, 0.900])</w:t>
+      </w:r>
+      <w:r>
+        <w:t xml:space="preserve"> </w:t>
+      </w:r>
+      <w:r>
+        <w:t xml:space="preserve">receive 11-14% fewer likes per recorded follower. Portraits are the only shot scale above the</w:t>
+      </w:r>
+      <w:r>
+        <w:t xml:space="preserve"> </w:t>
+      </w:r>
+      <w:r>
+        <w:t xml:space="preserve">reference (1.020 [1.011, 1.030]). Among image categories, sport</w:t>
+      </w:r>
+      <w:r>
+        <w:t xml:space="preserve"> </w:t>
+      </w:r>
+      <w:r>
+        <w:t xml:space="preserve">(1.135 [1.115, 1.154]), art (1.124 [1.105, 1.143]), fashion</w:t>
+      </w:r>
+      <w:r>
+        <w:t xml:space="preserve"> </w:t>
+      </w:r>
+      <w:r>
+        <w:t xml:space="preserve">(1.099 [1.084, 1.114]), and animals (1.095 [1.077, 1.114]) are above the</w:t>
+      </w:r>
+      <w:r>
+        <w:t xml:space="preserve"> </w:t>
+      </w:r>
+      <w:r>
+        <w:t xml:space="preserve">lifestyle reference. Text images (0.905 [0.890, 0.921]) and brand imagery</w:t>
+      </w:r>
+      <w:r>
+        <w:t xml:space="preserve"> </w:t>
+      </w:r>
+      <w:r>
+        <w:t xml:space="preserve">(0.916 [0.902, 0.930]) are below it. Among the controls, business accounts receive fewer</w:t>
+      </w:r>
+      <w:r>
+        <w:t xml:space="preserve"> </w:t>
+      </w:r>
+      <w:r>
+        <w:t xml:space="preserve">likes per recorded follower (0.820 [0.815, 0.826]), as do captions with more mentions</w:t>
+      </w:r>
+      <w:r>
+        <w:t xml:space="preserve"> </w:t>
+      </w:r>
+      <w:r>
+        <w:t xml:space="preserve">(0.901 [0.896, 0.906] per log unit).</w:t>
+      </w:r>
+    </w:p>
+    <w:p>
+      <w:pPr>
+        <w:pStyle w:val="CaptionedFigure"/>
+      </w:pPr>
+      <w:r>
+        <w:drawing>
+          <wp:inline>
+            <wp:extent cx="3017520" cy="4615030"/>
+            <wp:effectExtent b="0" l="0" r="0" t="0"/>
+            <wp:docPr descr="Figure 10. Shot-scale and image-category terms of M2 (IRR against medium shot and lifestyle)." title="" id="64" name="Picture"/>
+            <a:graphic>
+              <a:graphicData uri="http://schemas.openxmlformats.org/drawingml/2006/picture">
+                <pic:pic>
+                  <pic:nvPicPr>
+                    <pic:cNvPr descr="outputs/figures/fig3_m2_categories_irr.png" id="65" name="Picture"/>
+                    <pic:cNvPicPr>
+                      <a:picLocks noChangeArrowheads="1" noChangeAspect="1"/>
+                    </pic:cNvPicPr>
+                  </pic:nvPicPr>
+                  <pic:blipFill>
+                    <a:blip r:embed="rId63"/>
+                    <a:stretch>
+                      <a:fillRect/>
+                    </a:stretch>
+                  </pic:blipFill>
+                  <pic:spPr bwMode="auto">
+                    <a:xfrm>
+                      <a:off x="0" y="0"/>
+                      <a:ext cx="3017520" cy="4615030"/>
+                    </a:xfrm>
+                    <a:prstGeom prst="rect">
+                      <a:avLst/>
+                    </a:prstGeom>
+                    <a:noFill/>
+                    <a:ln w="9525">
+                      <a:noFill/>
+                      <a:headEnd/>
+                      <a:tailEnd/>
+                    </a:ln>
+                  </pic:spPr>
+                </pic:pic>
+              </a:graphicData>
+            </a:graphic>
+          </wp:inline>
+        </w:drawing>
+      </w:r>
+    </w:p>
+    <w:p>
+      <w:pPr>
+        <w:pStyle w:val="CSIRCaptionFigure"/>
+      </w:pPr>
+      <w:r>
+        <w:t xml:space="preserve">Figure 10. Shot-scale and image-category terms of M2 (IRR against medium shot and lifestyle).</w:t>
+      </w:r>
+    </w:p>
+    <w:p>
+      <w:pPr>
+        <w:pStyle w:val="CSIRText"/>
+      </w:pPr>
+      <w:r>
+        <w:t xml:space="preserve">Internal replication extends beyond the confirmatory terms. Across all visual terms of M2, the</w:t>
+      </w:r>
+      <w:r>
+        <w:t xml:space="preserve"> </w:t>
+      </w:r>
+      <w:r>
+        <w:t xml:space="preserve">log-IRRs estimated in half A and half B correlate at 0.98 (Figure 11).</w:t>
+      </w:r>
+    </w:p>
+    <w:p>
+      <w:pPr>
+        <w:pStyle w:val="CaptionedFigure"/>
+      </w:pPr>
+      <w:r>
+        <w:drawing>
+          <wp:inline>
+            <wp:extent cx="3017520" cy="2840018"/>
+            <wp:effectExtent b="0" l="0" r="0" t="0"/>
+            <wp:docPr descr="Figure 11. Replication of all M2 visual terms across disjoint halves of accounts." title="" id="67" name="Picture"/>
+            <a:graphic>
+              <a:graphicData uri="http://schemas.openxmlformats.org/drawingml/2006/picture">
+                <pic:pic>
+                  <pic:nvPicPr>
+                    <pic:cNvPr descr="outputs/figures/fig4_replication.png" id="68" name="Picture"/>
+                    <pic:cNvPicPr>
+                      <a:picLocks noChangeArrowheads="1" noChangeAspect="1"/>
+                    </pic:cNvPicPr>
+                  </pic:nvPicPr>
+                  <pic:blipFill>
+                    <a:blip r:embed="rId66"/>
+                    <a:stretch>
+                      <a:fillRect/>
+                    </a:stretch>
+                  </pic:blipFill>
+                  <pic:spPr bwMode="auto">
+                    <a:xfrm>
+                      <a:off x="0" y="0"/>
+                      <a:ext cx="3017520" cy="2840018"/>
+                    </a:xfrm>
+                    <a:prstGeom prst="rect">
+                      <a:avLst/>
+                    </a:prstGeom>
+                    <a:noFill/>
+                    <a:ln w="9525">
+                      <a:noFill/>
+                      <a:headEnd/>
+                      <a:tailEnd/>
+                    </a:ln>
+                  </pic:spPr>
+                </pic:pic>
+              </a:graphicData>
+            </a:graphic>
+          </wp:inline>
+        </w:drawing>
+      </w:r>
+    </w:p>
+    <w:p>
+      <w:pPr>
+        <w:pStyle w:val="CSIRCaptionFigure"/>
+      </w:pPr>
+      <w:r>
+        <w:t xml:space="preserve">Figure 11. Replication of all M2 visual terms across disjoint halves of accounts.</w:t>
+      </w:r>
+    </w:p>
+    <w:bookmarkEnd w:id="69"/>
+    <w:bookmarkStart w:id="73" w:name="robustness"/>
+    <w:p>
+      <w:pPr>
+        <w:pStyle w:val="CSIRSubSection"/>
+      </w:pPr>
+      <w:r>
+        <w:t xml:space="preserve">Robustness</w:t>
+      </w:r>
+    </w:p>
+    <w:p>
+      <w:pPr>
+        <w:pStyle w:val="CSIRText"/>
+      </w:pPr>
+      <w:r>
+        <w:t xml:space="preserve">Table 5 and Figure 12 report the focal estimates under each robustness specification.</w:t>
+      </w:r>
+      <w:r>
+        <w:t xml:space="preserve"> </w:t>
+      </w:r>
+      <w:r>
+        <w:t xml:space="preserve">Freeing the follower coefficient (R1) gives an elasticity of 0.629 [0.628, 0.631], well below</w:t>
+      </w:r>
+      <w:r>
+        <w:t xml:space="preserve"> </w:t>
+      </w:r>
+      <w:r>
+        <w:t xml:space="preserve">the value of 1 imposed by the offset. Likes grow less than proportionally with recorded</w:t>
+      </w:r>
+      <w:r>
+        <w:t xml:space="preserve"> </w:t>
+      </w:r>
+      <w:r>
+        <w:t xml:space="preserve">followers. Under R1 the aesthetic association becomes larger (1.086 [1.084, 1.088]),</w:t>
+      </w:r>
+      <w:r>
+        <w:t xml:space="preserve"> </w:t>
+      </w:r>
+      <w:r>
+        <w:t xml:space="preserve">so the offset specification is, if anything, conservative for H1. Restricting to multi-post</w:t>
+      </w:r>
+      <w:r>
+        <w:t xml:space="preserve"> </w:t>
+      </w:r>
+      <w:r>
+        <w:t xml:space="preserve">accounts (R4), where the account effect is identified from repeated posts, gives the same signs</w:t>
+      </w:r>
+      <w:r>
+        <w:t xml:space="preserve"> </w:t>
+      </w:r>
+      <w:r>
+        <w:t xml:space="preserve">and similar magnitudes: aesthetic 1.046 [1.043, 1.049], person</w:t>
+      </w:r>
+      <w:r>
+        <w:t xml:space="preserve"> </w:t>
+      </w:r>
+      <w:r>
+        <w:t xml:space="preserve">1.137 [1.126, 1.149], vivid colour 0.988 [0.984, 0.992]. [pending: model results]</w:t>
+      </w:r>
+    </w:p>
+    <w:p>
+      <w:pPr>
+        <w:pStyle w:val="CSIRTableCaption"/>
+      </w:pPr>
+      <w:r>
+        <w:t xml:space="preserve">Table 5. Focal estimates across robustness specifications (exploratory).</w:t>
+      </w:r>
+    </w:p>
+    <w:tbl>
+      <w:tblPr>
+        <w:tblStyle w:val="Table"/>
+        <w:tblW w:type="auto" w:w="0"/>
+        <w:tblLook w:firstRow="1" w:lastRow="0" w:firstColumn="0" w:lastColumn="0" w:noHBand="0" w:noVBand="0" w:val="0020"/>
+        <w:tblCaption w:val="Table 5. Focal estimates across robustness specifications (exploratory)."/>
+      </w:tblPr>
+      <w:tblGrid>
+        <w:gridCol w:w="1980"/>
+        <w:gridCol w:w="1980"/>
+        <w:gridCol w:w="1980"/>
+        <w:gridCol w:w="1980"/>
+      </w:tblGrid>
+      <w:tr>
+        <w:trPr>
+          <w:tblHeader w:val="on"/>
+        </w:trPr>
+        <w:tc>
+          <w:tcPr/>
+          <w:p>
+            <w:pPr>
+              <w:pStyle w:val="CSIRText"/>
+            </w:pPr>
+            <w:r>
+              <w:t xml:space="preserve">Term</w:t>
+            </w:r>
+          </w:p>
+        </w:tc>
+        <w:tc>
+          <w:tcPr/>
+          <w:p>
+            <w:pPr>
+              <w:pStyle w:val="CSIRText"/>
+            </w:pPr>
+            <w:r>
+              <w:t xml:space="preserve">Specification</w:t>
+            </w:r>
+          </w:p>
+        </w:tc>
+        <w:tc>
+          <w:tcPr/>
+          <w:p>
+            <w:pPr>
+              <w:pStyle w:val="CSIRText"/>
+            </w:pPr>
+            <w:r>
+              <w:t xml:space="preserve">IRR</w:t>
+            </w:r>
+          </w:p>
+        </w:tc>
+        <w:tc>
+          <w:tcPr/>
+          <w:p>
+            <w:pPr>
+              <w:pStyle w:val="CSIRText"/>
+            </w:pPr>
+            <w:r>
+              <w:t xml:space="preserve">95% CI</w:t>
+            </w:r>
+          </w:p>
+        </w:tc>
+      </w:tr>
+      <w:tr>
+        <w:tc>
+          <w:tcPr/>
+          <w:p>
+            <w:pPr>
+              <w:pStyle w:val="CSIRText"/>
+            </w:pPr>
+            <w:r>
+              <w:t xml:space="preserve">Person (H2)</w:t>
+            </w:r>
+          </w:p>
+        </w:tc>
+        <w:tc>
+          <w:tcPr/>
+          <w:p>
+            <w:pPr>
+              <w:pStyle w:val="CSIRText"/>
+            </w:pPr>
+            <w:r>
+              <w:t xml:space="preserve">Main</w:t>
+            </w:r>
+          </w:p>
+        </w:tc>
+        <w:tc>
+          <w:tcPr/>
+          <w:p>
+            <w:pPr>
+              <w:pStyle w:val="CSIRText"/>
+            </w:pPr>
+            <w:r>
+              <w:t xml:space="preserve">1.239</w:t>
+            </w:r>
+          </w:p>
+        </w:tc>
+        <w:tc>
+          <w:tcPr/>
+          <w:p>
+            <w:pPr>
+              <w:pStyle w:val="CSIRText"/>
+            </w:pPr>
+            <w:r>
+              <w:t xml:space="preserve">[1.230, 1.249]</w:t>
+            </w:r>
+          </w:p>
+        </w:tc>
+      </w:tr>
+      <w:tr>
+        <w:tc>
+          <w:tcPr/>
+          <w:p>
+            <w:pPr>
+              <w:pStyle w:val="CSIRText"/>
+            </w:pPr>
+            <w:r>
+              <w:t xml:space="preserve">Person (H2)</w:t>
+            </w:r>
+          </w:p>
+        </w:tc>
+        <w:tc>
+          <w:tcPr/>
+          <w:p>
+            <w:pPr>
+              <w:pStyle w:val="CSIRText"/>
+            </w:pPr>
+            <w:r>
+              <w:t xml:space="preserve">R4 ≥ 2 posts</w:t>
+            </w:r>
+          </w:p>
+        </w:tc>
+        <w:tc>
+          <w:tcPr/>
+          <w:p>
+            <w:pPr>
+              <w:pStyle w:val="CSIRText"/>
+            </w:pPr>
+            <w:r>
+              <w:t xml:space="preserve">1.137</w:t>
+            </w:r>
+          </w:p>
+        </w:tc>
+        <w:tc>
+          <w:tcPr/>
+          <w:p>
+            <w:pPr>
+              <w:pStyle w:val="CSIRText"/>
+            </w:pPr>
+            <w:r>
+              <w:t xml:space="preserve">[1.126, 1.149]</w:t>
+            </w:r>
+          </w:p>
+        </w:tc>
+      </w:tr>
+      <w:tr>
+        <w:tc>
+          <w:tcPr/>
+          <w:p>
+            <w:pPr>
+              <w:pStyle w:val="CSIRText"/>
+            </w:pPr>
+            <w:r>
+              <w:t xml:space="preserve">Aesthetic (H1)</w:t>
+            </w:r>
+          </w:p>
+        </w:tc>
+        <w:tc>
+          <w:tcPr/>
+          <w:p>
+            <w:pPr>
+              <w:pStyle w:val="CSIRText"/>
+            </w:pPr>
+            <w:r>
+              <w:t xml:space="preserve">Main</w:t>
+            </w:r>
+          </w:p>
+        </w:tc>
+        <w:tc>
+          <w:tcPr/>
+          <w:p>
+            <w:pPr>
+              <w:pStyle w:val="CSIRText"/>
+            </w:pPr>
+            <w:r>
+              <w:t xml:space="preserve">1.057</w:t>
+            </w:r>
+          </w:p>
+        </w:tc>
+        <w:tc>
+          <w:tcPr/>
+          <w:p>
+            <w:pPr>
+              <w:pStyle w:val="CSIRText"/>
+            </w:pPr>
+            <w:r>
+              <w:t xml:space="preserve">[1.055, 1.059]</w:t>
+            </w:r>
+          </w:p>
+        </w:tc>
+      </w:tr>
+      <w:tr>
+        <w:tc>
+          <w:tcPr/>
+          <w:p>
+            <w:pPr>
+              <w:pStyle w:val="CSIRText"/>
+            </w:pPr>
+            <w:r>
+              <w:t xml:space="preserve">Aesthetic (H1)</w:t>
+            </w:r>
+          </w:p>
+        </w:tc>
+        <w:tc>
+          <w:tcPr/>
+          <w:p>
+            <w:pPr>
+              <w:pStyle w:val="CSIRText"/>
+            </w:pPr>
+            <w:r>
+              <w:t xml:space="preserve">R1 followers free</w:t>
+            </w:r>
+          </w:p>
+        </w:tc>
+        <w:tc>
+          <w:tcPr/>
+          <w:p>
+            <w:pPr>
+              <w:pStyle w:val="CSIRText"/>
+            </w:pPr>
+            <w:r>
+              <w:t xml:space="preserve">1.086</w:t>
+            </w:r>
+          </w:p>
+        </w:tc>
+        <w:tc>
+          <w:tcPr/>
+          <w:p>
+            <w:pPr>
+              <w:pStyle w:val="CSIRText"/>
+            </w:pPr>
+            <w:r>
+              <w:t xml:space="preserve">[1.084, 1.088]</w:t>
+            </w:r>
+          </w:p>
+        </w:tc>
+      </w:tr>
+      <w:tr>
+        <w:tc>
+          <w:tcPr/>
+          <w:p>
+            <w:pPr>
+              <w:pStyle w:val="CSIRText"/>
+            </w:pPr>
+            <w:r>
+              <w:t xml:space="preserve">Aesthetic (H1)</w:t>
+            </w:r>
+          </w:p>
+        </w:tc>
+        <w:tc>
+          <w:tcPr/>
+          <w:p>
+            <w:pPr>
+              <w:pStyle w:val="CSIRText"/>
+            </w:pPr>
+            <w:r>
+              <w:t xml:space="preserve">R4 ≥ 2 posts</w:t>
+            </w:r>
+          </w:p>
+        </w:tc>
+        <w:tc>
+          <w:tcPr/>
+          <w:p>
+            <w:pPr>
+              <w:pStyle w:val="CSIRText"/>
+            </w:pPr>
+            <w:r>
+              <w:t xml:space="preserve">1.046</w:t>
+            </w:r>
+          </w:p>
+        </w:tc>
+        <w:tc>
+          <w:tcPr/>
+          <w:p>
+            <w:pPr>
+              <w:pStyle w:val="CSIRText"/>
+            </w:pPr>
+            <w:r>
+              <w:t xml:space="preserve">[1.043, 1.049]</w:t>
+            </w:r>
+          </w:p>
+        </w:tc>
+      </w:tr>
+      <w:tr>
+        <w:tc>
+          <w:tcPr/>
+          <w:p>
+            <w:pPr>
+              <w:pStyle w:val="CSIRText"/>
+            </w:pPr>
+            <w:r>
+              <w:t xml:space="preserve">Vivid colour (H3)</w:t>
+            </w:r>
+          </w:p>
+        </w:tc>
+        <w:tc>
+          <w:tcPr/>
+          <w:p>
+            <w:pPr>
+              <w:pStyle w:val="CSIRText"/>
+            </w:pPr>
+            <w:r>
+              <w:t xml:space="preserve">Main</w:t>
+            </w:r>
+          </w:p>
+        </w:tc>
+        <w:tc>
+          <w:tcPr/>
+          <w:p>
+            <w:pPr>
+              <w:pStyle w:val="CSIRText"/>
+            </w:pPr>
+            <w:r>
+              <w:t xml:space="preserve">0.977</w:t>
+            </w:r>
+          </w:p>
+        </w:tc>
+        <w:tc>
+          <w:tcPr/>
+          <w:p>
+            <w:pPr>
+              <w:pStyle w:val="CSIRText"/>
+            </w:pPr>
+            <w:r>
+              <w:t xml:space="preserve">[0.974, 0.980]</w:t>
+            </w:r>
+          </w:p>
+        </w:tc>
+      </w:tr>
+      <w:tr>
+        <w:tc>
+          <w:tcPr/>
+          <w:p>
+            <w:pPr>
+              <w:pStyle w:val="CSIRText"/>
+            </w:pPr>
+            <w:r>
+              <w:t xml:space="preserve">Vivid colour (H3)</w:t>
+            </w:r>
+          </w:p>
+        </w:tc>
+        <w:tc>
+          <w:tcPr/>
+          <w:p>
+            <w:pPr>
+              <w:pStyle w:val="CSIRText"/>
+            </w:pPr>
+            <w:r>
+              <w:t xml:space="preserve">R4 ≥ 2 posts</w:t>
+            </w:r>
+          </w:p>
+        </w:tc>
+        <w:tc>
+          <w:tcPr/>
+          <w:p>
+            <w:pPr>
+              <w:pStyle w:val="CSIRText"/>
+            </w:pPr>
+            <w:r>
+              <w:t xml:space="preserve">0.988</w:t>
+            </w:r>
+          </w:p>
+        </w:tc>
+        <w:tc>
+          <w:tcPr/>
+          <w:p>
+            <w:pPr>
+              <w:pStyle w:val="CSIRText"/>
+            </w:pPr>
+            <w:r>
+              <w:t xml:space="preserve">[0.984, 0.992]</w:t>
+            </w:r>
+          </w:p>
+        </w:tc>
+      </w:tr>
+    </w:tbl>
+    <w:p>
+      <w:pPr>
+        <w:pStyle w:val="CaptionedFigure"/>
+      </w:pPr>
+      <w:r>
+        <w:drawing>
+          <wp:inline>
+            <wp:extent cx="3017520" cy="4437529"/>
+            <wp:effectExtent b="0" l="0" r="0" t="0"/>
+            <wp:docPr descr="Figure 12. Focal estimates across robustness specifications. Grey band: SESOI." title="" id="71" name="Picture"/>
+            <a:graphic>
+              <a:graphicData uri="http://schemas.openxmlformats.org/drawingml/2006/picture">
+                <pic:pic>
+                  <pic:nvPicPr>
+                    <pic:cNvPr descr="outputs/figures/fig7_robustness.png" id="72" name="Picture"/>
+                    <pic:cNvPicPr>
+                      <a:picLocks noChangeArrowheads="1" noChangeAspect="1"/>
+                    </pic:cNvPicPr>
+                  </pic:nvPicPr>
+                  <pic:blipFill>
+                    <a:blip r:embed="rId70"/>
+                    <a:stretch>
+                      <a:fillRect/>
+                    </a:stretch>
+                  </pic:blipFill>
+                  <pic:spPr bwMode="auto">
+                    <a:xfrm>
+                      <a:off x="0" y="0"/>
+                      <a:ext cx="3017520" cy="4437529"/>
+                    </a:xfrm>
+                    <a:prstGeom prst="rect">
+                      <a:avLst/>
+                    </a:prstGeom>
+                    <a:noFill/>
+                    <a:ln w="9525">
+                      <a:noFill/>
+                      <a:headEnd/>
+                      <a:tailEnd/>
+                    </a:ln>
+                  </pic:spPr>
+                </pic:pic>
+              </a:graphicData>
+            </a:graphic>
+          </wp:inline>
+        </w:drawing>
+      </w:r>
+    </w:p>
+    <w:p>
+      <w:pPr>
+        <w:pStyle w:val="CSIRCaptionFigure"/>
+      </w:pPr>
+      <w:r>
+        <w:t xml:space="preserve">Figure 12. Focal estimates across robustness specifications. Grey band: SESOI.</w:t>
+      </w:r>
+    </w:p>
+    <w:bookmarkEnd w:id="73"/>
+    <w:bookmarkStart w:id="80" w:name="model-adequacy-and-calibration"/>
+    <w:p>
+      <w:pPr>
+        <w:pStyle w:val="CSIRSubSection"/>
+      </w:pPr>
+      <w:r>
+        <w:t xml:space="preserve">Model adequacy and calibration</w:t>
+      </w:r>
+    </w:p>
+    <w:p>
+      <w:pPr>
+        <w:pStyle w:val="CSIRText"/>
+      </w:pPr>
+      <w:r>
+        <w:t xml:space="preserve">Models M1 did not pass the convergence checks and are not used for confirmatory verdicts. The NB2 dispersion and the account SD are similar across models</w:t>
+      </w:r>
+      <w:r>
+        <w:t xml:space="preserve"> </w:t>
+      </w:r>
+      <w:r>
+        <w:t xml:space="preserve">(Table 7). In the main model M2,</w:t>
+      </w:r>
+      <w:r>
+        <w:t xml:space="preserve"> </w:t>
+      </w:r>
+      <m:oMath>
+        <m:acc>
+          <m:accPr>
+            <m:chr m:val="̂"/>
+          </m:accPr>
+          <m:e>
+            <m:r>
+              <m:t>θ</m:t>
+            </m:r>
+          </m:e>
+        </m:acc>
+      </m:oMath>
+      <w:r>
+        <w:t xml:space="preserve"> </w:t>
+      </w:r>
+      <w:r>
+        <w:t xml:space="preserve">= 6.110 and</w:t>
+      </w:r>
+      <w:r>
+        <w:t xml:space="preserve"> </w:t>
+      </w:r>
+      <m:oMath>
+        <m:sSub>
+          <m:e>
+            <m:acc>
+              <m:accPr>
+                <m:chr m:val="̂"/>
+              </m:accPr>
+              <m:e>
+                <m:r>
+                  <m:t>σ</m:t>
+                </m:r>
+              </m:e>
+            </m:acc>
+          </m:e>
+          <m:sub>
+            <m:r>
+              <m:t>u</m:t>
+            </m:r>
+          </m:sub>
+        </m:sSub>
+      </m:oMath>
+      <w:r>
+        <w:t xml:space="preserve"> </w:t>
+      </w:r>
+      <w:r>
+        <w:t xml:space="preserve">= 0.900. On</w:t>
+      </w:r>
+      <w:r>
+        <w:t xml:space="preserve"> </w:t>
+      </w:r>
+      <w:r>
+        <w:t xml:space="preserve">multi-post accounts only (R4),</w:t>
+      </w:r>
+      <w:r>
+        <w:t xml:space="preserve"> </w:t>
+      </w:r>
+      <m:oMath>
+        <m:sSub>
+          <m:e>
+            <m:acc>
+              <m:accPr>
+                <m:chr m:val="̂"/>
+              </m:accPr>
+              <m:e>
+                <m:r>
+                  <m:t>σ</m:t>
+                </m:r>
+              </m:e>
+            </m:acc>
+          </m:e>
+          <m:sub>
+            <m:r>
+              <m:t>u</m:t>
+            </m:r>
+          </m:sub>
+        </m:sSub>
+      </m:oMath>
+      <w:r>
+        <w:t xml:space="preserve"> </w:t>
+      </w:r>
+      <w:r>
+        <w:t xml:space="preserve">= 1.014, so the account variance is not an</w:t>
+      </w:r>
+      <w:r>
+        <w:t xml:space="preserve"> </w:t>
+      </w:r>
+      <w:r>
+        <w:t xml:space="preserve">artefact of single-post accounts. Calibration on held-out accounts is adequate but not perfect</w:t>
+      </w:r>
+      <w:r>
+        <w:t xml:space="preserve"> </w:t>
+      </w:r>
+      <w:r>
+        <w:t xml:space="preserve">(Table 6, Figure 13). Central 50% and 90% prediction intervals cover 0.515 and</w:t>
+      </w:r>
+      <w:r>
+        <w:t xml:space="preserve"> </w:t>
+      </w:r>
+      <w:r>
+        <w:t xml:space="preserve">0.903 of observations for M2 (0.509 and 0.904 for M0). Both PIT</w:t>
+      </w:r>
+      <w:r>
+        <w:t xml:space="preserve"> </w:t>
+      </w:r>
+      <w:r>
+        <w:t xml:space="preserve">histograms show the same mild excess of observations below the predictive distribution and a</w:t>
+      </w:r>
+      <w:r>
+        <w:t xml:space="preserve"> </w:t>
+      </w:r>
+      <w:r>
+        <w:t xml:space="preserve">deficit in the extreme upper tail. Calibration is nearly identical for M0 and M2, so the H5 gain</w:t>
+      </w:r>
+      <w:r>
+        <w:t xml:space="preserve"> </w:t>
+      </w:r>
+      <w:r>
+        <w:t xml:space="preserve">reflects sharper predictions rather than a calibration difference. Conditional randomised</w:t>
+      </w:r>
+      <w:r>
+        <w:t xml:space="preserve"> </w:t>
+      </w:r>
+      <w:r>
+        <w:t xml:space="preserve">quantile residuals [28] are under-dispersed (Figure 14). This is expected when the predicted</w:t>
+      </w:r>
+      <w:r>
+        <w:t xml:space="preserve"> </w:t>
+      </w:r>
+      <w:r>
+        <w:t xml:space="preserve">account effect absorbs the single post of most accounts, so the held-out PIT is the more</w:t>
+      </w:r>
+      <w:r>
+        <w:t xml:space="preserve"> </w:t>
+      </w:r>
+      <w:r>
+        <w:t xml:space="preserve">informative check.</w:t>
+      </w:r>
+    </w:p>
+    <w:p>
+      <w:pPr>
+        <w:pStyle w:val="CSIRTableCaption"/>
+      </w:pPr>
+      <w:r>
+        <w:t xml:space="preserve">Table 6. Calibration on held-out accounts (single-post marginal predictive distributions).</w:t>
+      </w:r>
+    </w:p>
+    <w:tbl>
+      <w:tblPr>
+        <w:tblStyle w:val="Table"/>
+        <w:tblW w:type="auto" w:w="0"/>
+        <w:tblLook w:firstRow="1" w:lastRow="0" w:firstColumn="0" w:lastColumn="0" w:noHBand="0" w:noVBand="0" w:val="0020"/>
+        <w:tblCaption w:val="Table 6. Calibration on held-out accounts (single-post marginal predictive distributions)."/>
+      </w:tblPr>
+      <w:tblGrid>
+        <w:gridCol w:w="1320"/>
+        <w:gridCol w:w="1320"/>
+        <w:gridCol w:w="1320"/>
+        <w:gridCol w:w="1320"/>
+        <w:gridCol w:w="1320"/>
+        <w:gridCol w:w="1320"/>
+      </w:tblGrid>
+      <w:tr>
+        <w:trPr>
+          <w:tblHeader w:val="on"/>
+        </w:trPr>
+        <w:tc>
+          <w:tcPr/>
+          <w:p>
+            <w:pPr>
+              <w:pStyle w:val="CSIRText"/>
+            </w:pPr>
+            <w:r>
+              <w:t xml:space="preserve">Model</w:t>
+            </w:r>
+          </w:p>
+        </w:tc>
+        <w:tc>
+          <w:tcPr/>
+          <w:p>
+            <w:pPr>
+              <w:pStyle w:val="CSIRText"/>
+            </w:pPr>
+            <w:r>
+              <w:t xml:space="preserve">Coverage 50%</w:t>
+            </w:r>
+          </w:p>
+        </w:tc>
+        <w:tc>
+          <w:tcPr/>
+          <w:p>
+            <w:pPr>
+              <w:pStyle w:val="CSIRText"/>
+            </w:pPr>
+            <w:r>
+              <w:t xml:space="preserve">Coverage 90%</w:t>
+            </w:r>
+          </w:p>
+        </w:tc>
+        <w:tc>
+          <w:tcPr/>
+          <w:p>
+            <w:pPr>
+              <w:pStyle w:val="CSIRText"/>
+            </w:pPr>
+            <w:r>
+              <w:t xml:space="preserve">PIT mean</w:t>
+            </w:r>
+          </w:p>
+        </w:tc>
+        <w:tc>
+          <w:tcPr/>
+          <w:p>
+            <w:pPr>
+              <w:pStyle w:val="CSIRText"/>
+            </w:pPr>
+            <w:r>
+              <w:t xml:space="preserve">PIT SD</w:t>
+            </w:r>
+          </w:p>
+        </w:tc>
+        <w:tc>
+          <w:tcPr/>
+          <w:p>
+            <w:pPr>
+              <w:pStyle w:val="CSIRText"/>
+            </w:pPr>
+            <w:r>
+              <w:t xml:space="preserve">KS D</w:t>
+            </w:r>
+          </w:p>
+        </w:tc>
+      </w:tr>
+      <w:tr>
+        <w:tc>
+          <w:tcPr/>
+          <w:p>
+            <w:pPr>
+              <w:pStyle w:val="CSIRText"/>
+            </w:pPr>
+            <w:r>
+              <w:t xml:space="preserve">M0</w:t>
+            </w:r>
+          </w:p>
+        </w:tc>
+        <w:tc>
+          <w:tcPr/>
+          <w:p>
+            <w:pPr>
+              <w:pStyle w:val="CSIRText"/>
+            </w:pPr>
+            <w:r>
+              <w:t xml:space="preserve">0.509</w:t>
+            </w:r>
+          </w:p>
+        </w:tc>
+        <w:tc>
+          <w:tcPr/>
+          <w:p>
+            <w:pPr>
+              <w:pStyle w:val="CSIRText"/>
+            </w:pPr>
+            <w:r>
+              <w:t xml:space="preserve">0.904</w:t>
+            </w:r>
+          </w:p>
+        </w:tc>
+        <w:tc>
+          <w:tcPr/>
+          <w:p>
+            <w:pPr>
+              <w:pStyle w:val="CSIRText"/>
+            </w:pPr>
+            <w:r>
+              <w:t xml:space="preserve">0.503</w:t>
+            </w:r>
+          </w:p>
+        </w:tc>
+        <w:tc>
+          <w:tcPr/>
+          <w:p>
+            <w:pPr>
+              <w:pStyle w:val="CSIRText"/>
+            </w:pPr>
+            <w:r>
+              <w:t xml:space="preserve">0.285</w:t>
+            </w:r>
+          </w:p>
+        </w:tc>
+        <w:tc>
+          <w:tcPr/>
+          <w:p>
+            <w:pPr>
+              <w:pStyle w:val="CSIRText"/>
+            </w:pPr>
+            <w:r>
+              <w:t xml:space="preserve">0.031</w:t>
+            </w:r>
+          </w:p>
+        </w:tc>
+      </w:tr>
+      <w:tr>
+        <w:tc>
+          <w:tcPr/>
+          <w:p>
+            <w:pPr>
+              <w:pStyle w:val="CSIRText"/>
+            </w:pPr>
+            <w:r>
+              <w:t xml:space="preserve">M2</w:t>
+            </w:r>
+          </w:p>
+        </w:tc>
+        <w:tc>
+          <w:tcPr/>
+          <w:p>
+            <w:pPr>
+              <w:pStyle w:val="CSIRText"/>
+            </w:pPr>
+            <w:r>
+              <w:t xml:space="preserve">0.515</w:t>
+            </w:r>
+          </w:p>
+        </w:tc>
+        <w:tc>
+          <w:tcPr/>
+          <w:p>
+            <w:pPr>
+              <w:pStyle w:val="CSIRText"/>
+            </w:pPr>
+            <w:r>
+              <w:t xml:space="preserve">0.903</w:t>
+            </w:r>
+          </w:p>
+        </w:tc>
+        <w:tc>
+          <w:tcPr/>
+          <w:p>
+            <w:pPr>
+              <w:pStyle w:val="CSIRText"/>
+            </w:pPr>
+            <w:r>
+              <w:t xml:space="preserve">0.503</w:t>
+            </w:r>
+          </w:p>
+        </w:tc>
+        <w:tc>
+          <w:tcPr/>
+          <w:p>
+            <w:pPr>
+              <w:pStyle w:val="CSIRText"/>
+            </w:pPr>
+            <w:r>
+              <w:t xml:space="preserve">0.284</w:t>
+            </w:r>
+          </w:p>
+        </w:tc>
+        <w:tc>
+          <w:tcPr/>
+          <w:p>
+            <w:pPr>
+              <w:pStyle w:val="CSIRText"/>
+            </w:pPr>
+            <w:r>
+              <w:t xml:space="preserve">0.031</w:t>
+            </w:r>
+          </w:p>
+        </w:tc>
+      </w:tr>
+    </w:tbl>
+    <w:p>
+      <w:pPr>
+        <w:pStyle w:val="CaptionedFigure"/>
+      </w:pPr>
+      <w:r>
+        <w:drawing>
+          <wp:inline>
+            <wp:extent cx="3017520" cy="1952512"/>
+            <wp:effectExtent b="0" l="0" r="0" t="0"/>
+            <wp:docPr descr="Figure 13. Randomised PIT histograms on held-out accounts. A uniform histogram (dashed line) indicates calibration." title="" id="75" name="Picture"/>
+            <a:graphic>
+              <a:graphicData uri="http://schemas.openxmlformats.org/drawingml/2006/picture">
+                <pic:pic>
+                  <pic:nvPicPr>
+                    <pic:cNvPr descr="outputs/figures/fig6_pit.png" id="76" name="Picture"/>
+                    <pic:cNvPicPr>
+                      <a:picLocks noChangeArrowheads="1" noChangeAspect="1"/>
+                    </pic:cNvPicPr>
+                  </pic:nvPicPr>
+                  <pic:blipFill>
+                    <a:blip r:embed="rId74"/>
+                    <a:stretch>
+                      <a:fillRect/>
+                    </a:stretch>
+                  </pic:blipFill>
+                  <pic:spPr bwMode="auto">
+                    <a:xfrm>
+                      <a:off x="0" y="0"/>
+                      <a:ext cx="3017520" cy="1952512"/>
+                    </a:xfrm>
+                    <a:prstGeom prst="rect">
+                      <a:avLst/>
+                    </a:prstGeom>
+                    <a:noFill/>
+                    <a:ln w="9525">
+                      <a:noFill/>
+                      <a:headEnd/>
+                      <a:tailEnd/>
+                    </a:ln>
+                  </pic:spPr>
+                </pic:pic>
+              </a:graphicData>
+            </a:graphic>
+          </wp:inline>
+        </w:drawing>
+      </w:r>
+    </w:p>
+    <w:p>
+      <w:pPr>
+        <w:pStyle w:val="CSIRCaptionFigure"/>
+      </w:pPr>
+      <w:r>
+        <w:t xml:space="preserve">Figure 13. Randomised PIT histograms on held-out accounts. A uniform histogram (dashed line) indicates calibration.</w:t>
+      </w:r>
+    </w:p>
+    <w:p>
+      <w:pPr>
+        <w:pStyle w:val="CaptionedFigure"/>
+      </w:pPr>
+      <w:r>
+        <w:drawing>
+          <wp:inline>
+            <wp:extent cx="3017520" cy="2130014"/>
+            <wp:effectExtent b="0" l="0" r="0" t="0"/>
+            <wp:docPr descr="Figure 14. Conditional randomised quantile residuals of M2 with the standard normal density (dashed)." title="" id="78" name="Picture"/>
+            <a:graphic>
+              <a:graphicData uri="http://schemas.openxmlformats.org/drawingml/2006/picture">
+                <pic:pic>
+                  <pic:nvPicPr>
+                    <pic:cNvPr descr="outputs/figures/fig5_m2_residuals.png" id="79" name="Picture"/>
+                    <pic:cNvPicPr>
+                      <a:picLocks noChangeArrowheads="1" noChangeAspect="1"/>
+                    </pic:cNvPicPr>
+                  </pic:nvPicPr>
+                  <pic:blipFill>
+                    <a:blip r:embed="rId77"/>
+                    <a:stretch>
+                      <a:fillRect/>
+                    </a:stretch>
+                  </pic:blipFill>
+                  <pic:spPr bwMode="auto">
+                    <a:xfrm>
+                      <a:off x="0" y="0"/>
+                      <a:ext cx="3017520" cy="2130014"/>
+                    </a:xfrm>
+                    <a:prstGeom prst="rect">
+                      <a:avLst/>
+                    </a:prstGeom>
+                    <a:noFill/>
+                    <a:ln w="9525">
+                      <a:noFill/>
+                      <a:headEnd/>
+                      <a:tailEnd/>
+                    </a:ln>
+                  </pic:spPr>
+                </pic:pic>
+              </a:graphicData>
+            </a:graphic>
+          </wp:inline>
+        </w:drawing>
+      </w:r>
+    </w:p>
+    <w:p>
+      <w:pPr>
+        <w:pStyle w:val="CSIRCaptionFigure"/>
+      </w:pPr>
+      <w:r>
+        <w:t xml:space="preserve">Figure 14. Conditional randomised quantile residuals of M2 with the standard normal density (dashed).</w:t>
+      </w:r>
+    </w:p>
+    <w:p>
+      <w:pPr>
+        <w:pStyle w:val="CSIRTableCaption"/>
+      </w:pPr>
+      <w:r>
+        <w:t xml:space="preserve">Table 7. Fitted models: sample, NB2 dispersion θ, account SD σ_u, and convergence checks.</w:t>
+      </w:r>
+    </w:p>
+    <w:tbl>
+      <w:tblPr>
+        <w:tblStyle w:val="Table"/>
+        <w:tblW w:type="auto" w:w="0"/>
+        <w:tblLook w:firstRow="1" w:lastRow="0" w:firstColumn="0" w:lastColumn="0" w:noHBand="0" w:noVBand="0" w:val="0020"/>
+        <w:tblCaption w:val="Table 7. Fitted models: sample, NB2 dispersion θ, account SD σ_u, and convergence checks."/>
+      </w:tblPr>
+      <w:tblGrid>
+        <w:gridCol w:w="1131"/>
+        <w:gridCol w:w="1131"/>
+        <w:gridCol w:w="1131"/>
+        <w:gridCol w:w="1131"/>
+        <w:gridCol w:w="1131"/>
+        <w:gridCol w:w="1131"/>
+        <w:gridCol w:w="1131"/>
+      </w:tblGrid>
+      <w:tr>
+        <w:trPr>
+          <w:tblHeader w:val="on"/>
+        </w:trPr>
+        <w:tc>
+          <w:tcPr/>
+          <w:p>
+            <w:pPr>
+              <w:pStyle w:val="CSIRText"/>
+            </w:pPr>
+            <w:r>
+              <w:t xml:space="preserve">Model</w:t>
+            </w:r>
+          </w:p>
+        </w:tc>
+        <w:tc>
+          <w:tcPr/>
+          <w:p>
+            <w:pPr>
+              <w:pStyle w:val="CSIRText"/>
+            </w:pPr>
+            <w:r>
+              <w:t xml:space="preserve">Posts</w:t>
+            </w:r>
+          </w:p>
+        </w:tc>
+        <w:tc>
+          <w:tcPr/>
+          <w:p>
+            <w:pPr>
+              <w:pStyle w:val="CSIRText"/>
+            </w:pPr>
+            <w:r>
+              <w:t xml:space="preserve">Accounts</w:t>
+            </w:r>
+          </w:p>
+        </w:tc>
+        <w:tc>
+          <w:tcPr/>
+          <w:p>
+            <w:pPr>
+              <w:pStyle w:val="CSIRText"/>
+            </w:pPr>
+            <w:r>
+              <w:t xml:space="preserve">θ</w:t>
+            </w:r>
+          </w:p>
+        </w:tc>
+        <w:tc>
+          <w:tcPr/>
+          <w:p>
+            <w:pPr>
+              <w:pStyle w:val="CSIRText"/>
+            </w:pPr>
+            <w:r>
+              <w:t xml:space="preserve">σ_u</w:t>
+            </w:r>
+          </w:p>
+        </w:tc>
+        <w:tc>
+          <w:tcPr/>
+          <w:p>
+            <w:pPr>
+              <w:pStyle w:val="CSIRText"/>
+            </w:pPr>
+            <w:r>
+              <w:t xml:space="preserve">Converged</w:t>
+            </w:r>
+          </w:p>
+        </w:tc>
+        <w:tc>
+          <w:tcPr/>
+          <w:p>
+            <w:pPr>
+              <w:pStyle w:val="CSIRText"/>
+            </w:pPr>
+            <w:r>
+              <w:t xml:space="preserve">pd Hessian</w:t>
+            </w:r>
+          </w:p>
+        </w:tc>
+      </w:tr>
+      <w:tr>
+        <w:tc>
+          <w:tcPr/>
+          <w:p>
+            <w:pPr>
+              <w:pStyle w:val="CSIRText"/>
+            </w:pPr>
+            <w:r>
+              <w:t xml:space="preserve">M0_train</w:t>
+            </w:r>
+          </w:p>
+        </w:tc>
+        <w:tc>
+          <w:tcPr/>
+          <w:p>
+            <w:pPr>
+              <w:pStyle w:val="CSIRText"/>
+            </w:pPr>
+            <w:r>
+              <w:t xml:space="preserve">466,555</w:t>
+            </w:r>
+          </w:p>
+        </w:tc>
+        <w:tc>
+          <w:tcPr/>
+          <w:p>
+            <w:pPr>
+              <w:pStyle w:val="CSIRText"/>
+            </w:pPr>
+            <w:r>
+              <w:t xml:space="preserve">375,158</w:t>
+            </w:r>
+          </w:p>
+        </w:tc>
+        <w:tc>
+          <w:tcPr/>
+          <w:p>
+            <w:pPr>
+              <w:pStyle w:val="CSIRText"/>
+            </w:pPr>
+            <w:r>
+              <w:t xml:space="preserve">5.996</w:t>
+            </w:r>
+          </w:p>
+        </w:tc>
+        <w:tc>
+          <w:tcPr/>
+          <w:p>
+            <w:pPr>
+              <w:pStyle w:val="CSIRText"/>
+            </w:pPr>
+            <w:r>
+              <w:t xml:space="preserve">0.916</w:t>
+            </w:r>
+          </w:p>
+        </w:tc>
+        <w:tc>
+          <w:tcPr/>
+          <w:p>
+            <w:pPr>
+              <w:pStyle w:val="CSIRText"/>
+            </w:pPr>
+            <w:r>
+              <w:t xml:space="preserve">true</w:t>
+            </w:r>
+          </w:p>
+        </w:tc>
+        <w:tc>
+          <w:tcPr/>
+          <w:p>
+            <w:pPr>
+              <w:pStyle w:val="CSIRText"/>
+            </w:pPr>
+            <w:r>
+              <w:t xml:space="preserve">true</w:t>
+            </w:r>
+          </w:p>
+        </w:tc>
+      </w:tr>
+      <w:tr>
+        <w:tc>
+          <w:tcPr/>
+          <w:p>
+            <w:pPr>
+              <w:pStyle w:val="CSIRText"/>
+            </w:pPr>
+            <w:r>
+              <w:t xml:space="preserve">M1</w:t>
+            </w:r>
+          </w:p>
+        </w:tc>
+        <w:tc>
+          <w:tcPr/>
+          <w:p>
+            <w:pPr>
+              <w:pStyle w:val="CSIRText"/>
+            </w:pPr>
+            <w:r>
+              <w:t xml:space="preserve">583,830</w:t>
+            </w:r>
+          </w:p>
+        </w:tc>
+        <w:tc>
+          <w:tcPr/>
+          <w:p>
+            <w:pPr>
+              <w:pStyle w:val="CSIRText"/>
+            </w:pPr>
+            <w:r>
+              <w:t xml:space="preserve">469,330</w:t>
+            </w:r>
+          </w:p>
+        </w:tc>
+        <w:tc>
+          <w:tcPr/>
+          <w:p>
+            <w:pPr>
+              <w:pStyle w:val="CSIRText"/>
+            </w:pPr>
+            <w:r>
+              <w:t xml:space="preserve">5.993</w:t>
+            </w:r>
+          </w:p>
+        </w:tc>
+        <w:tc>
+          <w:tcPr/>
+          <w:p>
+            <w:pPr>
+              <w:pStyle w:val="CSIRText"/>
+            </w:pPr>
+            <w:r>
+              <w:t xml:space="preserve">0.913</w:t>
+            </w:r>
+          </w:p>
+        </w:tc>
+        <w:tc>
+          <w:tcPr/>
+          <w:p>
+            <w:pPr>
+              <w:pStyle w:val="CSIRText"/>
+            </w:pPr>
+            <w:r>
+              <w:t xml:space="preserve">false</w:t>
+            </w:r>
+          </w:p>
+        </w:tc>
+        <w:tc>
+          <w:tcPr/>
+          <w:p>
+            <w:pPr>
+              <w:pStyle w:val="CSIRText"/>
+            </w:pPr>
+            <w:r>
+              <w:t xml:space="preserve">true</w:t>
+            </w:r>
+          </w:p>
+        </w:tc>
+      </w:tr>
+      <w:tr>
+        <w:tc>
+          <w:tcPr/>
+          <w:p>
+            <w:pPr>
+              <w:pStyle w:val="CSIRText"/>
+            </w:pPr>
+            <w:r>
+              <w:t xml:space="preserve">M1W</w:t>
+            </w:r>
+          </w:p>
+        </w:tc>
+        <w:tc>
+          <w:tcPr/>
+          <w:p>
+            <w:pPr>
+              <w:pStyle w:val="CSIRText"/>
+            </w:pPr>
+            <w:r>
+              <w:t xml:space="preserve">583,830</w:t>
+            </w:r>
+          </w:p>
+        </w:tc>
+        <w:tc>
+          <w:tcPr/>
+          <w:p>
+            <w:pPr>
+              <w:pStyle w:val="CSIRText"/>
+            </w:pPr>
+            <w:r>
+              <w:t xml:space="preserve">469,330</w:t>
+            </w:r>
+          </w:p>
+        </w:tc>
+        <w:tc>
+          <w:tcPr/>
+          <w:p>
+            <w:pPr>
+              <w:pStyle w:val="CSIRText"/>
+            </w:pPr>
+            <w:r>
+              <w:t xml:space="preserve">6.154</w:t>
+            </w:r>
+          </w:p>
+        </w:tc>
+        <w:tc>
+          <w:tcPr/>
+          <w:p>
+            <w:pPr>
+              <w:pStyle w:val="CSIRText"/>
+            </w:pPr>
+            <w:r>
+              <w:t xml:space="preserve">0.908</w:t>
+            </w:r>
+          </w:p>
+        </w:tc>
+        <w:tc>
+          <w:tcPr/>
+          <w:p>
+            <w:pPr>
+              <w:pStyle w:val="CSIRText"/>
+            </w:pPr>
+            <w:r>
+              <w:t xml:space="preserve">true</w:t>
+            </w:r>
+          </w:p>
+        </w:tc>
+        <w:tc>
+          <w:tcPr/>
+          <w:p>
+            <w:pPr>
+              <w:pStyle w:val="CSIRText"/>
+            </w:pPr>
+            <w:r>
+              <w:t xml:space="preserve">true</w:t>
+            </w:r>
+          </w:p>
+        </w:tc>
+      </w:tr>
+      <w:tr>
+        <w:tc>
+          <w:tcPr/>
+          <w:p>
+            <w:pPr>
+              <w:pStyle w:val="CSIRText"/>
+            </w:pPr>
+            <w:r>
+              <w:t xml:space="preserve">M1W_A</w:t>
+            </w:r>
+          </w:p>
+        </w:tc>
+        <w:tc>
+          <w:tcPr/>
+          <w:p>
+            <w:pPr>
+              <w:pStyle w:val="CSIRText"/>
+            </w:pPr>
+            <w:r>
+              <w:t xml:space="preserve">291,091</w:t>
+            </w:r>
+          </w:p>
+        </w:tc>
+        <w:tc>
+          <w:tcPr/>
+          <w:p>
+            <w:pPr>
+              <w:pStyle w:val="CSIRText"/>
+            </w:pPr>
+            <w:r>
+              <w:t xml:space="preserve">234,390</w:t>
+            </w:r>
+          </w:p>
+        </w:tc>
+        <w:tc>
+          <w:tcPr/>
+          <w:p>
+            <w:pPr>
+              <w:pStyle w:val="CSIRText"/>
+            </w:pPr>
+            <w:r>
+              <w:t xml:space="preserve">6.137</w:t>
+            </w:r>
+          </w:p>
+        </w:tc>
+        <w:tc>
+          <w:tcPr/>
+          <w:p>
+            <w:pPr>
+              <w:pStyle w:val="CSIRText"/>
+            </w:pPr>
+            <w:r>
+              <w:t xml:space="preserve">0.905</w:t>
+            </w:r>
+          </w:p>
+        </w:tc>
+        <w:tc>
+          <w:tcPr/>
+          <w:p>
+            <w:pPr>
+              <w:pStyle w:val="CSIRText"/>
+            </w:pPr>
+            <w:r>
+              <w:t xml:space="preserve">true</w:t>
+            </w:r>
+          </w:p>
+        </w:tc>
+        <w:tc>
+          <w:tcPr/>
+          <w:p>
+            <w:pPr>
+              <w:pStyle w:val="CSIRText"/>
+            </w:pPr>
+            <w:r>
+              <w:t xml:space="preserve">true</w:t>
+            </w:r>
+          </w:p>
+        </w:tc>
+      </w:tr>
+      <w:tr>
+        <w:tc>
+          <w:tcPr/>
+          <w:p>
+            <w:pPr>
+              <w:pStyle w:val="CSIRText"/>
+            </w:pPr>
+            <w:r>
+              <w:t xml:space="preserve">M1W_B</w:t>
+            </w:r>
+          </w:p>
+        </w:tc>
+        <w:tc>
+          <w:tcPr/>
+          <w:p>
+            <w:pPr>
+              <w:pStyle w:val="CSIRText"/>
+            </w:pPr>
+            <w:r>
+              <w:t xml:space="preserve">292,739</w:t>
+            </w:r>
+          </w:p>
+        </w:tc>
+        <w:tc>
+          <w:tcPr/>
+          <w:p>
+            <w:pPr>
+              <w:pStyle w:val="CSIRText"/>
+            </w:pPr>
+            <w:r>
+              <w:t xml:space="preserve">234,940</w:t>
+            </w:r>
+          </w:p>
+        </w:tc>
+        <w:tc>
+          <w:tcPr/>
+          <w:p>
+            <w:pPr>
+              <w:pStyle w:val="CSIRText"/>
+            </w:pPr>
+            <w:r>
+              <w:t xml:space="preserve">6.176</w:t>
+            </w:r>
+          </w:p>
+        </w:tc>
+        <w:tc>
+          <w:tcPr/>
+          <w:p>
+            <w:pPr>
+              <w:pStyle w:val="CSIRText"/>
+            </w:pPr>
+            <w:r>
+              <w:t xml:space="preserve">0.911</w:t>
+            </w:r>
+          </w:p>
+        </w:tc>
+        <w:tc>
+          <w:tcPr/>
+          <w:p>
+            <w:pPr>
+              <w:pStyle w:val="CSIRText"/>
+            </w:pPr>
+            <w:r>
+              <w:t xml:space="preserve">true</w:t>
+            </w:r>
+          </w:p>
+        </w:tc>
+        <w:tc>
+          <w:tcPr/>
+          <w:p>
+            <w:pPr>
+              <w:pStyle w:val="CSIRText"/>
+            </w:pPr>
+            <w:r>
+              <w:t xml:space="preserve">true</w:t>
+            </w:r>
+          </w:p>
+        </w:tc>
+      </w:tr>
+      <w:tr>
+        <w:tc>
+          <w:tcPr/>
+          <w:p>
+            <w:pPr>
+              <w:pStyle w:val="CSIRText"/>
+            </w:pPr>
+            <w:r>
+              <w:t xml:space="preserve">M1_A</w:t>
+            </w:r>
+          </w:p>
+        </w:tc>
+        <w:tc>
+          <w:tcPr/>
+          <w:p>
+            <w:pPr>
+              <w:pStyle w:val="CSIRText"/>
+            </w:pPr>
+            <w:r>
+              <w:t xml:space="preserve">291,091</w:t>
+            </w:r>
+          </w:p>
+        </w:tc>
+        <w:tc>
+          <w:tcPr/>
+          <w:p>
+            <w:pPr>
+              <w:pStyle w:val="CSIRText"/>
+            </w:pPr>
+            <w:r>
+              <w:t xml:space="preserve">234,390</w:t>
+            </w:r>
+          </w:p>
+        </w:tc>
+        <w:tc>
+          <w:tcPr/>
+          <w:p>
+            <w:pPr>
+              <w:pStyle w:val="CSIRText"/>
+            </w:pPr>
+            <w:r>
+              <w:t xml:space="preserve">5.956</w:t>
+            </w:r>
+          </w:p>
+        </w:tc>
+        <w:tc>
+          <w:tcPr/>
+          <w:p>
+            <w:pPr>
+              <w:pStyle w:val="CSIRText"/>
+            </w:pPr>
+            <w:r>
+              <w:t xml:space="preserve">0.910</w:t>
+            </w:r>
+          </w:p>
+        </w:tc>
+        <w:tc>
+          <w:tcPr/>
+          <w:p>
+            <w:pPr>
+              <w:pStyle w:val="CSIRText"/>
+            </w:pPr>
+            <w:r>
+              <w:t xml:space="preserve">true</w:t>
+            </w:r>
+          </w:p>
+        </w:tc>
+        <w:tc>
+          <w:tcPr/>
+          <w:p>
+            <w:pPr>
+              <w:pStyle w:val="CSIRText"/>
+            </w:pPr>
+            <w:r>
+              <w:t xml:space="preserve">true</w:t>
+            </w:r>
+          </w:p>
+        </w:tc>
+      </w:tr>
+      <w:tr>
+        <w:tc>
+          <w:tcPr/>
+          <w:p>
+            <w:pPr>
+              <w:pStyle w:val="CSIRText"/>
+            </w:pPr>
+            <w:r>
+              <w:t xml:space="preserve">M1_B</w:t>
+            </w:r>
+          </w:p>
+        </w:tc>
+        <w:tc>
+          <w:tcPr/>
+          <w:p>
+            <w:pPr>
+              <w:pStyle w:val="CSIRText"/>
+            </w:pPr>
+            <w:r>
+              <w:t xml:space="preserve">292,739</w:t>
+            </w:r>
+          </w:p>
+        </w:tc>
+        <w:tc>
+          <w:tcPr/>
+          <w:p>
+            <w:pPr>
+              <w:pStyle w:val="CSIRText"/>
+            </w:pPr>
+            <w:r>
+              <w:t xml:space="preserve">234,940</w:t>
+            </w:r>
+          </w:p>
+        </w:tc>
+        <w:tc>
+          <w:tcPr/>
+          <w:p>
+            <w:pPr>
+              <w:pStyle w:val="CSIRText"/>
+            </w:pPr>
+            <w:r>
+              <w:t xml:space="preserve">6.032</w:t>
+            </w:r>
+          </w:p>
+        </w:tc>
+        <w:tc>
+          <w:tcPr/>
+          <w:p>
+            <w:pPr>
+              <w:pStyle w:val="CSIRText"/>
+            </w:pPr>
+            <w:r>
+              <w:t xml:space="preserve">0.917</w:t>
+            </w:r>
+          </w:p>
+        </w:tc>
+        <w:tc>
+          <w:tcPr/>
+          <w:p>
+            <w:pPr>
+              <w:pStyle w:val="CSIRText"/>
+            </w:pPr>
+            <w:r>
+              <w:t xml:space="preserve">true</w:t>
+            </w:r>
+          </w:p>
+        </w:tc>
+        <w:tc>
+          <w:tcPr/>
+          <w:p>
+            <w:pPr>
+              <w:pStyle w:val="CSIRText"/>
+            </w:pPr>
+            <w:r>
+              <w:t xml:space="preserve">true</w:t>
+            </w:r>
+          </w:p>
+        </w:tc>
+      </w:tr>
+      <w:tr>
+        <w:tc>
+          <w:tcPr/>
+          <w:p>
+            <w:pPr>
+              <w:pStyle w:val="CSIRText"/>
+            </w:pPr>
+            <w:r>
+              <w:t xml:space="preserve">M2</w:t>
+            </w:r>
+          </w:p>
+        </w:tc>
+        <w:tc>
+          <w:tcPr/>
+          <w:p>
+            <w:pPr>
+              <w:pStyle w:val="CSIRText"/>
+            </w:pPr>
+            <w:r>
+              <w:t xml:space="preserve">583,830</w:t>
+            </w:r>
+          </w:p>
+        </w:tc>
+        <w:tc>
+          <w:tcPr/>
+          <w:p>
+            <w:pPr>
+              <w:pStyle w:val="CSIRText"/>
+            </w:pPr>
+            <w:r>
+              <w:t xml:space="preserve">469,330</w:t>
+            </w:r>
+          </w:p>
+        </w:tc>
+        <w:tc>
+          <w:tcPr/>
+          <w:p>
+            <w:pPr>
+              <w:pStyle w:val="CSIRText"/>
+            </w:pPr>
+            <w:r>
+              <w:t xml:space="preserve">6.110</w:t>
+            </w:r>
+          </w:p>
+        </w:tc>
+        <w:tc>
+          <w:tcPr/>
+          <w:p>
+            <w:pPr>
+              <w:pStyle w:val="CSIRText"/>
+            </w:pPr>
+            <w:r>
+              <w:t xml:space="preserve">0.900</w:t>
+            </w:r>
+          </w:p>
+        </w:tc>
+        <w:tc>
+          <w:tcPr/>
+          <w:p>
+            <w:pPr>
+              <w:pStyle w:val="CSIRText"/>
+            </w:pPr>
+            <w:r>
+              <w:t xml:space="preserve">true</w:t>
+            </w:r>
+          </w:p>
+        </w:tc>
+        <w:tc>
+          <w:tcPr/>
+          <w:p>
+            <w:pPr>
+              <w:pStyle w:val="CSIRText"/>
+            </w:pPr>
+            <w:r>
+              <w:t xml:space="preserve">true</w:t>
+            </w:r>
+          </w:p>
+        </w:tc>
+      </w:tr>
+      <w:tr>
+        <w:tc>
+          <w:tcPr/>
+          <w:p>
+            <w:pPr>
+              <w:pStyle w:val="CSIRText"/>
+            </w:pPr>
+            <w:r>
+              <w:t xml:space="preserve">M2_A</w:t>
+            </w:r>
+          </w:p>
+        </w:tc>
+        <w:tc>
+          <w:tcPr/>
+          <w:p>
+            <w:pPr>
+              <w:pStyle w:val="CSIRText"/>
+            </w:pPr>
+            <w:r>
+              <w:t xml:space="preserve">291,091</w:t>
+            </w:r>
+          </w:p>
+        </w:tc>
+        <w:tc>
+          <w:tcPr/>
+          <w:p>
+            <w:pPr>
+              <w:pStyle w:val="CSIRText"/>
+            </w:pPr>
+            <w:r>
+              <w:t xml:space="preserve">234,390</w:t>
+            </w:r>
+          </w:p>
+        </w:tc>
+        <w:tc>
+          <w:tcPr/>
+          <w:p>
+            <w:pPr>
+              <w:pStyle w:val="CSIRText"/>
+            </w:pPr>
+            <w:r>
+              <w:t xml:space="preserve">6.090</w:t>
+            </w:r>
+          </w:p>
+        </w:tc>
+        <w:tc>
+          <w:tcPr/>
+          <w:p>
+            <w:pPr>
+              <w:pStyle w:val="CSIRText"/>
+            </w:pPr>
+            <w:r>
+              <w:t xml:space="preserve">0.896</w:t>
+            </w:r>
+          </w:p>
+        </w:tc>
+        <w:tc>
+          <w:tcPr/>
+          <w:p>
+            <w:pPr>
+              <w:pStyle w:val="CSIRText"/>
+            </w:pPr>
+            <w:r>
+              <w:t xml:space="preserve">true</w:t>
+            </w:r>
+          </w:p>
+        </w:tc>
+        <w:tc>
+          <w:tcPr/>
+          <w:p>
+            <w:pPr>
+              <w:pStyle w:val="CSIRText"/>
+            </w:pPr>
+            <w:r>
+              <w:t xml:space="preserve">true</w:t>
+            </w:r>
+          </w:p>
+        </w:tc>
+      </w:tr>
+      <w:tr>
+        <w:tc>
+          <w:tcPr/>
+          <w:p>
+            <w:pPr>
+              <w:pStyle w:val="CSIRText"/>
+            </w:pPr>
+            <w:r>
+              <w:t xml:space="preserve">M2_B</w:t>
+            </w:r>
+          </w:p>
+        </w:tc>
+        <w:tc>
+          <w:tcPr/>
+          <w:p>
+            <w:pPr>
+              <w:pStyle w:val="CSIRText"/>
+            </w:pPr>
+            <w:r>
+              <w:t xml:space="preserve">292,739</w:t>
+            </w:r>
+          </w:p>
+        </w:tc>
+        <w:tc>
+          <w:tcPr/>
+          <w:p>
+            <w:pPr>
+              <w:pStyle w:val="CSIRText"/>
+            </w:pPr>
+            <w:r>
+              <w:t xml:space="preserve">234,940</w:t>
+            </w:r>
+          </w:p>
+        </w:tc>
+        <w:tc>
+          <w:tcPr/>
+          <w:p>
+            <w:pPr>
+              <w:pStyle w:val="CSIRText"/>
+            </w:pPr>
+            <w:r>
+              <w:t xml:space="preserve">6.138</w:t>
+            </w:r>
+          </w:p>
+        </w:tc>
+        <w:tc>
+          <w:tcPr/>
+          <w:p>
+            <w:pPr>
+              <w:pStyle w:val="CSIRText"/>
+            </w:pPr>
+            <w:r>
+              <w:t xml:space="preserve">0.903</w:t>
+            </w:r>
+          </w:p>
+        </w:tc>
+        <w:tc>
+          <w:tcPr/>
+          <w:p>
+            <w:pPr>
+              <w:pStyle w:val="CSIRText"/>
+            </w:pPr>
+            <w:r>
+              <w:t xml:space="preserve">true</w:t>
+            </w:r>
+          </w:p>
+        </w:tc>
+        <w:tc>
+          <w:tcPr/>
+          <w:p>
+            <w:pPr>
+              <w:pStyle w:val="CSIRText"/>
+            </w:pPr>
+            <w:r>
+              <w:t xml:space="preserve">true</w:t>
+            </w:r>
+          </w:p>
+        </w:tc>
+      </w:tr>
+      <w:tr>
+        <w:tc>
+          <w:tcPr/>
+          <w:p>
+            <w:pPr>
+              <w:pStyle w:val="CSIRText"/>
+            </w:pPr>
+            <w:r>
+              <w:t xml:space="preserve">M2_train</w:t>
+            </w:r>
+          </w:p>
+        </w:tc>
+        <w:tc>
+          <w:tcPr/>
+          <w:p>
+            <w:pPr>
+              <w:pStyle w:val="CSIRText"/>
+            </w:pPr>
+            <w:r>
+              <w:t xml:space="preserve">466,555</w:t>
+            </w:r>
+          </w:p>
+        </w:tc>
+        <w:tc>
+          <w:tcPr/>
+          <w:p>
+            <w:pPr>
+              <w:pStyle w:val="CSIRText"/>
+            </w:pPr>
+            <w:r>
+              <w:t xml:space="preserve">375,158</w:t>
+            </w:r>
+          </w:p>
+        </w:tc>
+        <w:tc>
+          <w:tcPr/>
+          <w:p>
+            <w:pPr>
+              <w:pStyle w:val="CSIRText"/>
+            </w:pPr>
+            <w:r>
+              <w:t xml:space="preserve">6.147</w:t>
+            </w:r>
+          </w:p>
+        </w:tc>
+        <w:tc>
+          <w:tcPr/>
+          <w:p>
+            <w:pPr>
+              <w:pStyle w:val="CSIRText"/>
+            </w:pPr>
+            <w:r>
+              <w:t xml:space="preserve">0.900</w:t>
+            </w:r>
+          </w:p>
+        </w:tc>
+        <w:tc>
+          <w:tcPr/>
+          <w:p>
+            <w:pPr>
+              <w:pStyle w:val="CSIRText"/>
+            </w:pPr>
+            <w:r>
+              <w:t xml:space="preserve">true</w:t>
+            </w:r>
+          </w:p>
+        </w:tc>
+        <w:tc>
+          <w:tcPr/>
+          <w:p>
+            <w:pPr>
+              <w:pStyle w:val="CSIRText"/>
+            </w:pPr>
+            <w:r>
+              <w:t xml:space="preserve">true</w:t>
+            </w:r>
+          </w:p>
+        </w:tc>
+      </w:tr>
+      <w:tr>
+        <w:tc>
+          <w:tcPr/>
+          <w:p>
+            <w:pPr>
+              <w:pStyle w:val="CSIRText"/>
+            </w:pPr>
+            <w:r>
+              <w:t xml:space="preserve">R1_M1</w:t>
+            </w:r>
+          </w:p>
+        </w:tc>
+        <w:tc>
+          <w:tcPr/>
+          <w:p>
+            <w:pPr>
+              <w:pStyle w:val="CSIRText"/>
+            </w:pPr>
+            <w:r>
+              <w:t xml:space="preserve">583,830</w:t>
+            </w:r>
+          </w:p>
+        </w:tc>
+        <w:tc>
+          <w:tcPr/>
+          <w:p>
+            <w:pPr>
+              <w:pStyle w:val="CSIRText"/>
+            </w:pPr>
+            <w:r>
+              <w:t xml:space="preserve">469,330</w:t>
+            </w:r>
+          </w:p>
+        </w:tc>
+        <w:tc>
+          <w:tcPr/>
+          <w:p>
+            <w:pPr>
+              <w:pStyle w:val="CSIRText"/>
+            </w:pPr>
+            <w:r>
+              <w:t xml:space="preserve">6.063</w:t>
+            </w:r>
+          </w:p>
+        </w:tc>
+        <w:tc>
+          <w:tcPr/>
+          <w:p>
+            <w:pPr>
+              <w:pStyle w:val="CSIRText"/>
+            </w:pPr>
+            <w:r>
+              <w:t xml:space="preserve">0.742</w:t>
+            </w:r>
+          </w:p>
+        </w:tc>
+        <w:tc>
+          <w:tcPr/>
+          <w:p>
+            <w:pPr>
+              <w:pStyle w:val="CSIRText"/>
+            </w:pPr>
+            <w:r>
+              <w:t xml:space="preserve">true</w:t>
+            </w:r>
+          </w:p>
+        </w:tc>
+        <w:tc>
+          <w:tcPr/>
+          <w:p>
+            <w:pPr>
+              <w:pStyle w:val="CSIRText"/>
+            </w:pPr>
+            <w:r>
+              <w:t xml:space="preserve">true</w:t>
+            </w:r>
+          </w:p>
+        </w:tc>
+      </w:tr>
+      <w:tr>
+        <w:tc>
+          <w:tcPr/>
+          <w:p>
+            <w:pPr>
+              <w:pStyle w:val="CSIRText"/>
+            </w:pPr>
+            <w:r>
+              <w:t xml:space="preserve">R4_M1</w:t>
+            </w:r>
+          </w:p>
+        </w:tc>
+        <w:tc>
+          <w:tcPr/>
+          <w:p>
+            <w:pPr>
+              <w:pStyle w:val="CSIRText"/>
+            </w:pPr>
+            <w:r>
+              <w:t xml:space="preserve">164,772</w:t>
+            </w:r>
+          </w:p>
+        </w:tc>
+        <w:tc>
+          <w:tcPr/>
+          <w:p>
+            <w:pPr>
+              <w:pStyle w:val="CSIRText"/>
+            </w:pPr>
+            <w:r>
+              <w:t xml:space="preserve">50,272</w:t>
+            </w:r>
+          </w:p>
+        </w:tc>
+        <w:tc>
+          <w:tcPr/>
+          <w:p>
+            <w:pPr>
+              <w:pStyle w:val="CSIRText"/>
+            </w:pPr>
+            <w:r>
+              <w:t xml:space="preserve">6.513</w:t>
+            </w:r>
+          </w:p>
+        </w:tc>
+        <w:tc>
+          <w:tcPr/>
+          <w:p>
+            <w:pPr>
+              <w:pStyle w:val="CSIRText"/>
+            </w:pPr>
+            <w:r>
+              <w:t xml:space="preserve">1.015</w:t>
+            </w:r>
+          </w:p>
+        </w:tc>
+        <w:tc>
+          <w:tcPr/>
+          <w:p>
+            <w:pPr>
+              <w:pStyle w:val="CSIRText"/>
+            </w:pPr>
+            <w:r>
+              <w:t xml:space="preserve">true</w:t>
+            </w:r>
+          </w:p>
+        </w:tc>
+        <w:tc>
+          <w:tcPr/>
+          <w:p>
+            <w:pPr>
+              <w:pStyle w:val="CSIRText"/>
+            </w:pPr>
+            <w:r>
+              <w:t xml:space="preserve">true</w:t>
+            </w:r>
+          </w:p>
+        </w:tc>
+      </w:tr>
+      <w:tr>
+        <w:tc>
+          <w:tcPr/>
+          <w:p>
+            <w:pPr>
+              <w:pStyle w:val="CSIRText"/>
+            </w:pPr>
+            <w:r>
+              <w:t xml:space="preserve">R4_M2</w:t>
+            </w:r>
+          </w:p>
+        </w:tc>
+        <w:tc>
+          <w:tcPr/>
+          <w:p>
+            <w:pPr>
+              <w:pStyle w:val="CSIRText"/>
+            </w:pPr>
+            <w:r>
+              <w:t xml:space="preserve">164,772</w:t>
+            </w:r>
+          </w:p>
+        </w:tc>
+        <w:tc>
+          <w:tcPr/>
+          <w:p>
+            <w:pPr>
+              <w:pStyle w:val="CSIRText"/>
+            </w:pPr>
+            <w:r>
+              <w:t xml:space="preserve">50,272</w:t>
+            </w:r>
+          </w:p>
+        </w:tc>
+        <w:tc>
+          <w:tcPr/>
+          <w:p>
+            <w:pPr>
+              <w:pStyle w:val="CSIRText"/>
+            </w:pPr>
+            <w:r>
+              <w:t xml:space="preserve">6.757</w:t>
+            </w:r>
+          </w:p>
+        </w:tc>
+        <w:tc>
+          <w:tcPr/>
+          <w:p>
+            <w:pPr>
+              <w:pStyle w:val="CSIRText"/>
+            </w:pPr>
+            <w:r>
+              <w:t xml:space="preserve">1.014</w:t>
+            </w:r>
+          </w:p>
+        </w:tc>
+        <w:tc>
+          <w:tcPr/>
+          <w:p>
+            <w:pPr>
+              <w:pStyle w:val="CSIRText"/>
+            </w:pPr>
+            <w:r>
+              <w:t xml:space="preserve">true</w:t>
+            </w:r>
+          </w:p>
+        </w:tc>
+        <w:tc>
+          <w:tcPr/>
+          <w:p>
+            <w:pPr>
+              <w:pStyle w:val="CSIRText"/>
+            </w:pPr>
+            <w:r>
+              <w:t xml:space="preserve">true</w:t>
+            </w:r>
+          </w:p>
+        </w:tc>
+      </w:tr>
+    </w:tbl>
+    <w:bookmarkEnd w:id="80"/>
+    <w:bookmarkEnd w:id="81"/>
+    <w:bookmarkStart w:id="87" w:name="discussion"/>
+    <w:p>
+      <w:pPr>
+        <w:pStyle w:val="CSIRMainSection"/>
+      </w:pPr>
+      <w:r>
+        <w:t xml:space="preserve">Discussion</w:t>
+      </w:r>
+    </w:p>
+    <w:bookmarkStart w:id="82" w:name="what-the-evidence-supports"/>
+    <w:p>
+      <w:pPr>
+        <w:pStyle w:val="CSIRSubSection"/>
+      </w:pPr>
+      <w:r>
+        <w:t xml:space="preserve">What the evidence supports</w:t>
+      </w:r>
+    </w:p>
+    <w:p>
+      <w:pPr>
+        <w:pStyle w:val="CSIRText"/>
+      </w:pPr>
+      <w:r>
+        <w:t xml:space="preserve">Two visual properties pass every criterion: significance after multiplicity correction, a</w:t>
+      </w:r>
+      <w:r>
+        <w:t xml:space="preserve"> </w:t>
+      </w:r>
+      <w:r>
+        <w:t xml:space="preserve">practically meaningful size, and internal replication. Photographs with a higher overall</w:t>
+      </w:r>
+      <w:r>
+        <w:t xml:space="preserve"> </w:t>
+      </w:r>
+      <w:r>
+        <w:t xml:space="preserve">aesthetic score, and photographs that contain a detected person, receive more likes per recorded</w:t>
+      </w:r>
+      <w:r>
+        <w:t xml:space="preserve"> </w:t>
+      </w:r>
+      <w:r>
+        <w:t xml:space="preserve">follower. The person association (about +22% for one person against none) is four times the</w:t>
+      </w:r>
+      <w:r>
+        <w:t xml:space="preserve"> </w:t>
+      </w:r>
+      <w:r>
+        <w:t xml:space="preserve">aesthetic association per SD (+5.7%). It is also about the same size as the differences</w:t>
+      </w:r>
+      <w:r>
+        <w:t xml:space="preserve"> </w:t>
+      </w:r>
+      <w:r>
+        <w:t xml:space="preserve">between shot scales and image genres (Figure 10). For a creator choosing</w:t>
+      </w:r>
+      <w:r>
+        <w:t xml:space="preserve"> </w:t>
+      </w:r>
+      <w:r>
+        <w:rPr>
+          <w:i/>
+          <w:iCs/>
+        </w:rPr>
+        <w:t xml:space="preserve">what</w:t>
+      </w:r>
+      <w:r>
+        <w:t xml:space="preserve"> </w:t>
+      </w:r>
+      <w:r>
+        <w:t xml:space="preserve">to photograph,</w:t>
+      </w:r>
+      <w:r>
+        <w:t xml:space="preserve"> </w:t>
+      </w:r>
+      <w:r>
+        <w:t xml:space="preserve">this suggests that content and framing carry more weight than polish on any single aesthetic</w:t>
+      </w:r>
+      <w:r>
+        <w:t xml:space="preserve"> </w:t>
+      </w:r>
+      <w:r>
+        <w:t xml:space="preserve">attribute. In the M2 model, no individual attribute exceeds +4% per SD.</w:t>
+      </w:r>
+    </w:p>
+    <w:p>
+      <w:pPr>
+        <w:pStyle w:val="CSIRText"/>
+      </w:pPr>
+      <w:r>
+        <w:t xml:space="preserve">The person result is consistent in direction with the face effect reported by Bakhshi et al.</w:t>
+      </w:r>
+      <w:r>
+        <w:t xml:space="preserve"> </w:t>
+      </w:r>
+      <w:r>
+        <w:t xml:space="preserve">[8] but smaller (+22% against +38%). Three differences can explain the gap: the indicator here</w:t>
+      </w:r>
+      <w:r>
+        <w:t xml:space="preserve"> </w:t>
+      </w:r>
+      <w:r>
+        <w:t xml:space="preserve">is a general person detector, not a face detector; the outcome is normalised by followers; and</w:t>
+      </w:r>
+      <w:r>
+        <w:t xml:space="preserve"> </w:t>
+      </w:r>
+      <w:r>
+        <w:t xml:space="preserve">the model conditions on shot scale, genre, and the aesthetic attributes. The aesthetic result</w:t>
+      </w:r>
+      <w:r>
+        <w:t xml:space="preserve"> </w:t>
+      </w:r>
+      <w:r>
+        <w:t xml:space="preserve">agrees with experimental-aesthetics evidence that Instagram likes track aesthetic appeal [5] and</w:t>
+      </w:r>
+      <w:r>
+        <w:t xml:space="preserve"> </w:t>
+      </w:r>
+      <w:r>
+        <w:t xml:space="preserve">with the professional-quality effect in [7]. Our design adds that the association is mostly a</w:t>
+      </w:r>
+      <w:r>
+        <w:t xml:space="preserve"> </w:t>
+      </w:r>
+      <w:r>
+        <w:t xml:space="preserve">within-account phenomenon. H4 found a statistically detectable but practically negligible</w:t>
+      </w:r>
+      <w:r>
+        <w:t xml:space="preserve"> </w:t>
+      </w:r>
+      <w:r>
+        <w:t xml:space="preserve">difference between between-account and within-account associations, and the within-account</w:t>
+      </w:r>
+      <w:r>
+        <w:t xml:space="preserve"> </w:t>
+      </w:r>
+      <w:r>
+        <w:t xml:space="preserve">association alone (+4.2% per SD) clears the SESOI band. The aesthetic</w:t>
+      </w:r>
+      <w:r>
+        <w:t xml:space="preserve"> </w:t>
+      </w:r>
+      <w:r>
+        <w:t xml:space="preserve">“driver”</w:t>
+      </w:r>
+      <w:r>
+        <w:t xml:space="preserve"> </w:t>
+      </w:r>
+      <w:r>
+        <w:t xml:space="preserve">is therefore not</w:t>
+      </w:r>
+      <w:r>
+        <w:t xml:space="preserve"> </w:t>
+      </w:r>
+      <w:r>
+        <w:t xml:space="preserve">mainly an artefact of better-resourced accounts posting better-looking photographs. Within one</w:t>
+      </w:r>
+      <w:r>
+        <w:t xml:space="preserve"> </w:t>
+      </w:r>
+      <w:r>
+        <w:t xml:space="preserve">account, the better-scored photographs earn more likes per follower.</w:t>
+      </w:r>
+    </w:p>
+    <w:bookmarkEnd w:id="82"/>
+    <w:bookmarkStart w:id="83" w:name="what-it-does-not-support"/>
+    <w:p>
+      <w:pPr>
+        <w:pStyle w:val="CSIRSubSection"/>
+      </w:pPr>
+      <w:r>
+        <w:t xml:space="preserve">What it does not support</w:t>
+      </w:r>
+    </w:p>
+    <w:p>
+      <w:pPr>
+        <w:pStyle w:val="CSIRText"/>
+      </w:pPr>
+      <w:r>
+        <w:t xml:space="preserve">Vivid colour, the attribute most often recommended in practitioner advice and studied in</w:t>
+      </w:r>
+      <w:r>
+        <w:t xml:space="preserve"> </w:t>
+      </w:r>
+      <w:r>
+        <w:t xml:space="preserve">tourism marketing [3], shows no practically meaningful association. Its conditional association</w:t>
+      </w:r>
+      <w:r>
+        <w:t xml:space="preserve"> </w:t>
+      </w:r>
+      <w:r>
+        <w:t xml:space="preserve">is slightly</w:t>
+      </w:r>
+      <w:r>
+        <w:t xml:space="preserve"> </w:t>
+      </w:r>
+      <w:r>
+        <w:rPr>
+          <w:i/>
+          <w:iCs/>
+        </w:rPr>
+        <w:t xml:space="preserve">negative</w:t>
+      </w:r>
+      <w:r>
+        <w:t xml:space="preserve">, and the equivalence test bounds it inside ±3% per SD. This is a</w:t>
+      </w:r>
+      <w:r>
+        <w:t xml:space="preserve"> </w:t>
+      </w:r>
+      <w:r>
+        <w:t xml:space="preserve">conditional estimate. Vividness correlates 0.61-0.75 with colour harmony, lighting, content, and</w:t>
+      </w:r>
+      <w:r>
+        <w:t xml:space="preserve"> </w:t>
+      </w:r>
+      <w:r>
+        <w:t xml:space="preserve">the overall score (Figure 5), so its unique contribution, holding those fixed, is small. That</w:t>
+      </w:r>
+      <w:r>
+        <w:t xml:space="preserve"> </w:t>
+      </w:r>
+      <w:r>
+        <w:t xml:space="preserve">does not contradict findings that specific colour</w:t>
+      </w:r>
+      <w:r>
+        <w:t xml:space="preserve"> </w:t>
+      </w:r>
+      <w:r>
+        <w:rPr>
+          <w:i/>
+          <w:iCs/>
+        </w:rPr>
+        <w:t xml:space="preserve">schemes</w:t>
+      </w:r>
+      <w:r>
+        <w:t xml:space="preserve"> </w:t>
+      </w:r>
+      <w:r>
+        <w:t xml:space="preserve">matter in specific genres [3]. It</w:t>
+      </w:r>
+      <w:r>
+        <w:t xml:space="preserve"> </w:t>
+      </w:r>
+      <w:r>
+        <w:t xml:space="preserve">does indicate that</w:t>
+      </w:r>
+      <w:r>
+        <w:t xml:space="preserve"> </w:t>
+      </w:r>
+      <w:r>
+        <w:t xml:space="preserve">“more vivid”</w:t>
+      </w:r>
+      <w:r>
+        <w:t xml:space="preserve"> </w:t>
+      </w:r>
+      <w:r>
+        <w:t xml:space="preserve">is not, in itself, a general lever.</w:t>
+      </w:r>
+    </w:p>
+    <w:p>
+      <w:pPr>
+        <w:pStyle w:val="CSIRText"/>
+      </w:pPr>
+      <w:r>
+        <w:t xml:space="preserve">H3 and H4 illustrate the large-sample p-value problem [9]. Both coefficients are</w:t>
+      </w:r>
+      <w:r>
+        <w:t xml:space="preserve"> </w:t>
+      </w:r>
+      <w:r>
+        <w:t xml:space="preserve">“significant”</w:t>
+      </w:r>
+      <w:r>
+        <w:t xml:space="preserve"> </w:t>
+      </w:r>
+      <w:r>
+        <w:t xml:space="preserve">at conventional levels, H3 in the unexpected direction, yet both are bounded</w:t>
+      </w:r>
+      <w:r>
+        <w:t xml:space="preserve"> </w:t>
+      </w:r>
+      <w:r>
+        <w:t xml:space="preserve">inside ±3% with Holm-adjusted equivalence tests. Without the pre-registered SESOI and the</w:t>
+      </w:r>
+      <w:r>
+        <w:t xml:space="preserve"> </w:t>
+      </w:r>
+      <w:r>
+        <w:t xml:space="preserve">equivalence test, both would probably have been reported as findings.</w:t>
+      </w:r>
+    </w:p>
+    <w:bookmarkEnd w:id="83"/>
+    <w:bookmarkStart w:id="84" w:name="audience-normalisation"/>
+    <w:p>
+      <w:pPr>
+        <w:pStyle w:val="CSIRSubSection"/>
+      </w:pPr>
+      <w:r>
+        <w:t xml:space="preserve">Audience normalisation</w:t>
+      </w:r>
+    </w:p>
+    <w:p>
+      <w:pPr>
+        <w:pStyle w:val="CSIRText"/>
+      </w:pPr>
+      <w:r>
+        <w:t xml:space="preserve">The free follower elasticity of 0.629 is a substantive finding in its own right. Likes grow</w:t>
+      </w:r>
+      <w:r>
+        <w:t xml:space="preserve"> </w:t>
+      </w:r>
+      <w:r>
+        <w:t xml:space="preserve">sublinearly with recorded followers, so likes-per-follower engagement rates systematically</w:t>
+      </w:r>
+      <w:r>
+        <w:t xml:space="preserve"> </w:t>
+      </w:r>
+      <w:r>
+        <w:t xml:space="preserve">favour small accounts. For research, an offset is a convenient normalisation, but its implied</w:t>
+      </w:r>
+      <w:r>
+        <w:t xml:space="preserve"> </w:t>
+      </w:r>
+      <w:r>
+        <w:t xml:space="preserve">elasticity of one should be tested rather than assumed. In our data, freeing it strengthened the</w:t>
+      </w:r>
+      <w:r>
+        <w:t xml:space="preserve"> </w:t>
+      </w:r>
+      <w:r>
+        <w:t xml:space="preserve">aesthetic association (R1), so the offset results are conservative for H1. For practitioners,</w:t>
+      </w:r>
+      <w:r>
+        <w:t xml:space="preserve"> </w:t>
+      </w:r>
+      <w:r>
+        <w:t xml:space="preserve">engagement-rate comparisons across accounts of very different size need a size adjustment.</w:t>
+      </w:r>
+    </w:p>
+    <w:bookmarkEnd w:id="84"/>
+    <w:bookmarkStart w:id="85" w:name="prediction"/>
+    <w:p>
+      <w:pPr>
+        <w:pStyle w:val="CSIRSubSection"/>
+      </w:pPr>
+      <w:r>
+        <w:t xml:space="preserve">Prediction</w:t>
+      </w:r>
+    </w:p>
+    <w:p>
+      <w:pPr>
+        <w:pStyle w:val="CSIRText"/>
+      </w:pPr>
+      <w:r>
+        <w:t xml:space="preserve">Visual features improve out-of-sample prediction for unseen accounts by a modest but reliable</w:t>
+      </w:r>
+      <w:r>
+        <w:t xml:space="preserve"> </w:t>
+      </w:r>
+      <w:r>
+        <w:t xml:space="preserve">0.0160 nats per post (a 1.61% gain in geometric-mean predictive probability). The rank</w:t>
+      </w:r>
+      <w:r>
+        <w:t xml:space="preserve"> </w:t>
+      </w:r>
+      <w:r>
+        <w:t xml:space="preserve">correlation of predicted and observed likes per follower rises from 0.172 to 0.254.</w:t>
+      </w:r>
+      <w:r>
+        <w:t xml:space="preserve"> </w:t>
+      </w:r>
+      <w:r>
+        <w:t xml:space="preserve">Most of the remaining variation sits in the account effect (</w:t>
+      </w:r>
+      <m:oMath>
+        <m:sSub>
+          <m:e>
+            <m:acc>
+              <m:accPr>
+                <m:chr m:val="̂"/>
+              </m:accPr>
+              <m:e>
+                <m:r>
+                  <m:t>σ</m:t>
+                </m:r>
+              </m:e>
+            </m:acc>
+          </m:e>
+          <m:sub>
+            <m:r>
+              <m:t>u</m:t>
+            </m:r>
+          </m:sub>
+        </m:sSub>
+        <m:r>
+          <m:rPr>
+            <m:sty m:val="p"/>
+          </m:rPr>
+          <m:t>≈</m:t>
+        </m:r>
+      </m:oMath>
+      <w:r>
+        <w:t xml:space="preserve"> </w:t>
+      </w:r>
+      <w:r>
+        <w:t xml:space="preserve">0.900,</w:t>
+      </w:r>
+      <w:r>
+        <w:t xml:space="preserve"> </w:t>
+      </w:r>
+      <w:r>
+        <w:t xml:space="preserve">about a 2.5-fold difference in expected likes per follower between accounts one SD apart) and</w:t>
+      </w:r>
+      <w:r>
+        <w:t xml:space="preserve"> </w:t>
+      </w:r>
+      <w:r>
+        <w:t xml:space="preserve">in post-level noise. Visual features alone therefore cannot forecast an individual post’s</w:t>
+      </w:r>
+      <w:r>
+        <w:t xml:space="preserve"> </w:t>
+      </w:r>
+      <w:r>
+        <w:t xml:space="preserve">performance well, consistent with earlier findings that social context dominates popularity</w:t>
+      </w:r>
+      <w:r>
+        <w:t xml:space="preserve"> </w:t>
+      </w:r>
+      <w:r>
+        <w:t xml:space="preserve">prediction [17, 18].</w:t>
+      </w:r>
+    </w:p>
+    <w:bookmarkEnd w:id="85"/>
+    <w:bookmarkStart w:id="86" w:name="limitations"/>
+    <w:p>
+      <w:pPr>
+        <w:pStyle w:val="CSIRSubSection"/>
+      </w:pPr>
+      <w:r>
+        <w:t xml:space="preserve">Limitations</w:t>
+      </w:r>
+    </w:p>
+    <w:p>
+      <w:pPr>
+        <w:pStyle w:val="CSIRText"/>
+      </w:pPr>
+      <w:r>
+        <w:rPr>
+          <w:b/>
+          <w:bCs/>
+        </w:rPr>
+        <w:t xml:space="preserve">Unvalidated feature provenance.</w:t>
+      </w:r>
+      <w:r>
+        <w:t xml:space="preserve"> </w:t>
+      </w:r>
+      <w:r>
+        <w:t xml:space="preserve">The image features were supplied without documentation.</w:t>
+      </w:r>
+      <w:r>
+        <w:t xml:space="preserve"> </w:t>
+      </w:r>
+      <w:r>
+        <w:t xml:space="preserve">Their names match AADB [21] and COCO [22], but the generating models and their accuracy on</w:t>
+      </w:r>
+      <w:r>
+        <w:t xml:space="preserve"> </w:t>
+      </w:r>
+      <w:r>
+        <w:t xml:space="preserve">Instagram imagery are unknown. Three scores were numerically degenerate, and depth-of-field</w:t>
+      </w:r>
+      <w:r>
+        <w:t xml:space="preserve"> </w:t>
+      </w:r>
+      <w:r>
+        <w:t xml:space="preserve">scores agree only partly with shot scale (Figure 4). For a single error-prone predictor such as</w:t>
+      </w:r>
+      <w:r>
+        <w:t xml:space="preserve"> </w:t>
+      </w:r>
+      <w:r>
+        <w:t xml:space="preserve">the overall score, classical measurement error biases the IRR towards one. In M2 the attributes</w:t>
+      </w:r>
+      <w:r>
+        <w:t xml:space="preserve"> </w:t>
+      </w:r>
+      <w:r>
+        <w:t xml:space="preserve">are correlated, so the direction of bias for any one attribute is not guaranteed. The</w:t>
+      </w:r>
+      <w:r>
+        <w:t xml:space="preserve"> </w:t>
+      </w:r>
+      <w:r>
+        <w:t xml:space="preserve">negligible findings (H3) concern these proxies, not colour vividness as perceived by viewers.</w:t>
+      </w:r>
+    </w:p>
+    <w:p>
+      <w:pPr>
+        <w:pStyle w:val="CSIRText"/>
+      </w:pPr>
+      <w:r>
+        <w:rPr>
+          <w:b/>
+          <w:bCs/>
+        </w:rPr>
+        <w:t xml:space="preserve">Follower snapshot and exposure.</w:t>
+      </w:r>
+      <w:r>
+        <w:t xml:space="preserve"> </w:t>
+      </w:r>
+      <w:r>
+        <w:t xml:space="preserve">Followers were recorded once per account, at collection.</w:t>
+      </w:r>
+      <w:r>
+        <w:t xml:space="preserve"> </w:t>
+      </w:r>
+      <w:r>
+        <w:t xml:space="preserve">They are not impressions, and the time between posting and collection is unknown. Month fixed</w:t>
+      </w:r>
+      <w:r>
+        <w:t xml:space="preserve"> </w:t>
+      </w:r>
+      <w:r>
+        <w:t xml:space="preserve">effects absorb average differences but not account-specific follower growth.</w:t>
+      </w:r>
+    </w:p>
+    <w:p>
+      <w:pPr>
+        <w:pStyle w:val="CSIRText"/>
+      </w:pPr>
+      <w:r>
+        <w:rPr>
+          <w:b/>
+          <w:bCs/>
+        </w:rPr>
+        <w:t xml:space="preserve">Observational design.</w:t>
+      </w:r>
+      <w:r>
+        <w:t xml:space="preserve"> </w:t>
+      </w:r>
+      <w:r>
+        <w:t xml:space="preserve">Mundlak within-account estimates remove stable account-level</w:t>
+      </w:r>
+      <w:r>
+        <w:t xml:space="preserve"> </w:t>
+      </w:r>
+      <w:r>
+        <w:t xml:space="preserve">confounding under the stated assumptions, but not time-varying confounding. For example, an</w:t>
+      </w:r>
+      <w:r>
+        <w:t xml:space="preserve"> </w:t>
+      </w:r>
+      <w:r>
+        <w:t xml:space="preserve">account may post its best-produced photographs alongside important announcements. All estimates</w:t>
+      </w:r>
+      <w:r>
+        <w:t xml:space="preserve"> </w:t>
+      </w:r>
+      <w:r>
+        <w:t xml:space="preserve">are associations, not effects of changing a photograph.</w:t>
+      </w:r>
+    </w:p>
+    <w:p>
+      <w:pPr>
+        <w:pStyle w:val="CSIRText"/>
+      </w:pPr>
+      <w:r>
+        <w:rPr>
+          <w:b/>
+          <w:bCs/>
+        </w:rPr>
+        <w:t xml:space="preserve">Sample and generalisability.</w:t>
+      </w:r>
+      <w:r>
+        <w:t xml:space="preserve"> </w:t>
+      </w:r>
+      <w:r>
+        <w:t xml:space="preserve">The sampling process behind the dataset is undocumented. The</w:t>
+      </w:r>
+      <w:r>
+        <w:t xml:space="preserve"> </w:t>
+      </w:r>
+      <w:r>
+        <w:t xml:space="preserve">data are English-language only and 70.7% from 2019, before the platform’s shift towards Reels and</w:t>
+      </w:r>
+      <w:r>
+        <w:t xml:space="preserve"> </w:t>
+      </w:r>
+      <w:r>
+        <w:t xml:space="preserve">short video, and videos were excluded. Instagram’s ranking and visual culture have changed</w:t>
+      </w:r>
+      <w:r>
+        <w:t xml:space="preserve"> </w:t>
+      </w:r>
+      <w:r>
+        <w:t xml:space="preserve">since. Replication is internal (split halves of one dataset), not an independent replication on</w:t>
+      </w:r>
+      <w:r>
+        <w:t xml:space="preserve"> </w:t>
+      </w:r>
+      <w:r>
+        <w:t xml:space="preserve">new data.</w:t>
+      </w:r>
+    </w:p>
+    <w:p>
+      <w:pPr>
+        <w:pStyle w:val="CSIRText"/>
+      </w:pPr>
+      <w:r>
+        <w:rPr>
+          <w:b/>
+          <w:bCs/>
+        </w:rPr>
+        <w:t xml:space="preserve">Calibration.</w:t>
+      </w:r>
+      <w:r>
+        <w:t xml:space="preserve"> </w:t>
+      </w:r>
+      <w:r>
+        <w:t xml:space="preserve">Predictive distributions are adequately but not perfectly calibrated, with</w:t>
+      </w:r>
+      <w:r>
+        <w:t xml:space="preserve"> </w:t>
+      </w:r>
+      <w:r>
+        <w:t xml:space="preserve">mild misfit in the tails (Figure 13). A model with a more flexible dispersion structure, such as</w:t>
+      </w:r>
+      <w:r>
+        <w:t xml:space="preserve"> </w:t>
+      </w:r>
+      <w:r>
+        <w:t xml:space="preserve">dispersion varying by genre, may improve this.</w:t>
+      </w:r>
+    </w:p>
+    <w:bookmarkEnd w:id="86"/>
+    <w:bookmarkEnd w:id="87"/>
+    <w:bookmarkStart w:id="88" w:name="conclusion"/>
+    <w:p>
+      <w:pPr>
+        <w:pStyle w:val="CSIRMainSection"/>
+      </w:pPr>
+      <w:r>
         <w:t xml:space="preserve">Conclusion</w:t>
       </w:r>
     </w:p>
@@ -5562,11 +9954,89 @@
         <w:pStyle w:val="CSIRText"/>
       </w:pPr>
       <w:r>
-        <w:t xml:space="preserve">[pending: model results]</w:t>
-      </w:r>
-    </w:p>
-    <w:bookmarkEnd w:id="56"/>
-    <w:bookmarkStart w:id="58" w:name="reproducibility-statement"/>
+        <w:t xml:space="preserve">In 583,830 Instagram photographs, two visual properties are robustly associated with more likes</w:t>
+      </w:r>
+      <w:r>
+        <w:t xml:space="preserve"> </w:t>
+      </w:r>
+      <w:r>
+        <w:t xml:space="preserve">per recorded follower: higher overall aesthetic quality (+5.7% per SD) and the presence of</w:t>
+      </w:r>
+      <w:r>
+        <w:t xml:space="preserve"> </w:t>
+      </w:r>
+      <w:r>
+        <w:t xml:space="preserve">a person (about +22%). Both pass Holm-corrected significance, a pre-registered ±3% practical</w:t>
+      </w:r>
+      <w:r>
+        <w:t xml:space="preserve"> </w:t>
+      </w:r>
+      <w:r>
+        <w:t xml:space="preserve">threshold, and split-half replication. The aesthetic association holds within accounts, not</w:t>
+      </w:r>
+      <w:r>
+        <w:t xml:space="preserve"> </w:t>
+      </w:r>
+      <w:r>
+        <w:t xml:space="preserve">only between them. Colour vividness, often recommended to creators, has a practically</w:t>
+      </w:r>
+      <w:r>
+        <w:t xml:space="preserve"> </w:t>
+      </w:r>
+      <w:r>
+        <w:t xml:space="preserve">negligible association, bounded by an equivalence test. Visual features add a small but reliable</w:t>
+      </w:r>
+      <w:r>
+        <w:t xml:space="preserve"> </w:t>
+      </w:r>
+      <w:r>
+        <w:t xml:space="preserve">improvement to predictions for unseen accounts. Methodologically, the study shows how</w:t>
+      </w:r>
+      <w:r>
+        <w:t xml:space="preserve"> </w:t>
+      </w:r>
+      <w:r>
+        <w:t xml:space="preserve">pre-registration, an explicit smallest effect size of interest, and equivalence testing turn</w:t>
+      </w:r>
+      <w:r>
+        <w:t xml:space="preserve"> </w:t>
+      </w:r>
+      <w:r>
+        <w:t xml:space="preserve">“significant at n = 583,830”</w:t>
+      </w:r>
+      <w:r>
+        <w:t xml:space="preserve"> </w:t>
+      </w:r>
+      <w:r>
+        <w:t xml:space="preserve">into claims that can be checked. It also shows that audience</w:t>
+      </w:r>
+      <w:r>
+        <w:t xml:space="preserve"> </w:t>
+      </w:r>
+      <w:r>
+        <w:t xml:space="preserve">normalisation by follower count should be tested: the estimated elasticity is 0.629, not 1.</w:t>
+      </w:r>
+      <w:r>
+        <w:t xml:space="preserve"> </w:t>
+      </w:r>
+      <w:r>
+        <w:t xml:space="preserve">Future work should validate the image features against human ratings, use exposure data</w:t>
+      </w:r>
+      <w:r>
+        <w:t xml:space="preserve"> </w:t>
+      </w:r>
+      <w:r>
+        <w:t xml:space="preserve">(impressions) where platforms provide them, and test whether the associations hold for short</w:t>
+      </w:r>
+      <w:r>
+        <w:t xml:space="preserve"> </w:t>
+      </w:r>
+      <w:r>
+        <w:t xml:space="preserve">video.</w:t>
+      </w:r>
+    </w:p>
+    <w:bookmarkEnd w:id="88"/>
+    <w:bookmarkStart w:id="90" w:name="reproducibility-statement"/>
     <w:p>
       <w:pPr>
         <w:pStyle w:val="CSIRMainSection"/>
@@ -5618,7 +10088,7 @@
       <w:r>
         <w:t xml:space="preserve"> </w:t>
       </w:r>
-      <w:hyperlink r:id="rId57">
+      <w:hyperlink r:id="rId89">
         <w:r>
           <w:rPr>
             <w:rStyle w:val="Hyperlink"/>
@@ -5713,8 +10183,8 @@
         <w:t xml:space="preserve">objects are not redistributed because they contain account identifiers.</w:t>
       </w:r>
     </w:p>
-    <w:bookmarkEnd w:id="58"/>
-    <w:bookmarkStart w:id="59" w:name="ethical-considerations"/>
+    <w:bookmarkEnd w:id="90"/>
+    <w:bookmarkStart w:id="91" w:name="ethical-considerations"/>
     <w:p>
       <w:pPr>
         <w:pStyle w:val="CSIRMainSection"/>
@@ -5781,8 +10251,8 @@
         <w:t xml:space="preserve">participants, uses only data that were already public, and reports only aggregate results.</w:t>
       </w:r>
     </w:p>
-    <w:bookmarkEnd w:id="59"/>
-    <w:bookmarkStart w:id="60" w:name="data-availability-statement"/>
+    <w:bookmarkEnd w:id="91"/>
+    <w:bookmarkStart w:id="92" w:name="data-availability-statement"/>
     <w:p>
       <w:pPr>
         <w:pStyle w:val="CSIRMainSection"/>
@@ -5813,7 +10283,7 @@
       <w:r>
         <w:t xml:space="preserve"> </w:t>
       </w:r>
-      <w:hyperlink r:id="rId57">
+      <w:hyperlink r:id="rId89">
         <w:r>
           <w:rPr>
             <w:rStyle w:val="Hyperlink"/>
@@ -5870,8 +10340,8 @@
         <w:t xml:space="preserve">.</w:t>
       </w:r>
     </w:p>
-    <w:bookmarkEnd w:id="60"/>
-    <w:bookmarkStart w:id="61" w:name="author-contributions-credit"/>
+    <w:bookmarkEnd w:id="92"/>
+    <w:bookmarkStart w:id="93" w:name="author-contributions-credit"/>
     <w:p>
       <w:pPr>
         <w:pStyle w:val="CSIRMainSection"/>
@@ -5894,8 +10364,8 @@
         <w:t xml:space="preserve">Validation, Visualization, Writing – original draft, Writing – review &amp; editing.</w:t>
       </w:r>
     </w:p>
-    <w:bookmarkEnd w:id="61"/>
-    <w:bookmarkStart w:id="62" w:name="conflict-of-interest"/>
+    <w:bookmarkEnd w:id="93"/>
+    <w:bookmarkStart w:id="94" w:name="conflict-of-interest"/>
     <w:p>
       <w:pPr>
         <w:pStyle w:val="CSIRMainSection"/>
@@ -5912,8 +10382,8 @@
         <w:t xml:space="preserve">The author declares no conflict of interest.</w:t>
       </w:r>
     </w:p>
-    <w:bookmarkEnd w:id="62"/>
-    <w:bookmarkStart w:id="63" w:name="funding"/>
+    <w:bookmarkEnd w:id="94"/>
+    <w:bookmarkStart w:id="95" w:name="funding"/>
     <w:p>
       <w:pPr>
         <w:pStyle w:val="CSIRMainSection"/>
@@ -5930,8 +10400,8 @@
         <w:t xml:space="preserve">This research received no specific grant from any funding agency in the public, commercial, or not-for-profit sectors.</w:t>
       </w:r>
     </w:p>
-    <w:bookmarkEnd w:id="63"/>
-    <w:bookmarkStart w:id="64" w:name="X071796dd6bc546c91e96cca1cf5ff96599de61f"/>
+    <w:bookmarkEnd w:id="95"/>
+    <w:bookmarkStart w:id="96" w:name="X071796dd6bc546c91e96cca1cf5ff96599de61f"/>
     <w:p>
       <w:pPr>
         <w:pStyle w:val="CSIRMainSection"/>
@@ -5966,8 +10436,8 @@
         <w:t xml:space="preserve">for the content of the published paper.</w:t>
       </w:r>
     </w:p>
-    <w:bookmarkEnd w:id="64"/>
-    <w:bookmarkStart w:id="92" w:name="references"/>
+    <w:bookmarkEnd w:id="96"/>
+    <w:bookmarkStart w:id="124" w:name="references"/>
     <w:p>
       <w:pPr>
         <w:pStyle w:val="CSIRMainSection"/>
@@ -5986,7 +10456,7 @@
       <w:r>
         <w:t xml:space="preserve"> </w:t>
       </w:r>
-      <w:hyperlink r:id="rId65">
+      <w:hyperlink r:id="rId97">
         <w:r>
           <w:rPr>
             <w:rStyle w:val="Hyperlink"/>
@@ -6005,7 +10475,7 @@
       <w:r>
         <w:t xml:space="preserve"> </w:t>
       </w:r>
-      <w:hyperlink r:id="rId66">
+      <w:hyperlink r:id="rId98">
         <w:r>
           <w:rPr>
             <w:rStyle w:val="Hyperlink"/>
@@ -6024,7 +10494,7 @@
       <w:r>
         <w:t xml:space="preserve"> </w:t>
       </w:r>
-      <w:hyperlink r:id="rId67">
+      <w:hyperlink r:id="rId99">
         <w:r>
           <w:rPr>
             <w:rStyle w:val="Hyperlink"/>
@@ -6043,7 +10513,7 @@
       <w:r>
         <w:t xml:space="preserve"> </w:t>
       </w:r>
-      <w:hyperlink r:id="rId68">
+      <w:hyperlink r:id="rId100">
         <w:r>
           <w:rPr>
             <w:rStyle w:val="Hyperlink"/>
@@ -6062,7 +10532,7 @@
       <w:r>
         <w:t xml:space="preserve"> </w:t>
       </w:r>
-      <w:hyperlink r:id="rId69">
+      <w:hyperlink r:id="rId101">
         <w:r>
           <w:rPr>
             <w:rStyle w:val="Hyperlink"/>
@@ -6081,7 +10551,7 @@
       <w:r>
         <w:t xml:space="preserve"> </w:t>
       </w:r>
-      <w:hyperlink r:id="rId70">
+      <w:hyperlink r:id="rId102">
         <w:r>
           <w:rPr>
             <w:rStyle w:val="Hyperlink"/>
@@ -6100,7 +10570,7 @@
       <w:r>
         <w:t xml:space="preserve"> </w:t>
       </w:r>
-      <w:hyperlink r:id="rId71">
+      <w:hyperlink r:id="rId103">
         <w:r>
           <w:rPr>
             <w:rStyle w:val="Hyperlink"/>
@@ -6119,7 +10589,7 @@
       <w:r>
         <w:t xml:space="preserve"> </w:t>
       </w:r>
-      <w:hyperlink r:id="rId72">
+      <w:hyperlink r:id="rId104">
         <w:r>
           <w:rPr>
             <w:rStyle w:val="Hyperlink"/>
@@ -6138,7 +10608,7 @@
       <w:r>
         <w:t xml:space="preserve"> </w:t>
       </w:r>
-      <w:hyperlink r:id="rId73">
+      <w:hyperlink r:id="rId105">
         <w:r>
           <w:rPr>
             <w:rStyle w:val="Hyperlink"/>
@@ -6157,7 +10627,7 @@
       <w:r>
         <w:t xml:space="preserve"> </w:t>
       </w:r>
-      <w:hyperlink r:id="rId74">
+      <w:hyperlink r:id="rId106">
         <w:r>
           <w:rPr>
             <w:rStyle w:val="Hyperlink"/>
@@ -6176,7 +10646,7 @@
       <w:r>
         <w:t xml:space="preserve"> </w:t>
       </w:r>
-      <w:hyperlink r:id="rId75">
+      <w:hyperlink r:id="rId107">
         <w:r>
           <w:rPr>
             <w:rStyle w:val="Hyperlink"/>
@@ -6195,7 +10665,7 @@
       <w:r>
         <w:t xml:space="preserve"> </w:t>
       </w:r>
-      <w:hyperlink r:id="rId76">
+      <w:hyperlink r:id="rId108">
         <w:r>
           <w:rPr>
             <w:rStyle w:val="Hyperlink"/>
@@ -6222,7 +10692,7 @@
       <w:r>
         <w:t xml:space="preserve"> </w:t>
       </w:r>
-      <w:hyperlink r:id="rId77">
+      <w:hyperlink r:id="rId109">
         <w:r>
           <w:rPr>
             <w:rStyle w:val="Hyperlink"/>
@@ -6241,7 +10711,7 @@
       <w:r>
         <w:t xml:space="preserve"> </w:t>
       </w:r>
-      <w:hyperlink r:id="rId78">
+      <w:hyperlink r:id="rId110">
         <w:r>
           <w:rPr>
             <w:rStyle w:val="Hyperlink"/>
@@ -6260,7 +10730,7 @@
       <w:r>
         <w:t xml:space="preserve"> </w:t>
       </w:r>
-      <w:hyperlink r:id="rId79">
+      <w:hyperlink r:id="rId111">
         <w:r>
           <w:rPr>
             <w:rStyle w:val="Hyperlink"/>
@@ -6279,7 +10749,7 @@
       <w:r>
         <w:t xml:space="preserve"> </w:t>
       </w:r>
-      <w:hyperlink r:id="rId80">
+      <w:hyperlink r:id="rId112">
         <w:r>
           <w:rPr>
             <w:rStyle w:val="Hyperlink"/>
@@ -6298,7 +10768,7 @@
       <w:r>
         <w:t xml:space="preserve"> </w:t>
       </w:r>
-      <w:hyperlink r:id="rId81">
+      <w:hyperlink r:id="rId113">
         <w:r>
           <w:rPr>
             <w:rStyle w:val="Hyperlink"/>
@@ -6317,7 +10787,7 @@
       <w:r>
         <w:t xml:space="preserve"> </w:t>
       </w:r>
-      <w:hyperlink r:id="rId82">
+      <w:hyperlink r:id="rId114">
         <w:r>
           <w:rPr>
             <w:rStyle w:val="Hyperlink"/>
@@ -6336,7 +10806,7 @@
       <w:r>
         <w:t xml:space="preserve"> </w:t>
       </w:r>
-      <w:hyperlink r:id="rId83">
+      <w:hyperlink r:id="rId115">
         <w:r>
           <w:rPr>
             <w:rStyle w:val="Hyperlink"/>
@@ -6355,7 +10825,7 @@
       <w:r>
         <w:t xml:space="preserve"> </w:t>
       </w:r>
-      <w:hyperlink r:id="rId84">
+      <w:hyperlink r:id="rId116">
         <w:r>
           <w:rPr>
             <w:rStyle w:val="Hyperlink"/>
@@ -6374,7 +10844,7 @@
       <w:r>
         <w:t xml:space="preserve"> </w:t>
       </w:r>
-      <w:hyperlink r:id="rId85">
+      <w:hyperlink r:id="rId117">
         <w:r>
           <w:rPr>
             <w:rStyle w:val="Hyperlink"/>
@@ -6393,7 +10863,7 @@
       <w:r>
         <w:t xml:space="preserve"> </w:t>
       </w:r>
-      <w:hyperlink r:id="rId86">
+      <w:hyperlink r:id="rId118">
         <w:r>
           <w:rPr>
             <w:rStyle w:val="Hyperlink"/>
@@ -6418,7 +10888,7 @@
       <w:r>
         <w:t xml:space="preserve"> </w:t>
       </w:r>
-      <w:hyperlink r:id="rId87">
+      <w:hyperlink r:id="rId119">
         <w:r>
           <w:rPr>
             <w:rStyle w:val="Hyperlink"/>
@@ -6437,7 +10907,7 @@
       <w:r>
         <w:t xml:space="preserve"> </w:t>
       </w:r>
-      <w:hyperlink r:id="rId88">
+      <w:hyperlink r:id="rId120">
         <w:r>
           <w:rPr>
             <w:rStyle w:val="Hyperlink"/>
@@ -6456,7 +10926,7 @@
       <w:r>
         <w:t xml:space="preserve"> </w:t>
       </w:r>
-      <w:hyperlink r:id="rId89">
+      <w:hyperlink r:id="rId121">
         <w:r>
           <w:rPr>
             <w:rStyle w:val="Hyperlink"/>
@@ -6475,7 +10945,7 @@
       <w:r>
         <w:t xml:space="preserve"> </w:t>
       </w:r>
-      <w:hyperlink r:id="rId90">
+      <w:hyperlink r:id="rId122">
         <w:r>
           <w:rPr>
             <w:rStyle w:val="Hyperlink"/>
@@ -6494,7 +10964,7 @@
       <w:r>
         <w:t xml:space="preserve"> </w:t>
       </w:r>
-      <w:hyperlink r:id="rId91">
+      <w:hyperlink r:id="rId123">
         <w:r>
           <w:rPr>
             <w:rStyle w:val="Hyperlink"/>
@@ -6503,7 +10973,7 @@
         </w:r>
       </w:hyperlink>
     </w:p>
-    <w:bookmarkEnd w:id="92"/>
+    <w:bookmarkEnd w:id="124"/>
     <w:sectPr>
       <w:type w:val="continuous"/>
       <w:pgSz w:w="11907" w:h="16839" w:code="9"/>

</xml_diff>